<commit_message>
Tony's edits to Paragraph_to_paste.docx
Co-Authored-By: Claude Fable 5.1 <noreply@anthropic.com>
</commit_message>
<xml_diff>
--- a/temp_aging/Paragraph_to_paste.docx
+++ b/temp_aging/Paragraph_to_paste.docx
@@ -1,6 +1,6 @@
 
 <file path=word/document.xml><?xml version="1.0" encoding="utf-8"?>
-<w:document xmlns:w="http://schemas.openxmlformats.org/wordprocessingml/2006/main" xmlns:m="http://schemas.openxmlformats.org/officeDocument/2006/math" xmlns:r="http://schemas.openxmlformats.org/officeDocument/2006/relationships" xmlns:o="urn:schemas-microsoft-com:office:office" xmlns:v="urn:schemas-microsoft-com:vml" xmlns:w10="urn:schemas-microsoft-com:office:word" xmlns:a="http://schemas.openxmlformats.org/drawingml/2006/main" xmlns:pic="http://schemas.openxmlformats.org/drawingml/2006/picture" xmlns:wp="http://schemas.openxmlformats.org/drawingml/2006/wordprocessingDrawing">
+<w:document xmlns:wpc="http://schemas.microsoft.com/office/word/2010/wordprocessingCanvas" xmlns:cx="http://schemas.microsoft.com/office/drawing/2014/chartex" xmlns:cx1="http://schemas.microsoft.com/office/drawing/2015/9/8/chartex" xmlns:cx2="http://schemas.microsoft.com/office/drawing/2015/10/21/chartex" xmlns:cx3="http://schemas.microsoft.com/office/drawing/2016/5/9/chartex" xmlns:cx4="http://schemas.microsoft.com/office/drawing/2016/5/10/chartex" xmlns:cx5="http://schemas.microsoft.com/office/drawing/2016/5/11/chartex" xmlns:cx6="http://schemas.microsoft.com/office/drawing/2016/5/12/chartex" xmlns:cx7="http://schemas.microsoft.com/office/drawing/2016/5/13/chartex" xmlns:cx8="http://schemas.microsoft.com/office/drawing/2016/5/14/chartex" xmlns:mc="http://schemas.openxmlformats.org/markup-compatibility/2006" xmlns:m="http://schemas.openxmlformats.org/officeDocument/2006/math" xmlns:aink="http://schemas.microsoft.com/office/drawing/2016/ink" xmlns:am3d="http://schemas.microsoft.com/office/drawing/2017/model3d" xmlns:oel="http://schemas.microsoft.com/office/2019/extlst" xmlns:r="http://schemas.openxmlformats.org/officeDocument/2006/relationships" xmlns:wp14="http://schemas.microsoft.com/office/word/2010/wordprocessingDrawing" xmlns:wp="http://schemas.openxmlformats.org/drawingml/2006/wordprocessingDrawing" xmlns:wpg="http://schemas.microsoft.com/office/word/2010/wordprocessingGroup" xmlns:wpi="http://schemas.microsoft.com/office/word/2010/wordprocessingInk" xmlns:wps="http://schemas.microsoft.com/office/word/2010/wordprocessingShape" xmlns:o="urn:schemas-microsoft-com:office:office" xmlns:v="urn:schemas-microsoft-com:vml" xmlns:w10="urn:schemas-microsoft-com:office:word" xmlns:w="http://schemas.openxmlformats.org/wordprocessingml/2006/main" xmlns:w14="http://schemas.microsoft.com/office/word/2010/wordml" xmlns:w15="http://schemas.microsoft.com/office/word/2012/wordml" xmlns:w16cex="http://schemas.microsoft.com/office/word/2018/wordml/cex" xmlns:w16cid="http://schemas.microsoft.com/office/word/2016/wordml/cid" xmlns:w16="http://schemas.microsoft.com/office/word/2018/wordml" xmlns:w16sdtdh="http://schemas.microsoft.com/office/word/2020/wordml/sdtdatahash" xmlns:w16sdtfl="http://schemas.microsoft.com/office/word/2024/wordml/sdtformatlock" xmlns:w16se="http://schemas.microsoft.com/office/word/2015/wordml/symex" xmlns:w16du="http://schemas.microsoft.com/office/word/2023/wordml/word16du" xmlns:wne="http://schemas.microsoft.com/office/word/2006/wordml" mc:Ignorable="w14 w15 w16se w16cid w16 w16cex w16sdtdh w16sdtfl w16du wp14">
   <w:body>
     <w:p>
       <w:pPr>
@@ -11,28 +11,7 @@
           <w:i/>
           <w:iCs/>
         </w:rPr>
-        <w:t xml:space="preserve">[Results — paste after the paragraph beginning</w:t>
-      </w:r>
-      <w:r>
-        <w:rPr>
-          <w:i/>
-          <w:iCs/>
-        </w:rPr>
-        <w:t xml:space="preserve"> </w:t>
-      </w:r>
-      <w:r>
-        <w:rPr>
-          <w:i/>
-          <w:iCs/>
-        </w:rPr>
-        <w:t xml:space="preserve">“A large-effect locus sits on top of the polygenic background”</w:t>
-      </w:r>
-      <w:r>
-        <w:rPr>
-          <w:i/>
-          <w:iCs/>
-        </w:rPr>
-        <w:t xml:space="preserve">]</w:t>
+        <w:t>[Results — paste after the paragraph beginning “A large-effect locus sits on top of the polygenic background”]</w:t>
       </w:r>
     </w:p>
     <w:p>
@@ -40,36 +19,74 @@
         <w:pStyle w:val="BodyText"/>
       </w:pPr>
       <w:r>
-        <w:t xml:space="preserve">We can predict heritable variation in longevity in held-out replicates. Holding out each of the ten replicates in turn, founder-frequency changes at the</w:t>
-      </w:r>
-      <w:r>
-        <w:t xml:space="preserve"> </w:t>
+        <w:t xml:space="preserve">We can predict heritable variation in longevity in held-out replicates. Holding out each of the ten replicates in turn, founder-frequency changes at the </w:t>
       </w:r>
       <w:r>
         <w:rPr>
           <w:i/>
           <w:iCs/>
         </w:rPr>
-        <w:t xml:space="preserve">N</w:t>
-      </w:r>
-      <w:r>
-        <w:t xml:space="preserve"> </w:t>
-      </w:r>
-      <w:r>
-        <w:t xml:space="preserve">best markers in the other nine were used to predict the held-out replicate. For the ten best markers the prediction has</w:t>
-      </w:r>
-      <w:r>
-        <w:t xml:space="preserve"> </w:t>
+        <w:t>N</w:t>
+      </w:r>
+      <w:r>
+        <w:t xml:space="preserve"> best markers in the other nine were used to predict the held-out replicate. For the ten best markers the predict</w:t>
+      </w:r>
+      <w:r>
+        <w:t>ed haplotype frequency difference</w:t>
+      </w:r>
+      <w:r>
+        <w:t xml:space="preserve"> has </w:t>
       </w:r>
       <w:r>
         <w:rPr>
           <w:i/>
           <w:iCs/>
         </w:rPr>
-        <w:t xml:space="preserve">R</w:t>
-      </w:r>
-      <w:r>
-        <w:t xml:space="preserve">² = 0.60–0.69 across treatments (Fig. Ya). Marker-based heritability for the whole genome is 11–17% across treatments (Methods), of which tiles that never reach an LWP of 7.5 carry 40–47%. A predictor built on the ten best markers explains 6.4–9.5% of phenotypic variance and one built on thirty explains 8.2–11.6% (Fig. Yb), or 66–72% of the marker-based heritability. That is, thirty haplotype blocks chosen in nine experiments account for most of the heritability detectable in a tenth. Despite variation in longevity being polygenic and spread throughout the genome, a few dozen segments explain a large proportion of heritable variation.</w:t>
+        <w:t>R</w:t>
+      </w:r>
+      <w:r>
+        <w:t xml:space="preserve">² = 0.60–0.69 across treatments (Fig. Ya). </w:t>
+      </w:r>
+      <w:r>
+        <w:t>We estimated m</w:t>
+      </w:r>
+      <w:r>
+        <w:t xml:space="preserve">arker-based heritability for the whole genome </w:t>
+      </w:r>
+      <w:r>
+        <w:t>form all 10 replicates a</w:t>
+      </w:r>
+      <w:r>
+        <w:t>s 11–17% across treatments (Methods), of which tiles that never reach an LWP of 7.5 carry 40–47%. A predictor built on the ten best markers explains 6.4–9.5% of phenotypic variance and one built on thirty explains 8.2–11.6% (Fig. Yb)</w:t>
+      </w:r>
+      <w:r>
+        <w:t xml:space="preserve">. By implicate the </w:t>
+      </w:r>
+      <w:proofErr w:type="gramStart"/>
+      <w:r>
+        <w:t>30 marker</w:t>
+      </w:r>
+      <w:proofErr w:type="gramEnd"/>
+      <w:r>
+        <w:t xml:space="preserve"> estimator explains</w:t>
+      </w:r>
+      <w:r>
+        <w:t xml:space="preserve"> 66–72% of the marker-based heritability. </w:t>
+      </w:r>
+      <w:r>
+        <w:t>Despite variation in longevity being polygenic and spread throughout the genome</w:t>
+      </w:r>
+      <w:r>
+        <w:t xml:space="preserve">, markers at thirty strategic locations </w:t>
+      </w:r>
+      <w:r>
+        <w:t>account for most of the</w:t>
+      </w:r>
+      <w:r>
+        <w:t xml:space="preserve"> heritable variation in longevity</w:t>
+      </w:r>
+      <w:r>
+        <w:t>.</w:t>
       </w:r>
     </w:p>
     <w:p>
@@ -81,28 +98,7 @@
           <w:i/>
           <w:iCs/>
         </w:rPr>
-        <w:t xml:space="preserve">[Methods — paste after the Heritability section, before</w:t>
-      </w:r>
-      <w:r>
-        <w:rPr>
-          <w:i/>
-          <w:iCs/>
-        </w:rPr>
-        <w:t xml:space="preserve"> </w:t>
-      </w:r>
-      <w:r>
-        <w:rPr>
-          <w:i/>
-          <w:iCs/>
-        </w:rPr>
-        <w:t xml:space="preserve">“The relationship between the Wald test and h²”</w:t>
-      </w:r>
-      <w:r>
-        <w:rPr>
-          <w:i/>
-          <w:iCs/>
-        </w:rPr>
-        <w:t xml:space="preserve">]</w:t>
+        <w:t>[Methods — paste after the Heritability section, before “The relationship between the Wald test and h²”]</w:t>
       </w:r>
     </w:p>
     <w:p>
@@ -114,26 +110,34 @@
           <w:b/>
           <w:bCs/>
         </w:rPr>
-        <w:t xml:space="preserve">Marker-based heritability.</w:t>
-      </w:r>
-      <w:r>
-        <w:t xml:space="preserve"> </w:t>
-      </w:r>
-      <w:r>
-        <w:t xml:space="preserve">The heritability of each trait that founder haplotypes capture genome-wide is the sum of</w:t>
-      </w:r>
-      <w:r>
-        <w:t xml:space="preserve"> </w:t>
+        <w:t>Marker-based heritability.</w:t>
+      </w:r>
+      <w:r>
+        <w:t xml:space="preserve"> The heritability of each trait that founder haplotypes capture genome-wide is the sum of </w:t>
       </w:r>
       <m:oMath>
         <m:sSup>
+          <m:sSupPr>
+            <m:ctrlPr>
+              <w:rPr>
+                <w:rFonts w:ascii="Cambria Math" w:hAnsi="Cambria Math"/>
+              </w:rPr>
+            </m:ctrlPr>
+          </m:sSupPr>
           <m:e>
             <m:acc>
               <m:accPr>
-                <m:chr m:val="̂"/>
+                <m:ctrlPr>
+                  <w:rPr>
+                    <w:rFonts w:ascii="Cambria Math" w:hAnsi="Cambria Math"/>
+                  </w:rPr>
+                </m:ctrlPr>
               </m:accPr>
               <m:e>
                 <m:r>
+                  <w:rPr>
+                    <w:rFonts w:ascii="Cambria Math" w:hAnsi="Cambria Math"/>
+                  </w:rPr>
                   <m:t>h</m:t>
                 </m:r>
               </m:e>
@@ -141,29 +145,40 @@
           </m:e>
           <m:sup>
             <m:r>
+              <w:rPr>
+                <w:rFonts w:ascii="Cambria Math" w:hAnsi="Cambria Math"/>
+              </w:rPr>
               <m:t>2</m:t>
             </m:r>
           </m:sup>
         </m:sSup>
       </m:oMath>
       <w:r>
-        <w:t xml:space="preserve"> </w:t>
-      </w:r>
-      <w:r>
-        <w:t xml:space="preserve">over the 268 1 cM tiles, corrected by a multiplicative constant to account for adjacent tiles being correlated. We estimate the constant from the peaks of Table S1. For each peak, in the treatment where it is strongest, we plotted</w:t>
-      </w:r>
-      <w:r>
-        <w:t xml:space="preserve"> </w:t>
+        <w:t xml:space="preserve"> over the 268 1 cM tiles, corrected by a multiplicative constant to account for adjacent tiles being correlated. We estimate the constant from the peaks of Table S1. For each peak, in the treatment where it is strongest, we plotted </w:t>
       </w:r>
       <m:oMath>
         <m:sSup>
+          <m:sSupPr>
+            <m:ctrlPr>
+              <w:rPr>
+                <w:rFonts w:ascii="Cambria Math" w:hAnsi="Cambria Math"/>
+              </w:rPr>
+            </m:ctrlPr>
+          </m:sSupPr>
           <m:e>
             <m:acc>
               <m:accPr>
-                <m:chr m:val="̂"/>
+                <m:ctrlPr>
+                  <w:rPr>
+                    <w:rFonts w:ascii="Cambria Math" w:hAnsi="Cambria Math"/>
+                  </w:rPr>
+                </m:ctrlPr>
               </m:accPr>
               <m:e>
                 <m:r>
+                  <w:rPr>
+                    <w:rFonts w:ascii="Cambria Math" w:hAnsi="Cambria Math"/>
+                  </w:rPr>
                   <m:t>h</m:t>
                 </m:r>
               </m:e>
@@ -171,29 +186,40 @@
           </m:e>
           <m:sup>
             <m:r>
+              <w:rPr>
+                <w:rFonts w:ascii="Cambria Math" w:hAnsi="Cambria Math"/>
+              </w:rPr>
               <m:t>2</m:t>
             </m:r>
           </m:sup>
         </m:sSup>
       </m:oMath>
       <w:r>
-        <w:t xml:space="preserve"> </w:t>
-      </w:r>
-      <w:r>
-        <w:t xml:space="preserve">against distance from the peak, out to 6 cM on whichever side has no other peak, subtracted the floor of</w:t>
-      </w:r>
-      <w:r>
-        <w:t xml:space="preserve"> </w:t>
+        <w:t xml:space="preserve"> against distance from the peak, out to 6 cM on whichever side has no other peak, subtracted the floor of </w:t>
       </w:r>
       <m:oMath>
         <m:sSup>
+          <m:sSupPr>
+            <m:ctrlPr>
+              <w:rPr>
+                <w:rFonts w:ascii="Cambria Math" w:hAnsi="Cambria Math"/>
+              </w:rPr>
+            </m:ctrlPr>
+          </m:sSupPr>
           <m:e>
             <m:acc>
               <m:accPr>
-                <m:chr m:val="̂"/>
+                <m:ctrlPr>
+                  <w:rPr>
+                    <w:rFonts w:ascii="Cambria Math" w:hAnsi="Cambria Math"/>
+                  </w:rPr>
+                </m:ctrlPr>
               </m:accPr>
               <m:e>
                 <m:r>
+                  <w:rPr>
+                    <w:rFonts w:ascii="Cambria Math" w:hAnsi="Cambria Math"/>
+                  </w:rPr>
                   <m:t>h</m:t>
                 </m:r>
               </m:e>
@@ -201,16 +227,16 @@
           </m:e>
           <m:sup>
             <m:r>
+              <w:rPr>
+                <w:rFonts w:ascii="Cambria Math" w:hAnsi="Cambria Math"/>
+              </w:rPr>
               <m:t>2</m:t>
             </m:r>
           </m:sup>
         </m:sSup>
       </m:oMath>
       <w:r>
-        <w:t xml:space="preserve"> </w:t>
-      </w:r>
-      <w:r>
-        <w:t xml:space="preserve">at non-significant tiles, and divided the area under the curve by the height of the peak. Over the seventeen peaks that can be measured the signal spans from 1.0 to 8.3 tiles with a mean correction of 3.8 and quartiles of 2.6 and 4.1. Marker-based heritability is therefore</w:t>
+        <w:t xml:space="preserve"> at non-significant tiles, and divided the area under the curve by the height of the peak. Over the seventeen peaks that can be measured the signal spans from 1.0 to 8.3 tiles with a mean correction of 3.8 and quartiles of 2.6 and 4.1. Marker-based heritability is therefore</w:t>
       </w:r>
     </w:p>
     <w:p>
@@ -224,15 +250,25 @@
         <m:oMath>
           <m:f>
             <m:fPr>
-              <m:type m:val="bar"/>
+              <m:ctrlPr>
+                <w:rPr>
+                  <w:rFonts w:ascii="Cambria Math" w:hAnsi="Cambria Math"/>
+                </w:rPr>
+              </m:ctrlPr>
             </m:fPr>
             <m:num>
               <m:r>
+                <w:rPr>
+                  <w:rFonts w:ascii="Cambria Math" w:hAnsi="Cambria Math"/>
+                </w:rPr>
                 <m:t>1</m:t>
               </m:r>
             </m:num>
             <m:den>
               <m:r>
+                <w:rPr>
+                  <w:rFonts w:ascii="Cambria Math" w:hAnsi="Cambria Math"/>
+                </w:rPr>
                 <m:t>3.8</m:t>
               </m:r>
             </m:den>
@@ -241,55 +277,55 @@
             <m:naryPr>
               <m:chr m:val="∑"/>
               <m:limLoc m:val="undOvr"/>
-              <m:subHide m:val="off"/>
-              <m:supHide m:val="on"/>
+              <m:supHide m:val="1"/>
+              <m:ctrlPr>
+                <w:rPr>
+                  <w:rFonts w:ascii="Cambria Math" w:hAnsi="Cambria Math"/>
+                </w:rPr>
+              </m:ctrlPr>
             </m:naryPr>
             <m:sub>
               <m:r>
                 <m:rPr>
                   <m:sty m:val="p"/>
                 </m:rPr>
-                <m:t>t</m:t>
-              </m:r>
-              <m:r>
-                <m:rPr>
-                  <m:sty m:val="p"/>
-                </m:rPr>
-                <m:t>i</m:t>
-              </m:r>
-              <m:r>
-                <m:rPr>
-                  <m:sty m:val="p"/>
-                </m:rPr>
-                <m:t>l</m:t>
-              </m:r>
-              <m:r>
-                <m:rPr>
-                  <m:sty m:val="p"/>
-                </m:rPr>
-                <m:t>e</m:t>
-              </m:r>
-              <m:r>
-                <m:rPr>
-                  <m:sty m:val="p"/>
-                </m:rPr>
-                <m:t>s</m:t>
+                <w:rPr>
+                  <w:rFonts w:ascii="Cambria Math" w:hAnsi="Cambria Math"/>
+                </w:rPr>
+                <m:t>tiles</m:t>
               </m:r>
             </m:sub>
             <m:sup>
               <m:r>
+                <w:rPr>
+                  <w:rFonts w:ascii="Cambria Math" w:hAnsi="Cambria Math"/>
+                </w:rPr>
                 <m:t>​</m:t>
               </m:r>
             </m:sup>
             <m:e>
               <m:sSup>
+                <m:sSupPr>
+                  <m:ctrlPr>
+                    <w:rPr>
+                      <w:rFonts w:ascii="Cambria Math" w:hAnsi="Cambria Math"/>
+                    </w:rPr>
+                  </m:ctrlPr>
+                </m:sSupPr>
                 <m:e>
                   <m:acc>
                     <m:accPr>
-                      <m:chr m:val="̂"/>
+                      <m:ctrlPr>
+                        <w:rPr>
+                          <w:rFonts w:ascii="Cambria Math" w:hAnsi="Cambria Math"/>
+                        </w:rPr>
+                      </m:ctrlPr>
                     </m:accPr>
                     <m:e>
                       <m:r>
+                        <w:rPr>
+                          <w:rFonts w:ascii="Cambria Math" w:hAnsi="Cambria Math"/>
+                        </w:rPr>
                         <m:t>h</m:t>
                       </m:r>
                     </m:e>
@@ -297,6 +333,9 @@
                 </m:e>
                 <m:sup>
                   <m:r>
+                    <w:rPr>
+                      <w:rFonts w:ascii="Cambria Math" w:hAnsi="Cambria Math"/>
+                    </w:rPr>
                     <m:t>2</m:t>
                   </m:r>
                 </m:sup>
@@ -307,6 +346,9 @@
             <m:rPr>
               <m:sty m:val="p"/>
             </m:rPr>
+            <w:rPr>
+              <w:rFonts w:ascii="Cambria Math" w:hAnsi="Cambria Math"/>
+            </w:rPr>
             <m:t>.</m:t>
           </m:r>
         </m:oMath>
@@ -317,7 +359,18 @@
         <w:pStyle w:val="FirstParagraph"/>
       </w:pPr>
       <w:r>
-        <w:t xml:space="preserve">Resulting point estimates of marker-based heritability are 11.4, 17.1, 13.4 and 16.4% for SY10 females, SY10 males, SY20 females and SY20 males respectively. Dividing by the quartiles instead of 3.8 gives 10.6–16.7, 15.9–25.2, 12.5–19.7 and 15.3–24.2%. The jackknife standard error over replicates is 0.7–1.2, so the correction, not sampling, sets the uncertainty.</w:t>
+        <w:t xml:space="preserve">Resulting point estimates of marker-based heritability are 11.4, 17.1, 13.4 and 16.4% for SY10 females, SY10 males, SY20 females and SY20 males respectively. Dividing by the quartiles instead of 3.8 gives 10.6–16.7, 15.9–25.2, 12.5–19.7 and 15.3–24.2%. </w:t>
+      </w:r>
+    </w:p>
+    <w:p>
+      <w:pPr>
+        <w:pStyle w:val="FirstParagraph"/>
+      </w:pPr>
+      <w:r>
+        <w:t>The jackknife standard error over replicates is 0.7–1.2, so the correction, not sampling, sets the uncertainty.</w:t>
+      </w:r>
+      <w:r>
+        <w:t xml:space="preserve">  – no fucking idea what this is about if anything, like pick a fucking side.</w:t>
       </w:r>
     </w:p>
     <w:p>
@@ -329,28 +382,7 @@
           <w:i/>
           <w:iCs/>
         </w:rPr>
-        <w:t xml:space="preserve">[Methods — paste after the paragraph beginning</w:t>
-      </w:r>
-      <w:r>
-        <w:rPr>
-          <w:i/>
-          <w:iCs/>
-        </w:rPr>
-        <w:t xml:space="preserve"> </w:t>
-      </w:r>
-      <w:r>
-        <w:rPr>
-          <w:i/>
-          <w:iCs/>
-        </w:rPr>
-        <w:t xml:space="preserve">“The partitioning is carried out at every step”</w:t>
-      </w:r>
-      <w:r>
-        <w:rPr>
-          <w:i/>
-          <w:iCs/>
-        </w:rPr>
-        <w:t xml:space="preserve">]</w:t>
+        <w:t>[Methods — paste after the paragraph beginning “The partitioning is carried out at every step”]</w:t>
       </w:r>
     </w:p>
     <w:p>
@@ -362,30 +394,38 @@
           <w:b/>
           <w:bCs/>
         </w:rPr>
-        <w:t xml:space="preserve">Out-of-sample prediction.</w:t>
-      </w:r>
-      <w:r>
-        <w:t xml:space="preserve"> </w:t>
-      </w:r>
-      <w:r>
-        <w:t xml:space="preserve">We asked if changes in founder haplotype frequencies at leading factors can predict an unseen experiment in a manner analogous to polygenic risk scores. Each of the ten independent replicates was held out in turn and the other nine were used to build the predictor; we write ⓡ for the held-out replicate. From the other nine we estimated founder frequency changes per unit of selection,</w:t>
-      </w:r>
-      <w:r>
-        <w:t xml:space="preserve"> </w:t>
+        <w:t>Out-of-sample prediction.</w:t>
+      </w:r>
+      <w:r>
+        <w:t xml:space="preserve"> We asked if changes in founder haplotype frequencies at leading factors can predict an unseen experiment in a manner analogous to polygenic risk scores. Each of the ten independent replicates was held out in turn and the other nine were used to build the predictor; we write ⓡ for the held-out replicate. From the other nine we </w:t>
+      </w:r>
+      <w:r>
+        <w:lastRenderedPageBreak/>
+        <w:t xml:space="preserve">estimated founder frequency changes per unit of selection, </w:t>
       </w:r>
       <m:oMath>
         <m:sSub>
+          <m:sSubPr>
+            <m:ctrlPr>
+              <w:rPr>
+                <w:rFonts w:ascii="Cambria Math" w:hAnsi="Cambria Math"/>
+              </w:rPr>
+            </m:ctrlPr>
+          </m:sSubPr>
           <m:e>
             <m:r>
+              <w:rPr>
+                <w:rFonts w:ascii="Cambria Math" w:hAnsi="Cambria Math"/>
+              </w:rPr>
               <m:t>e</m:t>
             </m:r>
           </m:e>
           <m:sub>
             <m:r>
-              <m:t>f</m:t>
-            </m:r>
-            <m:r>
-              <m:t>r</m:t>
+              <w:rPr>
+                <w:rFonts w:ascii="Cambria Math" w:hAnsi="Cambria Math"/>
+              </w:rPr>
+              <m:t>fr</m:t>
             </m:r>
           </m:sub>
         </m:sSub>
@@ -393,26 +433,33 @@
           <m:rPr>
             <m:sty m:val="p"/>
           </m:rPr>
-          <m:t>=</m:t>
-        </m:r>
-        <m:r>
-          <m:rPr>
-            <m:sty m:val="p"/>
-          </m:rPr>
-          <m:t>Δ</m:t>
+          <w:rPr>
+            <w:rFonts w:ascii="Cambria Math" w:hAnsi="Cambria Math"/>
+          </w:rPr>
+          <m:t>=Δ</m:t>
         </m:r>
         <m:sSub>
+          <m:sSubPr>
+            <m:ctrlPr>
+              <w:rPr>
+                <w:rFonts w:ascii="Cambria Math" w:hAnsi="Cambria Math"/>
+              </w:rPr>
+            </m:ctrlPr>
+          </m:sSubPr>
           <m:e>
             <m:r>
+              <w:rPr>
+                <w:rFonts w:ascii="Cambria Math" w:hAnsi="Cambria Math"/>
+              </w:rPr>
               <m:t>p</m:t>
             </m:r>
           </m:e>
           <m:sub>
             <m:r>
-              <m:t>f</m:t>
-            </m:r>
-            <m:r>
-              <m:t>r</m:t>
+              <w:rPr>
+                <w:rFonts w:ascii="Cambria Math" w:hAnsi="Cambria Math"/>
+              </w:rPr>
+              <m:t>fr</m:t>
             </m:r>
           </m:sub>
         </m:sSub>
@@ -420,39 +467,64 @@
           <m:rPr>
             <m:sty m:val="p"/>
           </m:rPr>
+          <w:rPr>
+            <w:rFonts w:ascii="Cambria Math" w:hAnsi="Cambria Math"/>
+          </w:rPr>
           <m:t>/</m:t>
         </m:r>
         <m:sSub>
+          <m:sSubPr>
+            <m:ctrlPr>
+              <w:rPr>
+                <w:rFonts w:ascii="Cambria Math" w:hAnsi="Cambria Math"/>
+              </w:rPr>
+            </m:ctrlPr>
+          </m:sSubPr>
           <m:e>
             <m:r>
+              <w:rPr>
+                <w:rFonts w:ascii="Cambria Math" w:hAnsi="Cambria Math"/>
+              </w:rPr>
               <m:t>i</m:t>
             </m:r>
           </m:e>
           <m:sub>
             <m:r>
+              <w:rPr>
+                <w:rFonts w:ascii="Cambria Math" w:hAnsi="Cambria Math"/>
+              </w:rPr>
               <m:t>r</m:t>
             </m:r>
           </m:sub>
         </m:sSub>
       </m:oMath>
       <w:r>
-        <w:t xml:space="preserve"> </w:t>
-      </w:r>
-      <w:r>
-        <w:t xml:space="preserve">as in the heritability estimate above, and their mean</w:t>
-      </w:r>
-      <w:r>
-        <w:t xml:space="preserve"> </w:t>
+        <w:t xml:space="preserve"> as in the heritability estimate above, and their mean </w:t>
       </w:r>
       <m:oMath>
         <m:sSub>
+          <m:sSubPr>
+            <m:ctrlPr>
+              <w:rPr>
+                <w:rFonts w:ascii="Cambria Math" w:hAnsi="Cambria Math"/>
+              </w:rPr>
+            </m:ctrlPr>
+          </m:sSubPr>
           <m:e>
             <m:bar>
               <m:barPr>
                 <m:pos m:val="top"/>
+                <m:ctrlPr>
+                  <w:rPr>
+                    <w:rFonts w:ascii="Cambria Math" w:hAnsi="Cambria Math"/>
+                  </w:rPr>
+                </m:ctrlPr>
               </m:barPr>
               <m:e>
                 <m:r>
+                  <w:rPr>
+                    <w:rFonts w:ascii="Cambria Math" w:hAnsi="Cambria Math"/>
+                  </w:rPr>
                   <m:t>e</m:t>
                 </m:r>
               </m:e>
@@ -460,27 +532,27 @@
           </m:e>
           <m:sub>
             <m:r>
+              <w:rPr>
+                <w:rFonts w:ascii="Cambria Math" w:hAnsi="Cambria Math"/>
+              </w:rPr>
               <m:t>f</m:t>
             </m:r>
           </m:sub>
         </m:sSub>
       </m:oMath>
       <w:r>
-        <w:t xml:space="preserve"> </w:t>
-      </w:r>
-      <w:r>
-        <w:t xml:space="preserve">(the bar denotes the average over the nine non-held-out replicates in the current context). We ranked steps by the heritability explained in those nine and kept the best</w:t>
-      </w:r>
-      <w:r>
-        <w:t xml:space="preserve"> </w:t>
+        <w:t xml:space="preserve"> (the bar denotes the average over the nine non-held-out replicates in the current context). We ranked steps by the heritability explained in those nine and kept the best </w:t>
       </w:r>
       <m:oMath>
         <m:r>
+          <w:rPr>
+            <w:rFonts w:ascii="Cambria Math" w:hAnsi="Cambria Math"/>
+          </w:rPr>
           <m:t>N</m:t>
         </m:r>
       </m:oMath>
       <w:r>
-        <w:t xml:space="preserve">, each at least 5 cM from any better one. The predicted change in founder frequency in the held-out replicate at a chosen step is its known selection intensity times that mean,</w:t>
+        <w:t>, each at least 5 cM from any better one. The predicted change in founder frequency in the held-out replicate at a chosen step is its known selection intensity times that mean,</w:t>
       </w:r>
     </w:p>
     <w:p>
@@ -493,19 +565,36 @@
         </m:oMathParaPr>
         <m:oMath>
           <m:sSub>
+            <m:sSubPr>
+              <m:ctrlPr>
+                <w:rPr>
+                  <w:rFonts w:ascii="Cambria Math" w:hAnsi="Cambria Math"/>
+                </w:rPr>
+              </m:ctrlPr>
+            </m:sSubPr>
             <m:e>
               <m:acc>
                 <m:accPr>
-                  <m:chr m:val="̂"/>
+                  <m:ctrlPr>
+                    <w:rPr>
+                      <w:rFonts w:ascii="Cambria Math" w:hAnsi="Cambria Math"/>
+                    </w:rPr>
+                  </m:ctrlPr>
                 </m:accPr>
                 <m:e>
                   <m:r>
                     <m:rPr>
                       <m:sty m:val="p"/>
                     </m:rPr>
+                    <w:rPr>
+                      <w:rFonts w:ascii="Cambria Math" w:hAnsi="Cambria Math"/>
+                    </w:rPr>
                     <m:t>Δ</m:t>
                   </m:r>
                   <m:r>
+                    <w:rPr>
+                      <w:rFonts w:ascii="Cambria Math" w:hAnsi="Cambria Math"/>
+                    </w:rPr>
                     <m:t>p</m:t>
                   </m:r>
                 </m:e>
@@ -513,12 +602,18 @@
             </m:e>
             <m:sub>
               <m:r>
+                <w:rPr>
+                  <w:rFonts w:ascii="Cambria Math" w:hAnsi="Cambria Math"/>
+                </w:rPr>
                 <m:t>f</m:t>
               </m:r>
               <m:r>
                 <m:rPr>
                   <m:sty m:val="p"/>
                 </m:rPr>
+                <w:rPr>
+                  <w:rFonts w:ascii="Cambria Math" w:hAnsi="Cambria Math"/>
+                </w:rPr>
                 <m:t>ⓡ</m:t>
               </m:r>
             </m:sub>
@@ -527,11 +622,24 @@
             <m:rPr>
               <m:sty m:val="p"/>
             </m:rPr>
+            <w:rPr>
+              <w:rFonts w:ascii="Cambria Math" w:hAnsi="Cambria Math"/>
+            </w:rPr>
             <m:t>=</m:t>
           </m:r>
           <m:sSub>
+            <m:sSubPr>
+              <m:ctrlPr>
+                <w:rPr>
+                  <w:rFonts w:ascii="Cambria Math" w:hAnsi="Cambria Math"/>
+                </w:rPr>
+              </m:ctrlPr>
+            </m:sSubPr>
             <m:e>
               <m:r>
+                <w:rPr>
+                  <w:rFonts w:ascii="Cambria Math" w:hAnsi="Cambria Math"/>
+                </w:rPr>
                 <m:t>i</m:t>
               </m:r>
             </m:e>
@@ -540,21 +648,42 @@
                 <m:rPr>
                   <m:sty m:val="p"/>
                 </m:rPr>
+                <w:rPr>
+                  <w:rFonts w:ascii="Cambria Math" w:hAnsi="Cambria Math"/>
+                </w:rPr>
                 <m:t>ⓡ</m:t>
               </m:r>
             </m:sub>
           </m:sSub>
           <m:r>
+            <w:rPr>
+              <w:rFonts w:ascii="Cambria Math" w:hAnsi="Cambria Math"/>
+            </w:rPr>
             <m:t> </m:t>
           </m:r>
           <m:sSub>
+            <m:sSubPr>
+              <m:ctrlPr>
+                <w:rPr>
+                  <w:rFonts w:ascii="Cambria Math" w:hAnsi="Cambria Math"/>
+                </w:rPr>
+              </m:ctrlPr>
+            </m:sSubPr>
             <m:e>
               <m:bar>
                 <m:barPr>
                   <m:pos m:val="top"/>
+                  <m:ctrlPr>
+                    <w:rPr>
+                      <w:rFonts w:ascii="Cambria Math" w:hAnsi="Cambria Math"/>
+                    </w:rPr>
+                  </m:ctrlPr>
                 </m:barPr>
                 <m:e>
                   <m:r>
+                    <w:rPr>
+                      <w:rFonts w:ascii="Cambria Math" w:hAnsi="Cambria Math"/>
+                    </w:rPr>
                     <m:t>e</m:t>
                   </m:r>
                 </m:e>
@@ -562,6 +691,9 @@
             </m:e>
             <m:sub>
               <m:r>
+                <w:rPr>
+                  <w:rFonts w:ascii="Cambria Math" w:hAnsi="Cambria Math"/>
+                </w:rPr>
                 <m:t>f</m:t>
               </m:r>
             </m:sub>
@@ -570,6 +702,9 @@
             <m:rPr>
               <m:sty m:val="p"/>
             </m:rPr>
+            <w:rPr>
+              <w:rFonts w:ascii="Cambria Math" w:hAnsi="Cambria Math"/>
+            </w:rPr>
             <m:t>,</m:t>
           </m:r>
         </m:oMath>
@@ -580,7 +715,7 @@
         <w:pStyle w:val="FirstParagraph"/>
       </w:pPr>
       <w:r>
-        <w:t xml:space="preserve">which is plotted against the observed change in Figure Ya. Heritability explained in the held-out replicate at a step is by extension</w:t>
+        <w:t>which is plotted against the observed change in Figure Ya. Heritability explained in the held-out replicate at a step is by extension</w:t>
       </w:r>
     </w:p>
     <w:p>
@@ -593,13 +728,27 @@
         </m:oMathParaPr>
         <m:oMath>
           <m:sSubSup>
+            <m:sSubSupPr>
+              <m:ctrlPr>
+                <w:rPr>
+                  <w:rFonts w:ascii="Cambria Math" w:hAnsi="Cambria Math"/>
+                </w:rPr>
+              </m:ctrlPr>
+            </m:sSubSupPr>
             <m:e>
               <m:acc>
                 <m:accPr>
-                  <m:chr m:val="̂"/>
+                  <m:ctrlPr>
+                    <w:rPr>
+                      <w:rFonts w:ascii="Cambria Math" w:hAnsi="Cambria Math"/>
+                    </w:rPr>
+                  </m:ctrlPr>
                 </m:accPr>
                 <m:e>
                   <m:r>
+                    <w:rPr>
+                      <w:rFonts w:ascii="Cambria Math" w:hAnsi="Cambria Math"/>
+                    </w:rPr>
                     <m:t>h</m:t>
                   </m:r>
                 </m:e>
@@ -610,11 +759,17 @@
                 <m:rPr>
                   <m:sty m:val="p"/>
                 </m:rPr>
+                <w:rPr>
+                  <w:rFonts w:ascii="Cambria Math" w:hAnsi="Cambria Math"/>
+                </w:rPr>
                 <m:t>ⓡ</m:t>
               </m:r>
             </m:sub>
             <m:sup>
               <m:r>
+                <w:rPr>
+                  <w:rFonts w:ascii="Cambria Math" w:hAnsi="Cambria Math"/>
+                </w:rPr>
                 <m:t>2</m:t>
               </m:r>
             </m:sup>
@@ -623,48 +778,77 @@
             <m:rPr>
               <m:sty m:val="p"/>
             </m:rPr>
+            <w:rPr>
+              <w:rFonts w:ascii="Cambria Math" w:hAnsi="Cambria Math"/>
+            </w:rPr>
             <m:t>=</m:t>
           </m:r>
           <m:r>
-            <m:t>100</m:t>
-          </m:r>
-          <m:r>
-            <m:t> </m:t>
-          </m:r>
-          <m:r>
-            <m:t>k</m:t>
+            <w:rPr>
+              <w:rFonts w:ascii="Cambria Math" w:hAnsi="Cambria Math"/>
+            </w:rPr>
+            <m:t>100 k</m:t>
           </m:r>
           <m:nary>
             <m:naryPr>
               <m:chr m:val="∑"/>
               <m:limLoc m:val="undOvr"/>
-              <m:subHide m:val="off"/>
-              <m:supHide m:val="on"/>
+              <m:supHide m:val="1"/>
+              <m:ctrlPr>
+                <w:rPr>
+                  <w:rFonts w:ascii="Cambria Math" w:hAnsi="Cambria Math"/>
+                </w:rPr>
+              </m:ctrlPr>
             </m:naryPr>
             <m:sub>
               <m:r>
+                <w:rPr>
+                  <w:rFonts w:ascii="Cambria Math" w:hAnsi="Cambria Math"/>
+                </w:rPr>
                 <m:t>f</m:t>
               </m:r>
             </m:sub>
             <m:sup>
               <m:r>
+                <w:rPr>
+                  <w:rFonts w:ascii="Cambria Math" w:hAnsi="Cambria Math"/>
+                </w:rPr>
                 <m:t>​</m:t>
               </m:r>
             </m:sup>
             <m:e>
               <m:f>
                 <m:fPr>
-                  <m:type m:val="bar"/>
+                  <m:ctrlPr>
+                    <w:rPr>
+                      <w:rFonts w:ascii="Cambria Math" w:hAnsi="Cambria Math"/>
+                    </w:rPr>
+                  </m:ctrlPr>
                 </m:fPr>
                 <m:num>
                   <m:sSub>
+                    <m:sSubPr>
+                      <m:ctrlPr>
+                        <w:rPr>
+                          <w:rFonts w:ascii="Cambria Math" w:hAnsi="Cambria Math"/>
+                        </w:rPr>
+                      </m:ctrlPr>
+                    </m:sSubPr>
                     <m:e>
                       <m:bar>
                         <m:barPr>
                           <m:pos m:val="top"/>
+                          <m:ctrlPr>
+                            <w:rPr>
+                              <w:rFonts w:ascii="Cambria Math" w:hAnsi="Cambria Math"/>
+                            </w:rPr>
+                          </m:ctrlPr>
                         </m:barPr>
                         <m:e>
                           <m:r>
+                            <w:rPr>
+                              <w:rFonts w:ascii="Cambria Math" w:hAnsi="Cambria Math"/>
+                            </w:rPr>
                             <m:t>e</m:t>
                           </m:r>
                         </m:e>
@@ -672,27 +856,49 @@
                     </m:e>
                     <m:sub>
                       <m:r>
+                        <w:rPr>
+                          <w:rFonts w:ascii="Cambria Math" w:hAnsi="Cambria Math"/>
+                        </w:rPr>
                         <m:t>f</m:t>
                       </m:r>
                     </m:sub>
                   </m:sSub>
                   <m:r>
+                    <w:rPr>
+                      <w:rFonts w:ascii="Cambria Math" w:hAnsi="Cambria Math"/>
+                    </w:rPr>
                     <m:t> </m:t>
                   </m:r>
                   <m:sSub>
+                    <m:sSubPr>
+                      <m:ctrlPr>
+                        <w:rPr>
+                          <w:rFonts w:ascii="Cambria Math" w:hAnsi="Cambria Math"/>
+                        </w:rPr>
+                      </m:ctrlPr>
+                    </m:sSubPr>
                     <m:e>
                       <m:r>
+                        <w:rPr>
+                          <w:rFonts w:ascii="Cambria Math" w:hAnsi="Cambria Math"/>
+                        </w:rPr>
                         <m:t>e</m:t>
                       </m:r>
                     </m:e>
                     <m:sub>
                       <m:r>
+                        <w:rPr>
+                          <w:rFonts w:ascii="Cambria Math" w:hAnsi="Cambria Math"/>
+                        </w:rPr>
                         <m:t>f</m:t>
                       </m:r>
                       <m:r>
                         <m:rPr>
                           <m:sty m:val="p"/>
                         </m:rPr>
+                        <w:rPr>
+                          <w:rFonts w:ascii="Cambria Math" w:hAnsi="Cambria Math"/>
+                        </w:rPr>
                         <m:t>ⓡ</m:t>
                       </m:r>
                     </m:sub>
@@ -700,13 +906,27 @@
                 </m:num>
                 <m:den>
                   <m:sSub>
+                    <m:sSubPr>
+                      <m:ctrlPr>
+                        <w:rPr>
+                          <w:rFonts w:ascii="Cambria Math" w:hAnsi="Cambria Math"/>
+                        </w:rPr>
+                      </m:ctrlPr>
+                    </m:sSubPr>
                     <m:e>
                       <m:acc>
                         <m:accPr>
-                          <m:chr m:val="̂"/>
+                          <m:ctrlPr>
+                            <w:rPr>
+                              <w:rFonts w:ascii="Cambria Math" w:hAnsi="Cambria Math"/>
+                            </w:rPr>
+                          </m:ctrlPr>
                         </m:accPr>
                         <m:e>
                           <m:r>
+                            <w:rPr>
+                              <w:rFonts w:ascii="Cambria Math" w:hAnsi="Cambria Math"/>
+                            </w:rPr>
                             <m:t>p</m:t>
                           </m:r>
                         </m:e>
@@ -714,6 +934,9 @@
                     </m:e>
                     <m:sub>
                       <m:r>
+                        <w:rPr>
+                          <w:rFonts w:ascii="Cambria Math" w:hAnsi="Cambria Math"/>
+                        </w:rPr>
                         <m:t>f</m:t>
                       </m:r>
                     </m:sub>
@@ -726,6 +949,9 @@
             <m:rPr>
               <m:sty m:val="p"/>
             </m:rPr>
+            <w:rPr>
+              <w:rFonts w:ascii="Cambria Math" w:hAnsi="Cambria Math"/>
+            </w:rPr>
             <m:t>.</m:t>
           </m:r>
         </m:oMath>
@@ -736,25 +962,38 @@
         <w:pStyle w:val="FirstParagraph"/>
       </w:pPr>
       <w:r>
-        <w:t xml:space="preserve">The</w:t>
-      </w:r>
-      <w:r>
-        <w:t xml:space="preserve"> </w:t>
+        <w:t xml:space="preserve">The </w:t>
       </w:r>
       <m:oMath>
         <m:sSubSup>
+          <m:sSubSupPr>
+            <m:ctrlPr>
+              <w:rPr>
+                <w:rFonts w:ascii="Cambria Math" w:hAnsi="Cambria Math"/>
+              </w:rPr>
+            </m:ctrlPr>
+          </m:sSubSupPr>
           <m:e>
             <m:r>
+              <w:rPr>
+                <w:rFonts w:ascii="Cambria Math" w:hAnsi="Cambria Math"/>
+              </w:rPr>
               <m:t>s</m:t>
             </m:r>
           </m:e>
           <m:sub>
             <m:r>
+              <w:rPr>
+                <w:rFonts w:ascii="Cambria Math" w:hAnsi="Cambria Math"/>
+              </w:rPr>
               <m:t>f</m:t>
             </m:r>
           </m:sub>
           <m:sup>
             <m:r>
+              <w:rPr>
+                <w:rFonts w:ascii="Cambria Math" w:hAnsi="Cambria Math"/>
+              </w:rPr>
               <m:t>2</m:t>
             </m:r>
           </m:sup>
@@ -763,30 +1002,45 @@
           <m:rPr>
             <m:sty m:val="p"/>
           </m:rPr>
+          <w:rPr>
+            <w:rFonts w:ascii="Cambria Math" w:hAnsi="Cambria Math"/>
+          </w:rPr>
           <m:t>/</m:t>
         </m:r>
         <m:r>
+          <w:rPr>
+            <w:rFonts w:ascii="Cambria Math" w:hAnsi="Cambria Math"/>
+          </w:rPr>
           <m:t>R</m:t>
         </m:r>
       </m:oMath>
       <w:r>
-        <w:t xml:space="preserve"> </w:t>
-      </w:r>
-      <w:r>
-        <w:t xml:space="preserve">term of the earlier heritability estimator does not appear, as</w:t>
-      </w:r>
-      <w:r>
-        <w:t xml:space="preserve"> </w:t>
+        <w:t xml:space="preserve"> term of the earlier heritability estimator does not appear, as </w:t>
       </w:r>
       <m:oMath>
         <m:sSub>
+          <m:sSubPr>
+            <m:ctrlPr>
+              <w:rPr>
+                <w:rFonts w:ascii="Cambria Math" w:hAnsi="Cambria Math"/>
+              </w:rPr>
+            </m:ctrlPr>
+          </m:sSubPr>
           <m:e>
             <m:bar>
               <m:barPr>
                 <m:pos m:val="top"/>
+                <m:ctrlPr>
+                  <w:rPr>
+                    <w:rFonts w:ascii="Cambria Math" w:hAnsi="Cambria Math"/>
+                  </w:rPr>
+                </m:ctrlPr>
               </m:barPr>
               <m:e>
                 <m:r>
+                  <w:rPr>
+                    <w:rFonts w:ascii="Cambria Math" w:hAnsi="Cambria Math"/>
+                  </w:rPr>
                   <m:t>e</m:t>
                 </m:r>
               </m:e>
@@ -794,58 +1048,80 @@
           </m:e>
           <m:sub>
             <m:r>
+              <w:rPr>
+                <w:rFonts w:ascii="Cambria Math" w:hAnsi="Cambria Math"/>
+              </w:rPr>
               <m:t>f</m:t>
             </m:r>
           </m:sub>
         </m:sSub>
       </m:oMath>
       <w:r>
-        <w:t xml:space="preserve"> </w:t>
-      </w:r>
-      <w:r>
-        <w:t xml:space="preserve">and</w:t>
-      </w:r>
-      <w:r>
-        <w:t xml:space="preserve"> </w:t>
+        <w:t xml:space="preserve"> and </w:t>
       </w:r>
       <m:oMath>
         <m:sSub>
+          <m:sSubPr>
+            <m:ctrlPr>
+              <w:rPr>
+                <w:rFonts w:ascii="Cambria Math" w:hAnsi="Cambria Math"/>
+              </w:rPr>
+            </m:ctrlPr>
+          </m:sSubPr>
           <m:e>
             <m:r>
+              <w:rPr>
+                <w:rFonts w:ascii="Cambria Math" w:hAnsi="Cambria Math"/>
+              </w:rPr>
               <m:t>e</m:t>
             </m:r>
           </m:e>
           <m:sub>
             <m:r>
+              <w:rPr>
+                <w:rFonts w:ascii="Cambria Math" w:hAnsi="Cambria Math"/>
+              </w:rPr>
               <m:t>f</m:t>
             </m:r>
             <m:r>
               <m:rPr>
                 <m:sty m:val="p"/>
               </m:rPr>
+              <w:rPr>
+                <w:rFonts w:ascii="Cambria Math" w:hAnsi="Cambria Math"/>
+              </w:rPr>
               <m:t>ⓡ</m:t>
             </m:r>
           </m:sub>
         </m:sSub>
       </m:oMath>
       <w:r>
-        <w:t xml:space="preserve"> </w:t>
-      </w:r>
-      <w:r>
-        <w:t xml:space="preserve">are independent estimates of the same quantity, so their product has expectation</w:t>
-      </w:r>
-      <w:r>
-        <w:t xml:space="preserve"> </w:t>
+        <w:t xml:space="preserve"> are independent estimates of the same quantity, so their product has expectation </w:t>
       </w:r>
       <m:oMath>
         <m:sSubSup>
+          <m:sSubSupPr>
+            <m:ctrlPr>
+              <w:rPr>
+                <w:rFonts w:ascii="Cambria Math" w:hAnsi="Cambria Math"/>
+              </w:rPr>
+            </m:ctrlPr>
+          </m:sSubSupPr>
           <m:e>
             <m:bar>
               <m:barPr>
                 <m:pos m:val="top"/>
+                <m:ctrlPr>
+                  <w:rPr>
+                    <w:rFonts w:ascii="Cambria Math" w:hAnsi="Cambria Math"/>
+                  </w:rPr>
+                </m:ctrlPr>
               </m:barPr>
               <m:e>
                 <m:r>
+                  <w:rPr>
+                    <w:rFonts w:ascii="Cambria Math" w:hAnsi="Cambria Math"/>
+                  </w:rPr>
                   <m:t>e</m:t>
                 </m:r>
               </m:e>
@@ -853,34 +1129,64 @@
           </m:e>
           <m:sub>
             <m:r>
+              <w:rPr>
+                <w:rFonts w:ascii="Cambria Math" w:hAnsi="Cambria Math"/>
+              </w:rPr>
               <m:t>f</m:t>
             </m:r>
           </m:sub>
           <m:sup>
             <m:r>
-              <m:t> </m:t>
-            </m:r>
-            <m:r>
-              <m:t>2</m:t>
+              <w:rPr>
+                <w:rFonts w:ascii="Cambria Math" w:hAnsi="Cambria Math"/>
+              </w:rPr>
+              <m:t> 2</m:t>
             </m:r>
           </m:sup>
         </m:sSubSup>
       </m:oMath>
       <w:r>
-        <w:t xml:space="preserve">. Summing</w:t>
-      </w:r>
-      <w:r>
-        <w:t xml:space="preserve"> </w:t>
+        <w:t xml:space="preserve">. </w:t>
+      </w:r>
+    </w:p>
+    <w:p>
+      <w:pPr>
+        <w:pStyle w:val="FirstParagraph"/>
+      </w:pPr>
+      <w:r>
+        <w:t>This section is very long, and I think belabored.  I mean just fucking state how we sum h2 over the N predictors (one fucking sentence … We estimate the total heritability explains as…).  The C matrix accounts for correlation between markers, but by virtue of the predictors being 5cM apart, the correction shrink an estimate of heritability just based on the simple sum by at most 5%.  Like can it literally be 3 simple sentences?</w:t>
+      </w:r>
+    </w:p>
+    <w:p>
+      <w:pPr>
+        <w:pStyle w:val="FirstParagraph"/>
+      </w:pPr>
+      <w:r>
+        <w:t xml:space="preserve">Summing </w:t>
       </w:r>
       <m:oMath>
         <m:sSubSup>
+          <m:sSubSupPr>
+            <m:ctrlPr>
+              <w:rPr>
+                <w:rFonts w:ascii="Cambria Math" w:hAnsi="Cambria Math"/>
+              </w:rPr>
+            </m:ctrlPr>
+          </m:sSubSupPr>
           <m:e>
             <m:acc>
               <m:accPr>
-                <m:chr m:val="̂"/>
+                <m:ctrlPr>
+                  <w:rPr>
+                    <w:rFonts w:ascii="Cambria Math" w:hAnsi="Cambria Math"/>
+                  </w:rPr>
+                </m:ctrlPr>
               </m:accPr>
               <m:e>
                 <m:r>
+                  <w:rPr>
+                    <w:rFonts w:ascii="Cambria Math" w:hAnsi="Cambria Math"/>
+                  </w:rPr>
                   <m:t>h</m:t>
                 </m:r>
               </m:e>
@@ -891,77 +1197,107 @@
               <m:rPr>
                 <m:sty m:val="p"/>
               </m:rPr>
+              <w:rPr>
+                <w:rFonts w:ascii="Cambria Math" w:hAnsi="Cambria Math"/>
+              </w:rPr>
               <m:t>ⓡ</m:t>
             </m:r>
           </m:sub>
           <m:sup>
             <m:r>
+              <w:rPr>
+                <w:rFonts w:ascii="Cambria Math" w:hAnsi="Cambria Math"/>
+              </w:rPr>
               <m:t>2</m:t>
             </m:r>
           </m:sup>
         </m:sSubSup>
       </m:oMath>
       <w:r>
-        <w:t xml:space="preserve"> </w:t>
-      </w:r>
-      <w:r>
-        <w:t xml:space="preserve">over the</w:t>
-      </w:r>
-      <w:r>
-        <w:t xml:space="preserve"> </w:t>
+        <w:t xml:space="preserve"> over the </w:t>
       </w:r>
       <m:oMath>
         <m:r>
+          <w:rPr>
+            <w:rFonts w:ascii="Cambria Math" w:hAnsi="Cambria Math"/>
+          </w:rPr>
           <m:t>N</m:t>
         </m:r>
       </m:oMath>
       <w:r>
-        <w:t xml:space="preserve"> </w:t>
-      </w:r>
-      <w:r>
-        <w:t xml:space="preserve">steps of a predictor gives the covariance between what it predicts and what the held-out replicate does, and the same sum with</w:t>
-      </w:r>
-      <w:r>
-        <w:t xml:space="preserve"> </w:t>
+        <w:t xml:space="preserve"> steps of a predictor </w:t>
+      </w:r>
+      <w:proofErr w:type="gramStart"/>
+      <w:r>
+        <w:t>gives</w:t>
+      </w:r>
+      <w:proofErr w:type="gramEnd"/>
+      <w:r>
+        <w:t xml:space="preserve"> the covariance between what it predicts and what the held-out replicate does, and the same sum with </w:t>
       </w:r>
       <m:oMath>
         <m:sSub>
+          <m:sSubPr>
+            <m:ctrlPr>
+              <w:rPr>
+                <w:rFonts w:ascii="Cambria Math" w:hAnsi="Cambria Math"/>
+              </w:rPr>
+            </m:ctrlPr>
+          </m:sSubPr>
           <m:e>
             <m:r>
+              <w:rPr>
+                <w:rFonts w:ascii="Cambria Math" w:hAnsi="Cambria Math"/>
+              </w:rPr>
               <m:t>e</m:t>
             </m:r>
           </m:e>
           <m:sub>
             <m:r>
+              <w:rPr>
+                <w:rFonts w:ascii="Cambria Math" w:hAnsi="Cambria Math"/>
+              </w:rPr>
               <m:t>f</m:t>
             </m:r>
             <m:r>
               <m:rPr>
                 <m:sty m:val="p"/>
               </m:rPr>
+              <w:rPr>
+                <w:rFonts w:ascii="Cambria Math" w:hAnsi="Cambria Math"/>
+              </w:rPr>
               <m:t>ⓡ</m:t>
             </m:r>
           </m:sub>
         </m:sSub>
       </m:oMath>
       <w:r>
-        <w:t xml:space="preserve"> </w:t>
-      </w:r>
-      <w:r>
-        <w:t xml:space="preserve">replaced by</w:t>
-      </w:r>
-      <w:r>
-        <w:t xml:space="preserve"> </w:t>
+        <w:t xml:space="preserve"> replaced by </w:t>
       </w:r>
       <m:oMath>
         <m:sSub>
+          <m:sSubPr>
+            <m:ctrlPr>
+              <w:rPr>
+                <w:rFonts w:ascii="Cambria Math" w:hAnsi="Cambria Math"/>
+              </w:rPr>
+            </m:ctrlPr>
+          </m:sSubPr>
           <m:e>
             <m:bar>
               <m:barPr>
                 <m:pos m:val="top"/>
+                <m:ctrlPr>
+                  <w:rPr>
+                    <w:rFonts w:ascii="Cambria Math" w:hAnsi="Cambria Math"/>
+                  </w:rPr>
+                </m:ctrlPr>
               </m:barPr>
               <m:e>
                 <m:r>
+                  <w:rPr>
+                    <w:rFonts w:ascii="Cambria Math" w:hAnsi="Cambria Math"/>
+                  </w:rPr>
                   <m:t>e</m:t>
                 </m:r>
               </m:e>
@@ -969,54 +1305,61 @@
           </m:e>
           <m:sub>
             <m:r>
+              <w:rPr>
+                <w:rFonts w:ascii="Cambria Math" w:hAnsi="Cambria Math"/>
+              </w:rPr>
               <m:t>f</m:t>
             </m:r>
           </m:sub>
         </m:sSub>
       </m:oMath>
       <w:r>
-        <w:t xml:space="preserve"> </w:t>
-      </w:r>
-      <w:r>
-        <w:t xml:space="preserve">gives the predictor’s own variance. Call these</w:t>
-      </w:r>
-      <w:r>
-        <w:t xml:space="preserve"> </w:t>
+        <w:t xml:space="preserve"> gives the predictor’s own variance. Call these </w:t>
       </w:r>
       <m:oMath>
         <m:r>
+          <w:rPr>
+            <w:rFonts w:ascii="Cambria Math" w:hAnsi="Cambria Math"/>
+          </w:rPr>
           <m:t>A</m:t>
         </m:r>
       </m:oMath>
       <w:r>
-        <w:t xml:space="preserve"> </w:t>
-      </w:r>
-      <w:r>
-        <w:t xml:space="preserve">and</w:t>
-      </w:r>
-      <w:r>
-        <w:t xml:space="preserve"> </w:t>
+        <w:t xml:space="preserve"> and </w:t>
       </w:r>
       <m:oMath>
         <m:r>
+          <w:rPr>
+            <w:rFonts w:ascii="Cambria Math" w:hAnsi="Cambria Math"/>
+          </w:rPr>
           <m:t>B</m:t>
         </m:r>
       </m:oMath>
       <w:r>
-        <w:t xml:space="preserve">. The heritability the predictor explains in the held-out replicate is then</w:t>
-      </w:r>
-      <w:r>
-        <w:t xml:space="preserve"> </w:t>
+        <w:t xml:space="preserve">. The heritability the predictor explains in the held-out replicate is then </w:t>
       </w:r>
       <m:oMath>
         <m:sSup>
+          <m:sSupPr>
+            <m:ctrlPr>
+              <w:rPr>
+                <w:rFonts w:ascii="Cambria Math" w:hAnsi="Cambria Math"/>
+              </w:rPr>
+            </m:ctrlPr>
+          </m:sSupPr>
           <m:e>
             <m:r>
+              <w:rPr>
+                <w:rFonts w:ascii="Cambria Math" w:hAnsi="Cambria Math"/>
+              </w:rPr>
               <m:t>A</m:t>
             </m:r>
           </m:e>
           <m:sup>
             <m:r>
+              <w:rPr>
+                <w:rFonts w:ascii="Cambria Math" w:hAnsi="Cambria Math"/>
+              </w:rPr>
               <m:t>2</m:t>
             </m:r>
           </m:sup>
@@ -1025,73 +1368,95 @@
           <m:rPr>
             <m:sty m:val="p"/>
           </m:rPr>
+          <w:rPr>
+            <w:rFonts w:ascii="Cambria Math" w:hAnsi="Cambria Math"/>
+          </w:rPr>
           <m:t>/</m:t>
         </m:r>
         <m:r>
+          <w:rPr>
+            <w:rFonts w:ascii="Cambria Math" w:hAnsi="Cambria Math"/>
+          </w:rPr>
           <m:t>B</m:t>
         </m:r>
       </m:oMath>
       <w:r>
-        <w:t xml:space="preserve">, the sum of squares accounted for by regressing observed changes on predicted ones, and</w:t>
-      </w:r>
-      <w:r>
-        <w:t xml:space="preserve"> </w:t>
+        <w:t xml:space="preserve">, the sum of squares accounted for by regressing observed changes on predicted ones, and </w:t>
       </w:r>
       <m:oMath>
         <m:r>
+          <w:rPr>
+            <w:rFonts w:ascii="Cambria Math" w:hAnsi="Cambria Math"/>
+          </w:rPr>
           <m:t>A</m:t>
         </m:r>
         <m:r>
           <m:rPr>
             <m:sty m:val="p"/>
           </m:rPr>
+          <w:rPr>
+            <w:rFonts w:ascii="Cambria Math" w:hAnsi="Cambria Math"/>
+          </w:rPr>
           <m:t>/</m:t>
         </m:r>
         <m:r>
+          <w:rPr>
+            <w:rFonts w:ascii="Cambria Math" w:hAnsi="Cambria Math"/>
+          </w:rPr>
           <m:t>B</m:t>
         </m:r>
       </m:oMath>
       <w:r>
-        <w:t xml:space="preserve"> </w:t>
-      </w:r>
-      <w:r>
-        <w:t xml:space="preserve">is the reliability of weights taken from nine replicates: 0.83–0.88 for ten steps and 0.73–0.75 for thirty. Both sums are quadratic forms with the inverse of the</w:t>
-      </w:r>
-      <w:r>
-        <w:t xml:space="preserve"> </w:t>
+        <w:t xml:space="preserve"> is the reliability of weights taken from nine replicates: 0.83–0.88 for ten steps and 0.73–0.75 for thirty. Both sums are quadratic forms with the inverse of the </w:t>
       </w:r>
       <m:oMath>
         <m:r>
+          <w:rPr>
+            <w:rFonts w:ascii="Cambria Math" w:hAnsi="Cambria Math"/>
+          </w:rPr>
           <m:t>N</m:t>
         </m:r>
         <m:r>
           <m:rPr>
             <m:sty m:val="p"/>
           </m:rPr>
+          <w:rPr>
+            <w:rFonts w:ascii="Cambria Math" w:hAnsi="Cambria Math"/>
+          </w:rPr>
           <m:t>×</m:t>
         </m:r>
         <m:r>
+          <w:rPr>
+            <w:rFonts w:ascii="Cambria Math" w:hAnsi="Cambria Math"/>
+          </w:rPr>
           <m:t>N</m:t>
         </m:r>
       </m:oMath>
       <w:r>
-        <w:t xml:space="preserve"> </w:t>
-      </w:r>
-      <w:r>
-        <w:t xml:space="preserve">correlation matrix of the chosen steps, which corrects for their signals being correlated as the multiplicative constant does genome-wide; at a separation of 5 cM the correlation is 0.25–0.34 and the correction changes</w:t>
-      </w:r>
-      <w:r>
-        <w:t xml:space="preserve"> </w:t>
+        <w:t xml:space="preserve"> correlation matrix of the chosen steps, which corrects for their signals being correlated as the multiplicative constant does genome-wide; at a separation of 5 cM the correlation is 0.25–0.34 and the correction changes </w:t>
       </w:r>
       <m:oMath>
         <m:sSup>
+          <m:sSupPr>
+            <m:ctrlPr>
+              <w:rPr>
+                <w:rFonts w:ascii="Cambria Math" w:hAnsi="Cambria Math"/>
+              </w:rPr>
+            </m:ctrlPr>
+          </m:sSupPr>
           <m:e>
             <m:r>
+              <w:rPr>
+                <w:rFonts w:ascii="Cambria Math" w:hAnsi="Cambria Math"/>
+              </w:rPr>
               <m:t>A</m:t>
             </m:r>
           </m:e>
           <m:sup>
             <m:r>
+              <w:rPr>
+                <w:rFonts w:ascii="Cambria Math" w:hAnsi="Cambria Math"/>
+              </w:rPr>
               <m:t>2</m:t>
             </m:r>
           </m:sup>
@@ -1100,30 +1465,43 @@
           <m:rPr>
             <m:sty m:val="p"/>
           </m:rPr>
+          <w:rPr>
+            <w:rFonts w:ascii="Cambria Math" w:hAnsi="Cambria Math"/>
+          </w:rPr>
           <m:t>/</m:t>
         </m:r>
         <m:r>
+          <w:rPr>
+            <w:rFonts w:ascii="Cambria Math" w:hAnsi="Cambria Math"/>
+          </w:rPr>
           <m:t>B</m:t>
         </m:r>
       </m:oMath>
       <w:r>
-        <w:t xml:space="preserve"> </w:t>
-      </w:r>
-      <w:r>
-        <w:t xml:space="preserve">by at most 5%. Figure Yb plots</w:t>
-      </w:r>
-      <w:r>
-        <w:t xml:space="preserve"> </w:t>
+        <w:t xml:space="preserve"> by at most 5%. Figure Yb plots </w:t>
       </w:r>
       <m:oMath>
         <m:sSup>
+          <m:sSupPr>
+            <m:ctrlPr>
+              <w:rPr>
+                <w:rFonts w:ascii="Cambria Math" w:hAnsi="Cambria Math"/>
+              </w:rPr>
+            </m:ctrlPr>
+          </m:sSupPr>
           <m:e>
             <m:r>
+              <w:rPr>
+                <w:rFonts w:ascii="Cambria Math" w:hAnsi="Cambria Math"/>
+              </w:rPr>
               <m:t>A</m:t>
             </m:r>
           </m:e>
           <m:sup>
             <m:r>
+              <w:rPr>
+                <w:rFonts w:ascii="Cambria Math" w:hAnsi="Cambria Math"/>
+              </w:rPr>
               <m:t>2</m:t>
             </m:r>
           </m:sup>
@@ -1132,97 +1510,73 @@
           <m:rPr>
             <m:sty m:val="p"/>
           </m:rPr>
+          <w:rPr>
+            <w:rFonts w:ascii="Cambria Math" w:hAnsi="Cambria Math"/>
+          </w:rPr>
           <m:t>/</m:t>
         </m:r>
         <m:r>
+          <w:rPr>
+            <w:rFonts w:ascii="Cambria Math" w:hAnsi="Cambria Math"/>
+          </w:rPr>
           <m:t>B</m:t>
         </m:r>
       </m:oMath>
       <w:r>
-        <w:t xml:space="preserve"> </w:t>
-      </w:r>
-      <w:r>
-        <w:t xml:space="preserve">against</w:t>
-      </w:r>
-      <w:r>
-        <w:t xml:space="preserve"> </w:t>
+        <w:t xml:space="preserve"> against </w:t>
       </w:r>
       <m:oMath>
         <m:r>
+          <w:rPr>
+            <w:rFonts w:ascii="Cambria Math" w:hAnsi="Cambria Math"/>
+          </w:rPr>
           <m:t>N</m:t>
         </m:r>
       </m:oMath>
       <w:r>
-        <w:t xml:space="preserve">, for each held-out replicate on its own and for the ten together, averaging</w:t>
-      </w:r>
-      <w:r>
-        <w:t xml:space="preserve"> </w:t>
+        <w:t xml:space="preserve">, for each held-out replicate on its own and for the ten together, averaging </w:t>
       </w:r>
       <m:oMath>
         <m:r>
+          <w:rPr>
+            <w:rFonts w:ascii="Cambria Math" w:hAnsi="Cambria Math"/>
+          </w:rPr>
           <m:t>A</m:t>
         </m:r>
       </m:oMath>
       <w:r>
-        <w:t xml:space="preserve"> </w:t>
-      </w:r>
-      <w:r>
-        <w:t xml:space="preserve">and</w:t>
-      </w:r>
-      <w:r>
-        <w:t xml:space="preserve"> </w:t>
+        <w:t xml:space="preserve"> and </w:t>
       </w:r>
       <m:oMath>
         <m:r>
+          <w:rPr>
+            <w:rFonts w:ascii="Cambria Math" w:hAnsi="Cambria Math"/>
+          </w:rPr>
           <m:t>B</m:t>
         </m:r>
       </m:oMath>
       <w:r>
-        <w:t xml:space="preserve"> </w:t>
-      </w:r>
-      <w:r>
-        <w:t xml:space="preserve">over replicates before forming the ratio.</w:t>
+        <w:t xml:space="preserve"> over replicates before forming the ratio.</w:t>
       </w:r>
     </w:p>
     <w:sectPr>
-      <w:pgSz w:h="15840" w:w="12240"/>
-      <w:pgMar w:bottom="1440" w:footer="720" w:gutter="0" w:header="720" w:left="1440" w:right="1440" w:top="1440"/>
       <w:footnotePr>
         <w:numRestart w:val="eachSect"/>
       </w:footnotePr>
+      <w:pgSz w:w="12240" w:h="15840"/>
+      <w:pgMar w:top="1440" w:right="1440" w:bottom="1440" w:left="1440" w:header="720" w:footer="720" w:gutter="0"/>
+      <w:cols w:space="720"/>
     </w:sectPr>
   </w:body>
 </w:document>
 </file>
 
-<file path=word/comments.xml><?xml version="1.0" encoding="utf-8"?>
-<w:comments xmlns:w="http://schemas.openxmlformats.org/wordprocessingml/2006/main" xmlns:m="http://schemas.openxmlformats.org/officeDocument/2006/math" xmlns:r="http://schemas.openxmlformats.org/officeDocument/2006/relationships" xmlns:o="urn:schemas-microsoft-com:office:office" xmlns:v="urn:schemas-microsoft-com:vml" xmlns:w10="urn:schemas-microsoft-com:office:word" xmlns:a="http://schemas.openxmlformats.org/drawingml/2006/main" xmlns:pic="http://schemas.openxmlformats.org/drawingml/2006/picture" xmlns:wp="http://schemas.openxmlformats.org/drawingml/2006/wordprocessingDrawing"/>
-</file>
-
-<file path=word/footnotes.xml><?xml version="1.0" encoding="utf-8"?>
-<w:footnotes xmlns:w="http://schemas.openxmlformats.org/wordprocessingml/2006/main" xmlns:m="http://schemas.openxmlformats.org/officeDocument/2006/math" xmlns:r="http://schemas.openxmlformats.org/officeDocument/2006/relationships" xmlns:o="urn:schemas-microsoft-com:office:office" xmlns:v="urn:schemas-microsoft-com:vml" xmlns:w10="urn:schemas-microsoft-com:office:word" xmlns:a="http://schemas.openxmlformats.org/drawingml/2006/main" xmlns:pic="http://schemas.openxmlformats.org/drawingml/2006/picture" xmlns:wp="http://schemas.openxmlformats.org/drawingml/2006/wordprocessingDrawing">
-  <w:footnote w:type="continuationSeparator" w:id="0">
-    <w:p>
-      <w:r>
-        <w:continuationSeparator/>
-      </w:r>
-    </w:p>
-  </w:footnote>
-  <w:footnote w:type="separator" w:id="-1">
-    <w:p>
-      <w:r>
-        <w:separator/>
-      </w:r>
-    </w:p>
-  </w:footnote>
-</w:footnotes>
-</file>
-
 <file path=word/numbering.xml><?xml version="1.0" encoding="utf-8"?>
-<w:numbering xmlns:w="http://schemas.openxmlformats.org/wordprocessingml/2006/main">
-  <w:abstractNum w:abstractNumId="990">
+<w:numbering xmlns:wpc="http://schemas.microsoft.com/office/word/2010/wordprocessingCanvas" xmlns:cx="http://schemas.microsoft.com/office/drawing/2014/chartex" xmlns:cx1="http://schemas.microsoft.com/office/drawing/2015/9/8/chartex" xmlns:cx2="http://schemas.microsoft.com/office/drawing/2015/10/21/chartex" xmlns:cx3="http://schemas.microsoft.com/office/drawing/2016/5/9/chartex" xmlns:cx4="http://schemas.microsoft.com/office/drawing/2016/5/10/chartex" xmlns:cx5="http://schemas.microsoft.com/office/drawing/2016/5/11/chartex" xmlns:cx6="http://schemas.microsoft.com/office/drawing/2016/5/12/chartex" xmlns:cx7="http://schemas.microsoft.com/office/drawing/2016/5/13/chartex" xmlns:cx8="http://schemas.microsoft.com/office/drawing/2016/5/14/chartex" xmlns:mc="http://schemas.openxmlformats.org/markup-compatibility/2006" xmlns:m="http://schemas.openxmlformats.org/officeDocument/2006/math" xmlns:aink="http://schemas.microsoft.com/office/drawing/2016/ink" xmlns:am3d="http://schemas.microsoft.com/office/drawing/2017/model3d" xmlns:oel="http://schemas.microsoft.com/office/2019/extlst" xmlns:r="http://schemas.openxmlformats.org/officeDocument/2006/relationships" xmlns:wp14="http://schemas.microsoft.com/office/word/2010/wordprocessingDrawing" xmlns:wp="http://schemas.openxmlformats.org/drawingml/2006/wordprocessingDrawing" xmlns:wpg="http://schemas.microsoft.com/office/word/2010/wordprocessingGroup" xmlns:wpi="http://schemas.microsoft.com/office/word/2010/wordprocessingInk" xmlns:wps="http://schemas.microsoft.com/office/word/2010/wordprocessingShape" xmlns:o="urn:schemas-microsoft-com:office:office" xmlns:v="urn:schemas-microsoft-com:vml" xmlns:w10="urn:schemas-microsoft-com:office:word" xmlns:w="http://schemas.openxmlformats.org/wordprocessingml/2006/main" xmlns:w14="http://schemas.microsoft.com/office/word/2010/wordml" xmlns:w15="http://schemas.microsoft.com/office/word/2012/wordml" xmlns:w16cex="http://schemas.microsoft.com/office/word/2018/wordml/cex" xmlns:w16cid="http://schemas.microsoft.com/office/word/2016/wordml/cid" xmlns:w16="http://schemas.microsoft.com/office/word/2018/wordml" xmlns:w16sdtdh="http://schemas.microsoft.com/office/word/2020/wordml/sdtdatahash" xmlns:w16sdtfl="http://schemas.microsoft.com/office/word/2024/wordml/sdtformatlock" xmlns:w16se="http://schemas.microsoft.com/office/word/2015/wordml/symex" xmlns:w16du="http://schemas.microsoft.com/office/word/2023/wordml/word16du" xmlns:wne="http://schemas.microsoft.com/office/word/2006/wordml" mc:Ignorable="w14 w15 w16se w16cid w16 w16cex w16sdtdh w16sdtfl w16du wp14">
+  <w:abstractNum w:abstractNumId="0" w15:restartNumberingAfterBreak="0">
     <w:nsid w:val="0000A990"/>
     <w:multiLevelType w:val="multilevel"/>
+    <w:tmpl w:val="CD500C32"/>
     <w:lvl w:ilvl="0">
       <w:numFmt w:val="bullet"/>
       <w:lvlText w:val=" "/>
@@ -1296,21 +1650,21 @@
       </w:pPr>
     </w:lvl>
   </w:abstractNum>
-  <w:num w:numId="1000">
-    <w:abstractNumId w:val="990"/>
+  <w:num w:numId="1" w16cid:durableId="288633260">
+    <w:abstractNumId w:val="0"/>
   </w:num>
 </w:numbering>
 </file>
 
 <file path=word/styles.xml><?xml version="1.0" encoding="utf-8"?>
-<w:styles xmlns:r="http://schemas.openxmlformats.org/officeDocument/2006/relationships" xmlns:w="http://schemas.openxmlformats.org/wordprocessingml/2006/main">
+<w:styles xmlns:mc="http://schemas.openxmlformats.org/markup-compatibility/2006" xmlns:r="http://schemas.openxmlformats.org/officeDocument/2006/relationships" xmlns:w="http://schemas.openxmlformats.org/wordprocessingml/2006/main" xmlns:w14="http://schemas.microsoft.com/office/word/2010/wordml" xmlns:w15="http://schemas.microsoft.com/office/word/2012/wordml" xmlns:w16cex="http://schemas.microsoft.com/office/word/2018/wordml/cex" xmlns:w16cid="http://schemas.microsoft.com/office/word/2016/wordml/cid" xmlns:w16="http://schemas.microsoft.com/office/word/2018/wordml" xmlns:w16sdtdh="http://schemas.microsoft.com/office/word/2020/wordml/sdtdatahash" xmlns:w16sdtfl="http://schemas.microsoft.com/office/word/2024/wordml/sdtformatlock" xmlns:w16se="http://schemas.microsoft.com/office/word/2015/wordml/symex" xmlns:w16du="http://schemas.microsoft.com/office/word/2023/wordml/word16du" mc:Ignorable="w14 w15 w16se w16cid w16 w16cex w16sdtdh w16sdtfl w16du">
   <w:docDefaults>
     <w:rPrDefault>
       <w:rPr>
-        <w:rFonts w:asciiTheme="minorHAnsi" w:cstheme="minorBidi" w:eastAsiaTheme="minorEastAsia" w:hAnsiTheme="minorHAnsi"/>
+        <w:rFonts w:asciiTheme="minorHAnsi" w:eastAsiaTheme="minorEastAsia" w:hAnsiTheme="minorHAnsi" w:cstheme="minorBidi"/>
         <w:sz w:val="24"/>
         <w:szCs w:val="24"/>
-        <w:lang w:bidi="ar-SA" w:eastAsia="zh-CN" w:val="en-US"/>
+        <w:lang w:val="en-US" w:eastAsia="zh-CN" w:bidi="ar-SA"/>
       </w:rPr>
     </w:rPrDefault>
     <w:pPrDefault>
@@ -1319,168 +1673,255 @@
       </w:pPr>
     </w:pPrDefault>
   </w:docDefaults>
-  <w:latentStyles w:count="276" w:defLockedState="0" w:defQFormat="0" w:defSemiHidden="0" w:defUIPriority="0" w:defUnhideWhenUsed="0"/>
-  <w:style w:default="1" w:styleId="Normal" w:type="paragraph">
+  <w:latentStyles w:defLockedState="0" w:defUIPriority="0" w:defSemiHidden="0" w:defUnhideWhenUsed="0" w:defQFormat="0" w:count="376">
+    <w:lsdException w:name="Normal Table" w:semiHidden="1" w:unhideWhenUsed="1"/>
+    <w:lsdException w:name="Table Simple 1" w:semiHidden="1" w:unhideWhenUsed="1"/>
+    <w:lsdException w:name="Table Simple 2" w:semiHidden="1" w:unhideWhenUsed="1"/>
+    <w:lsdException w:name="Table Simple 3" w:semiHidden="1" w:unhideWhenUsed="1"/>
+    <w:lsdException w:name="Table Classic 1" w:semiHidden="1" w:unhideWhenUsed="1"/>
+    <w:lsdException w:name="Table Classic 2" w:semiHidden="1" w:unhideWhenUsed="1"/>
+    <w:lsdException w:name="Table Classic 3" w:semiHidden="1" w:unhideWhenUsed="1"/>
+    <w:lsdException w:name="Table Classic 4" w:semiHidden="1" w:unhideWhenUsed="1"/>
+    <w:lsdException w:name="Table Colorful 1" w:semiHidden="1" w:unhideWhenUsed="1"/>
+    <w:lsdException w:name="Table Colorful 2" w:semiHidden="1" w:unhideWhenUsed="1"/>
+    <w:lsdException w:name="Table Colorful 3" w:semiHidden="1" w:unhideWhenUsed="1"/>
+    <w:lsdException w:name="Table Columns 1" w:semiHidden="1" w:unhideWhenUsed="1"/>
+    <w:lsdException w:name="Table Columns 2" w:semiHidden="1" w:unhideWhenUsed="1"/>
+    <w:lsdException w:name="Table Columns 3" w:semiHidden="1" w:unhideWhenUsed="1"/>
+    <w:lsdException w:name="Table Columns 4" w:semiHidden="1" w:unhideWhenUsed="1"/>
+    <w:lsdException w:name="Table Columns 5" w:semiHidden="1" w:unhideWhenUsed="1"/>
+    <w:lsdException w:name="Table Grid 1" w:semiHidden="1" w:unhideWhenUsed="1"/>
+    <w:lsdException w:name="Table Grid 2" w:semiHidden="1" w:unhideWhenUsed="1"/>
+    <w:lsdException w:name="Table Grid 3" w:semiHidden="1" w:unhideWhenUsed="1"/>
+    <w:lsdException w:name="Table Grid 4" w:semiHidden="1" w:unhideWhenUsed="1"/>
+    <w:lsdException w:name="Table Grid 5" w:semiHidden="1" w:unhideWhenUsed="1"/>
+    <w:lsdException w:name="Table Grid 6" w:semiHidden="1" w:unhideWhenUsed="1"/>
+    <w:lsdException w:name="Table Grid 7" w:semiHidden="1" w:unhideWhenUsed="1"/>
+    <w:lsdException w:name="Table Grid 8" w:semiHidden="1" w:unhideWhenUsed="1"/>
+    <w:lsdException w:name="Table List 1" w:semiHidden="1" w:unhideWhenUsed="1"/>
+    <w:lsdException w:name="Table List 2" w:semiHidden="1" w:unhideWhenUsed="1"/>
+    <w:lsdException w:name="Table List 3" w:semiHidden="1" w:unhideWhenUsed="1"/>
+    <w:lsdException w:name="Table List 4" w:semiHidden="1" w:unhideWhenUsed="1"/>
+    <w:lsdException w:name="Table List 5" w:semiHidden="1" w:unhideWhenUsed="1"/>
+    <w:lsdException w:name="Table List 6" w:semiHidden="1" w:unhideWhenUsed="1"/>
+    <w:lsdException w:name="Table List 7" w:semiHidden="1" w:unhideWhenUsed="1"/>
+    <w:lsdException w:name="Table List 8" w:semiHidden="1" w:unhideWhenUsed="1"/>
+    <w:lsdException w:name="Table 3D effects 1" w:semiHidden="1" w:unhideWhenUsed="1"/>
+    <w:lsdException w:name="Table 3D effects 2" w:semiHidden="1" w:unhideWhenUsed="1"/>
+    <w:lsdException w:name="Table 3D effects 3" w:semiHidden="1" w:unhideWhenUsed="1"/>
+    <w:lsdException w:name="Table Contemporary" w:semiHidden="1" w:unhideWhenUsed="1"/>
+    <w:lsdException w:name="Table Elegant" w:semiHidden="1" w:unhideWhenUsed="1"/>
+    <w:lsdException w:name="Table Professional" w:semiHidden="1" w:unhideWhenUsed="1"/>
+    <w:lsdException w:name="Table Subtle 1" w:semiHidden="1" w:unhideWhenUsed="1"/>
+    <w:lsdException w:name="Table Subtle 2" w:semiHidden="1" w:unhideWhenUsed="1"/>
+    <w:lsdException w:name="Table Web 1" w:semiHidden="1" w:unhideWhenUsed="1"/>
+    <w:lsdException w:name="Table Web 2" w:semiHidden="1" w:unhideWhenUsed="1"/>
+    <w:lsdException w:name="Table Web 3" w:semiHidden="1" w:unhideWhenUsed="1"/>
+    <w:lsdException w:name="Table Theme" w:semiHidden="1" w:unhideWhenUsed="1"/>
+    <w:lsdException w:name="Light Shading"/>
+    <w:lsdException w:name="Light List"/>
+    <w:lsdException w:name="Light Grid"/>
+    <w:lsdException w:name="Medium Shading 1"/>
+    <w:lsdException w:name="Medium Shading 2"/>
+    <w:lsdException w:name="Medium List 1"/>
+    <w:lsdException w:name="Medium List 2"/>
+    <w:lsdException w:name="Medium Grid 1"/>
+    <w:lsdException w:name="Medium Grid 2"/>
+    <w:lsdException w:name="Medium Grid 3"/>
+    <w:lsdException w:name="Dark List"/>
+    <w:lsdException w:name="Colorful Shading"/>
+    <w:lsdException w:name="Colorful List"/>
+    <w:lsdException w:name="Colorful Grid"/>
+    <w:lsdException w:name="Light Shading Accent 1"/>
+    <w:lsdException w:name="Light List Accent 1"/>
+    <w:lsdException w:name="Light Grid Accent 1"/>
+    <w:lsdException w:name="Medium Shading 1 Accent 1"/>
+    <w:lsdException w:name="Medium Shading 2 Accent 1"/>
+    <w:lsdException w:name="Medium List 1 Accent 1"/>
+    <w:lsdException w:name="Medium List 2 Accent 1"/>
+    <w:lsdException w:name="Medium Grid 1 Accent 1"/>
+    <w:lsdException w:name="Medium Grid 2 Accent 1"/>
+    <w:lsdException w:name="Medium Grid 3 Accent 1"/>
+    <w:lsdException w:name="Dark List Accent 1"/>
+    <w:lsdException w:name="Colorful Shading Accent 1"/>
+    <w:lsdException w:name="Colorful List Accent 1"/>
+    <w:lsdException w:name="Colorful Grid Accent 1"/>
+    <w:lsdException w:name="Light Shading Accent 2"/>
+    <w:lsdException w:name="Light List Accent 2"/>
+    <w:lsdException w:name="Light Grid Accent 2"/>
+    <w:lsdException w:name="Medium Shading 1 Accent 2"/>
+    <w:lsdException w:name="Medium Shading 2 Accent 2"/>
+    <w:lsdException w:name="Medium List 1 Accent 2"/>
+    <w:lsdException w:name="Medium List 2 Accent 2"/>
+    <w:lsdException w:name="Medium Grid 1 Accent 2"/>
+    <w:lsdException w:name="Medium Grid 2 Accent 2"/>
+    <w:lsdException w:name="Medium Grid 3 Accent 2"/>
+    <w:lsdException w:name="Dark List Accent 2"/>
+    <w:lsdException w:name="Colorful Shading Accent 2"/>
+    <w:lsdException w:name="Colorful List Accent 2"/>
+    <w:lsdException w:name="Colorful Grid Accent 2"/>
+    <w:lsdException w:name="Light Shading Accent 3"/>
+    <w:lsdException w:name="Light List Accent 3"/>
+    <w:lsdException w:name="Light Grid Accent 3"/>
+    <w:lsdException w:name="Medium Shading 1 Accent 3"/>
+    <w:lsdException w:name="Medium Shading 2 Accent 3"/>
+    <w:lsdException w:name="Medium List 1 Accent 3"/>
+    <w:lsdException w:name="Medium List 2 Accent 3"/>
+    <w:lsdException w:name="Medium Grid 1 Accent 3"/>
+    <w:lsdException w:name="Medium Grid 2 Accent 3"/>
+    <w:lsdException w:name="Medium Grid 3 Accent 3"/>
+    <w:lsdException w:name="Dark List Accent 3"/>
+    <w:lsdException w:name="Colorful Shading Accent 3"/>
+    <w:lsdException w:name="Colorful List Accent 3"/>
+    <w:lsdException w:name="Colorful Grid Accent 3"/>
+    <w:lsdException w:name="Light Shading Accent 4"/>
+    <w:lsdException w:name="Light List Accent 4"/>
+    <w:lsdException w:name="Light Grid Accent 4"/>
+    <w:lsdException w:name="Medium Shading 1 Accent 4"/>
+    <w:lsdException w:name="Medium Shading 2 Accent 4"/>
+    <w:lsdException w:name="Medium List 1 Accent 4"/>
+    <w:lsdException w:name="Medium List 2 Accent 4"/>
+    <w:lsdException w:name="Medium Grid 1 Accent 4"/>
+    <w:lsdException w:name="Medium Grid 2 Accent 4"/>
+    <w:lsdException w:name="Medium Grid 3 Accent 4"/>
+    <w:lsdException w:name="Dark List Accent 4"/>
+    <w:lsdException w:name="Colorful Shading Accent 4"/>
+    <w:lsdException w:name="Colorful List Accent 4"/>
+    <w:lsdException w:name="Colorful Grid Accent 4"/>
+    <w:lsdException w:name="Light Shading Accent 5"/>
+    <w:lsdException w:name="Light List Accent 5"/>
+    <w:lsdException w:name="Light Grid Accent 5"/>
+    <w:lsdException w:name="Medium Shading 1 Accent 5"/>
+    <w:lsdException w:name="Medium Shading 2 Accent 5"/>
+    <w:lsdException w:name="Medium List 1 Accent 5"/>
+    <w:lsdException w:name="Medium List 2 Accent 5"/>
+    <w:lsdException w:name="Medium Grid 1 Accent 5"/>
+    <w:lsdException w:name="Medium Grid 2 Accent 5"/>
+    <w:lsdException w:name="Medium Grid 3 Accent 5"/>
+    <w:lsdException w:name="Dark List Accent 5"/>
+    <w:lsdException w:name="Colorful Shading Accent 5"/>
+    <w:lsdException w:name="Colorful List Accent 5"/>
+    <w:lsdException w:name="Colorful Grid Accent 5"/>
+    <w:lsdException w:name="Light Shading Accent 6"/>
+    <w:lsdException w:name="Light List Accent 6"/>
+    <w:lsdException w:name="Light Grid Accent 6"/>
+    <w:lsdException w:name="Medium Shading 1 Accent 6"/>
+    <w:lsdException w:name="Medium Shading 2 Accent 6"/>
+    <w:lsdException w:name="Medium List 1 Accent 6"/>
+    <w:lsdException w:name="Medium List 2 Accent 6"/>
+    <w:lsdException w:name="Medium Grid 1 Accent 6"/>
+    <w:lsdException w:name="Medium Grid 2 Accent 6"/>
+    <w:lsdException w:name="Medium Grid 3 Accent 6"/>
+    <w:lsdException w:name="Dark List Accent 6"/>
+    <w:lsdException w:name="Colorful Shading Accent 6"/>
+    <w:lsdException w:name="Colorful List Accent 6"/>
+    <w:lsdException w:name="Colorful Grid Accent 6"/>
+    <w:lsdException w:name="Grid Table 4" w:uiPriority="49"/>
+    <w:lsdException w:name="Grid Table 5 Dark" w:uiPriority="50"/>
+    <w:lsdException w:name="Grid Table 6 Colorful" w:uiPriority="51"/>
+    <w:lsdException w:name="Grid Table 7 Colorful" w:uiPriority="52"/>
+    <w:lsdException w:name="Grid Table 1 Light Accent 1" w:uiPriority="46"/>
+    <w:lsdException w:name="Grid Table 2 Accent 1" w:uiPriority="47"/>
+    <w:lsdException w:name="Grid Table 3 Accent 1" w:uiPriority="48"/>
+    <w:lsdException w:name="Grid Table 4 Accent 1" w:uiPriority="49"/>
+    <w:lsdException w:name="Grid Table 5 Dark Accent 1" w:uiPriority="50"/>
+    <w:lsdException w:name="Grid Table 6 Colorful Accent 1" w:uiPriority="51"/>
+    <w:lsdException w:name="Grid Table 7 Colorful Accent 1" w:uiPriority="52"/>
+    <w:lsdException w:name="Grid Table 1 Light Accent 2" w:uiPriority="46"/>
+    <w:lsdException w:name="Grid Table 2 Accent 2" w:uiPriority="47"/>
+    <w:lsdException w:name="Grid Table 3 Accent 2" w:uiPriority="48"/>
+    <w:lsdException w:name="Grid Table 4 Accent 2" w:uiPriority="49"/>
+    <w:lsdException w:name="Grid Table 5 Dark Accent 2" w:uiPriority="50"/>
+    <w:lsdException w:name="Grid Table 6 Colorful Accent 2" w:uiPriority="51"/>
+    <w:lsdException w:name="Grid Table 7 Colorful Accent 2" w:uiPriority="52"/>
+    <w:lsdException w:name="Grid Table 1 Light Accent 3" w:uiPriority="46"/>
+    <w:lsdException w:name="Grid Table 2 Accent 3" w:uiPriority="47"/>
+    <w:lsdException w:name="Grid Table 3 Accent 3" w:uiPriority="48"/>
+    <w:lsdException w:name="Grid Table 4 Accent 3" w:uiPriority="49"/>
+    <w:lsdException w:name="Grid Table 5 Dark Accent 3" w:uiPriority="50"/>
+    <w:lsdException w:name="Grid Table 6 Colorful Accent 3" w:uiPriority="51"/>
+    <w:lsdException w:name="Grid Table 7 Colorful Accent 3" w:uiPriority="52"/>
+    <w:lsdException w:name="Grid Table 1 Light Accent 4" w:uiPriority="46"/>
+    <w:lsdException w:name="Grid Table 2 Accent 4" w:uiPriority="47"/>
+    <w:lsdException w:name="Grid Table 3 Accent 4" w:uiPriority="48"/>
+    <w:lsdException w:name="Grid Table 4 Accent 4" w:uiPriority="49"/>
+    <w:lsdException w:name="Grid Table 5 Dark Accent 4" w:uiPriority="50"/>
+    <w:lsdException w:name="Grid Table 6 Colorful Accent 4" w:uiPriority="51"/>
+    <w:lsdException w:name="Grid Table 7 Colorful Accent 4" w:uiPriority="52"/>
+    <w:lsdException w:name="Grid Table 1 Light Accent 5" w:uiPriority="46"/>
+    <w:lsdException w:name="Grid Table 2 Accent 5" w:uiPriority="47"/>
+    <w:lsdException w:name="Grid Table 3 Accent 5" w:uiPriority="48"/>
+    <w:lsdException w:name="Grid Table 4 Accent 5" w:uiPriority="49"/>
+    <w:lsdException w:name="Grid Table 5 Dark Accent 5" w:uiPriority="50"/>
+    <w:lsdException w:name="Grid Table 6 Colorful Accent 5" w:uiPriority="51"/>
+    <w:lsdException w:name="Grid Table 7 Colorful Accent 5" w:uiPriority="52"/>
+    <w:lsdException w:name="Grid Table 1 Light Accent 6" w:uiPriority="46"/>
+    <w:lsdException w:name="Grid Table 2 Accent 6" w:uiPriority="47"/>
+    <w:lsdException w:name="Grid Table 3 Accent 6" w:uiPriority="48"/>
+    <w:lsdException w:name="Grid Table 4 Accent 6" w:uiPriority="49"/>
+    <w:lsdException w:name="Grid Table 5 Dark Accent 6" w:uiPriority="50"/>
+    <w:lsdException w:name="Grid Table 6 Colorful Accent 6" w:uiPriority="51"/>
+    <w:lsdException w:name="Grid Table 7 Colorful Accent 6" w:uiPriority="52"/>
+    <w:lsdException w:name="List Table 1 Light" w:uiPriority="46"/>
+    <w:lsdException w:name="List Table 2" w:uiPriority="47"/>
+    <w:lsdException w:name="List Table 3" w:uiPriority="48"/>
+    <w:lsdException w:name="List Table 4" w:uiPriority="49"/>
+    <w:lsdException w:name="List Table 5 Dark" w:uiPriority="50"/>
+    <w:lsdException w:name="List Table 6 Colorful" w:uiPriority="51"/>
+    <w:lsdException w:name="List Table 7 Colorful" w:uiPriority="52"/>
+    <w:lsdException w:name="List Table 1 Light Accent 1" w:uiPriority="46"/>
+    <w:lsdException w:name="List Table 2 Accent 1" w:uiPriority="47"/>
+    <w:lsdException w:name="List Table 3 Accent 1" w:uiPriority="48"/>
+    <w:lsdException w:name="List Table 4 Accent 1" w:uiPriority="49"/>
+    <w:lsdException w:name="List Table 5 Dark Accent 1" w:uiPriority="50"/>
+    <w:lsdException w:name="List Table 6 Colorful Accent 1" w:uiPriority="51"/>
+    <w:lsdException w:name="List Table 7 Colorful Accent 1" w:uiPriority="52"/>
+    <w:lsdException w:name="List Table 1 Light Accent 2" w:uiPriority="46"/>
+    <w:lsdException w:name="List Table 2 Accent 2" w:uiPriority="47"/>
+    <w:lsdException w:name="List Table 3 Accent 2" w:uiPriority="48"/>
+    <w:lsdException w:name="List Table 4 Accent 2" w:uiPriority="49"/>
+    <w:lsdException w:name="List Table 5 Dark Accent 2" w:uiPriority="50"/>
+    <w:lsdException w:name="List Table 6 Colorful Accent 2" w:uiPriority="51"/>
+    <w:lsdException w:name="List Table 7 Colorful Accent 2" w:uiPriority="52"/>
+    <w:lsdException w:name="List Table 1 Light Accent 3" w:uiPriority="46"/>
+    <w:lsdException w:name="List Table 2 Accent 3" w:uiPriority="47"/>
+    <w:lsdException w:name="List Table 3 Accent 3" w:uiPriority="48"/>
+    <w:lsdException w:name="List Table 4 Accent 3" w:uiPriority="49"/>
+    <w:lsdException w:name="List Table 5 Dark Accent 3" w:uiPriority="50"/>
+    <w:lsdException w:name="List Table 6 Colorful Accent 3" w:uiPriority="51"/>
+    <w:lsdException w:name="List Table 7 Colorful Accent 3" w:uiPriority="52"/>
+    <w:lsdException w:name="List Table 1 Light Accent 4" w:uiPriority="46"/>
+    <w:lsdException w:name="List Table 2 Accent 4" w:uiPriority="47"/>
+    <w:lsdException w:name="List Table 3 Accent 4" w:uiPriority="48"/>
+    <w:lsdException w:name="List Table 4 Accent 4" w:uiPriority="49"/>
+    <w:lsdException w:name="List Table 5 Dark Accent 4" w:uiPriority="50"/>
+    <w:lsdException w:name="List Table 6 Colorful Accent 4" w:uiPriority="51"/>
+    <w:lsdException w:name="List Table 7 Colorful Accent 4" w:uiPriority="52"/>
+    <w:lsdException w:name="List Table 1 Light Accent 5" w:uiPriority="46"/>
+    <w:lsdException w:name="List Table 2 Accent 5" w:uiPriority="47"/>
+    <w:lsdException w:name="List Table 3 Accent 5" w:uiPriority="48"/>
+    <w:lsdException w:name="List Table 4 Accent 5" w:uiPriority="49"/>
+    <w:lsdException w:name="List Table 5 Dark Accent 5" w:uiPriority="50"/>
+    <w:lsdException w:name="List Table 6 Colorful Accent 5" w:uiPriority="51"/>
+    <w:lsdException w:name="List Table 7 Colorful Accent 5" w:uiPriority="52"/>
+    <w:lsdException w:name="List Table 1 Light Accent 6" w:uiPriority="46"/>
+    <w:lsdException w:name="List Table 2 Accent 6" w:uiPriority="47"/>
+    <w:lsdException w:name="List Table 3 Accent 6" w:uiPriority="48"/>
+    <w:lsdException w:name="List Table 4 Accent 6" w:uiPriority="49"/>
+    <w:lsdException w:name="List Table 5 Dark Accent 6" w:uiPriority="50"/>
+    <w:lsdException w:name="List Table 6 Colorful Accent 6" w:uiPriority="51"/>
+    <w:lsdException w:name="List Table 7 Colorful Accent 6" w:uiPriority="52"/>
+    <w:lsdException w:name="Mention" w:semiHidden="1" w:uiPriority="99" w:unhideWhenUsed="1"/>
+    <w:lsdException w:name="Smart Hyperlink" w:semiHidden="1" w:uiPriority="99" w:unhideWhenUsed="1"/>
+    <w:lsdException w:name="Hashtag" w:semiHidden="1" w:uiPriority="99" w:unhideWhenUsed="1"/>
+    <w:lsdException w:name="Unresolved Mention" w:semiHidden="1" w:uiPriority="99" w:unhideWhenUsed="1"/>
+    <w:lsdException w:name="Smart Link" w:semiHidden="1" w:uiPriority="99" w:unhideWhenUsed="1"/>
+  </w:latentStyles>
+  <w:style w:type="paragraph" w:default="1" w:styleId="Normal">
     <w:name w:val="Normal"/>
     <w:qFormat/>
   </w:style>
-  <w:style w:styleId="BodyText" w:type="paragraph">
-    <w:name w:val="Body Text"/>
-    <w:basedOn w:val="Normal"/>
-    <w:link w:val="BodyTextChar"/>
-    <w:qFormat/>
-    <w:pPr>
-      <w:spacing w:after="180" w:before="180"/>
-    </w:pPr>
-  </w:style>
-  <w:style w:customStyle="1" w:styleId="FirstParagraph" w:type="paragraph">
-    <w:name w:val="First Paragraph"/>
-    <w:basedOn w:val="BodyText"/>
-    <w:next w:val="BodyText"/>
-    <w:qFormat/>
-  </w:style>
-  <w:style w:customStyle="1" w:styleId="Compact" w:type="paragraph">
-    <w:name w:val="Compact"/>
-    <w:basedOn w:val="BodyText"/>
-    <w:qFormat/>
-    <w:pPr>
-      <w:spacing w:after="36" w:before="36"/>
-    </w:pPr>
-  </w:style>
-  <w:style w:styleId="Title" w:type="paragraph">
-    <w:name w:val="Title"/>
-    <w:basedOn w:val="Normal"/>
-    <w:next w:val="BodyText"/>
-    <w:link w:val="TitleChar"/>
-    <w:uiPriority w:val="10"/>
-    <w:qFormat/>
-    <w:rsid w:val="00A10FD9"/>
-    <w:pPr>
-      <w:spacing w:after="80" w:line="240" w:lineRule="auto"/>
-      <w:contextualSpacing/>
-      <w:jc w:val="center"/>
-    </w:pPr>
-    <w:rPr>
-      <w:rFonts w:asciiTheme="majorHAnsi" w:cstheme="majorBidi" w:eastAsiaTheme="majorEastAsia" w:hAnsiTheme="majorHAnsi"/>
-      <w:sz w:val="56"/>
-      <w:szCs w:val="56"/>
-    </w:rPr>
-  </w:style>
-  <w:style w:customStyle="1" w:styleId="TitleChar" w:type="character">
-    <w:name w:val="Title Char"/>
-    <w:basedOn w:val="DefaultParagraphFont"/>
-    <w:link w:val="Title"/>
-    <w:uiPriority w:val="10"/>
-    <w:rsid w:val="00A10FD9"/>
-    <w:rPr>
-      <w:rFonts w:asciiTheme="majorHAnsi" w:cstheme="majorBidi" w:eastAsiaTheme="majorEastAsia" w:hAnsiTheme="majorHAnsi"/>
-      <w:sz w:val="56"/>
-      <w:szCs w:val="56"/>
-    </w:rPr>
-  </w:style>
-  <w:style w:styleId="Subtitle" w:type="paragraph">
-    <w:name w:val="Subtitle"/>
-    <w:basedOn w:val="Title"/>
-    <w:next w:val="BodyText"/>
-    <w:link w:val="SubtitleChar"/>
-    <w:uiPriority w:val="11"/>
-    <w:qFormat/>
-    <w:rsid w:val="00A10FD9"/>
-    <w:pPr>
-      <w:numPr>
-        <w:ilvl w:val="1"/>
-      </w:numPr>
-    </w:pPr>
-    <w:rPr>
-      <w:rFonts w:cstheme="majorBidi" w:eastAsiaTheme="majorEastAsia"/>
-      <w:spacing w:val="15"/>
-      <w:sz w:val="28"/>
-      <w:szCs w:val="28"/>
-    </w:rPr>
-  </w:style>
-  <w:style w:customStyle="1" w:styleId="SubtitleChar" w:type="character">
-    <w:name w:val="Subtitle Char"/>
-    <w:basedOn w:val="DefaultParagraphFont"/>
-    <w:link w:val="Subtitle"/>
-    <w:uiPriority w:val="11"/>
-    <w:rsid w:val="00A10FD9"/>
-    <w:rPr>
-      <w:rFonts w:cstheme="majorBidi" w:eastAsiaTheme="majorEastAsia"/>
-      <w:color w:themeColor="text1" w:themeTint="A6" w:val="595959"/>
-      <w:spacing w:val="15"/>
-      <w:sz w:val="28"/>
-      <w:szCs w:val="28"/>
-    </w:rPr>
-  </w:style>
-  <w:style w:customStyle="1" w:styleId="Author" w:type="paragraph">
-    <w:name w:val="Author"/>
-    <w:basedOn w:val="Title"/>
-    <w:next w:val="BodyText"/>
-    <w:qFormat/>
-    <w:pPr>
-      <w:keepNext/>
-      <w:keepLines/>
-    </w:pPr>
-    <w:rPr>
-      <w:sz w:val="24"/>
-      <w:szCs w:val="24"/>
-    </w:rPr>
-  </w:style>
-  <w:style w:styleId="Date" w:type="paragraph">
-    <w:name w:val="Date"/>
-    <w:basedOn w:val="Title"/>
-    <w:next w:val="BodyText"/>
-    <w:qFormat/>
-    <w:pPr>
-      <w:keepNext/>
-      <w:keepLines/>
-    </w:pPr>
-    <w:rPr>
-      <w:sz w:val="24"/>
-      <w:szCs w:val="24"/>
-    </w:rPr>
-  </w:style>
-  <w:style w:customStyle="1" w:styleId="AbstractTitle" w:type="paragraph">
-    <w:name w:val="Abstract Title"/>
-    <w:basedOn w:val="Normal"/>
-    <w:next w:val="Abstract"/>
-    <w:qFormat/>
-    <w:pPr>
-      <w:keepNext/>
-      <w:keepLines/>
-      <w:spacing w:after="0" w:before="300"/>
-      <w:jc w:val="center"/>
-    </w:pPr>
-    <w:rPr>
-      <w:b/>
-      <w:sz w:val="20"/>
-      <w:szCs w:val="20"/>
-    </w:rPr>
-  </w:style>
-  <w:style w:customStyle="1" w:styleId="Abstract" w:type="paragraph">
-    <w:name w:val="Abstract"/>
-    <w:basedOn w:val="Normal"/>
-    <w:next w:val="BodyText"/>
-    <w:qFormat/>
-    <w:pPr>
-      <w:keepNext/>
-      <w:keepLines/>
-      <w:spacing w:after="300" w:before="100"/>
-    </w:pPr>
-    <w:rPr>
-      <w:sz w:val="20"/>
-      <w:szCs w:val="20"/>
-    </w:rPr>
-  </w:style>
-  <w:style w:styleId="Bibliography" w:type="paragraph">
-    <w:name w:val="Bibliography"/>
-    <w:basedOn w:val="Normal"/>
-    <w:next w:val="Bibliography"/>
-    <w:qFormat/>
-    <w:pPr/>
-    <w:rPr/>
-  </w:style>
-  <w:style w:styleId="Heading1" w:type="paragraph">
+  <w:style w:type="paragraph" w:styleId="Heading1">
     <w:name w:val="heading 1"/>
     <w:basedOn w:val="Normal"/>
     <w:next w:val="BodyText"/>
@@ -1491,17 +1932,17 @@
     <w:pPr>
       <w:keepNext/>
       <w:keepLines/>
-      <w:spacing w:after="80" w:before="360"/>
+      <w:spacing w:before="360" w:after="80"/>
       <w:outlineLvl w:val="0"/>
     </w:pPr>
     <w:rPr>
-      <w:rFonts w:asciiTheme="majorHAnsi" w:cstheme="majorBidi" w:eastAsiaTheme="majorEastAsia" w:hAnsiTheme="majorHAnsi"/>
-      <w:color w:themeColor="accent1" w:themeShade="BF" w:val="0F4761"/>
+      <w:rFonts w:asciiTheme="majorHAnsi" w:eastAsiaTheme="majorEastAsia" w:hAnsiTheme="majorHAnsi" w:cstheme="majorBidi"/>
+      <w:color w:val="0F4761" w:themeColor="accent1" w:themeShade="BF"/>
       <w:sz w:val="40"/>
       <w:szCs w:val="40"/>
     </w:rPr>
   </w:style>
-  <w:style w:styleId="Heading2" w:type="paragraph">
+  <w:style w:type="paragraph" w:styleId="Heading2">
     <w:name w:val="heading 2"/>
     <w:basedOn w:val="Normal"/>
     <w:next w:val="BodyText"/>
@@ -1514,17 +1955,17 @@
     <w:pPr>
       <w:keepNext/>
       <w:keepLines/>
-      <w:spacing w:after="80" w:before="160"/>
+      <w:spacing w:before="160" w:after="80"/>
       <w:outlineLvl w:val="1"/>
     </w:pPr>
     <w:rPr>
-      <w:rFonts w:asciiTheme="majorHAnsi" w:cstheme="majorBidi" w:eastAsiaTheme="majorEastAsia" w:hAnsiTheme="majorHAnsi"/>
-      <w:color w:themeColor="accent1" w:themeShade="BF" w:val="0F4761"/>
+      <w:rFonts w:asciiTheme="majorHAnsi" w:eastAsiaTheme="majorEastAsia" w:hAnsiTheme="majorHAnsi" w:cstheme="majorBidi"/>
+      <w:color w:val="0F4761" w:themeColor="accent1" w:themeShade="BF"/>
       <w:sz w:val="32"/>
       <w:szCs w:val="32"/>
     </w:rPr>
   </w:style>
-  <w:style w:styleId="Heading3" w:type="paragraph">
+  <w:style w:type="paragraph" w:styleId="Heading3">
     <w:name w:val="heading 3"/>
     <w:basedOn w:val="Normal"/>
     <w:next w:val="BodyText"/>
@@ -1537,17 +1978,17 @@
     <w:pPr>
       <w:keepNext/>
       <w:keepLines/>
-      <w:spacing w:after="80" w:before="160"/>
+      <w:spacing w:before="160" w:after="80"/>
       <w:outlineLvl w:val="2"/>
     </w:pPr>
     <w:rPr>
-      <w:rFonts w:cstheme="majorBidi" w:eastAsiaTheme="majorEastAsia"/>
-      <w:color w:themeColor="accent1" w:themeShade="BF" w:val="0F4761"/>
+      <w:rFonts w:eastAsiaTheme="majorEastAsia" w:cstheme="majorBidi"/>
+      <w:color w:val="0F4761" w:themeColor="accent1" w:themeShade="BF"/>
       <w:sz w:val="28"/>
       <w:szCs w:val="28"/>
     </w:rPr>
   </w:style>
-  <w:style w:styleId="Heading4" w:type="paragraph">
+  <w:style w:type="paragraph" w:styleId="Heading4">
     <w:name w:val="heading 4"/>
     <w:basedOn w:val="Normal"/>
     <w:next w:val="BodyText"/>
@@ -1560,17 +2001,17 @@
     <w:pPr>
       <w:keepNext/>
       <w:keepLines/>
-      <w:spacing w:after="40" w:before="80"/>
+      <w:spacing w:before="80" w:after="40"/>
       <w:outlineLvl w:val="3"/>
     </w:pPr>
     <w:rPr>
-      <w:rFonts w:cstheme="majorBidi" w:eastAsiaTheme="majorEastAsia"/>
+      <w:rFonts w:eastAsiaTheme="majorEastAsia" w:cstheme="majorBidi"/>
       <w:i/>
       <w:iCs/>
-      <w:color w:themeColor="accent1" w:themeShade="BF" w:val="0F4761"/>
-    </w:rPr>
-  </w:style>
-  <w:style w:styleId="Heading5" w:type="paragraph">
+      <w:color w:val="0F4761" w:themeColor="accent1" w:themeShade="BF"/>
+    </w:rPr>
+  </w:style>
+  <w:style w:type="paragraph" w:styleId="Heading5">
     <w:name w:val="heading 5"/>
     <w:basedOn w:val="Normal"/>
     <w:next w:val="BodyText"/>
@@ -1583,15 +2024,15 @@
     <w:pPr>
       <w:keepNext/>
       <w:keepLines/>
-      <w:spacing w:after="40" w:before="80"/>
+      <w:spacing w:before="80" w:after="40"/>
       <w:outlineLvl w:val="4"/>
     </w:pPr>
     <w:rPr>
-      <w:rFonts w:cstheme="majorBidi" w:eastAsiaTheme="majorEastAsia"/>
-      <w:color w:themeColor="accent1" w:themeShade="BF" w:val="0F4761"/>
-    </w:rPr>
-  </w:style>
-  <w:style w:styleId="Heading6" w:type="paragraph">
+      <w:rFonts w:eastAsiaTheme="majorEastAsia" w:cstheme="majorBidi"/>
+      <w:color w:val="0F4761" w:themeColor="accent1" w:themeShade="BF"/>
+    </w:rPr>
+  </w:style>
+  <w:style w:type="paragraph" w:styleId="Heading6">
     <w:name w:val="heading 6"/>
     <w:basedOn w:val="Normal"/>
     <w:next w:val="BodyText"/>
@@ -1604,17 +2045,17 @@
     <w:pPr>
       <w:keepNext/>
       <w:keepLines/>
-      <w:spacing w:after="0" w:before="40"/>
+      <w:spacing w:before="40" w:after="0"/>
       <w:outlineLvl w:val="5"/>
     </w:pPr>
     <w:rPr>
-      <w:rFonts w:cstheme="majorBidi" w:eastAsiaTheme="majorEastAsia"/>
+      <w:rFonts w:eastAsiaTheme="majorEastAsia" w:cstheme="majorBidi"/>
       <w:i/>
       <w:iCs/>
-      <w:color w:themeColor="text1" w:themeTint="A6" w:val="595959"/>
-    </w:rPr>
-  </w:style>
-  <w:style w:styleId="Heading7" w:type="paragraph">
+      <w:color w:val="595959" w:themeColor="text1" w:themeTint="A6"/>
+    </w:rPr>
+  </w:style>
+  <w:style w:type="paragraph" w:styleId="Heading7">
     <w:name w:val="heading 7"/>
     <w:basedOn w:val="Normal"/>
     <w:next w:val="BodyText"/>
@@ -1627,15 +2068,15 @@
     <w:pPr>
       <w:keepNext/>
       <w:keepLines/>
-      <w:spacing w:after="0" w:before="40"/>
+      <w:spacing w:before="40" w:after="0"/>
       <w:outlineLvl w:val="6"/>
     </w:pPr>
     <w:rPr>
-      <w:rFonts w:cstheme="majorBidi" w:eastAsiaTheme="majorEastAsia"/>
-      <w:color w:themeColor="text1" w:themeTint="A6" w:val="595959"/>
-    </w:rPr>
-  </w:style>
-  <w:style w:styleId="Heading8" w:type="paragraph">
+      <w:rFonts w:eastAsiaTheme="majorEastAsia" w:cstheme="majorBidi"/>
+      <w:color w:val="595959" w:themeColor="text1" w:themeTint="A6"/>
+    </w:rPr>
+  </w:style>
+  <w:style w:type="paragraph" w:styleId="Heading8">
     <w:name w:val="heading 8"/>
     <w:basedOn w:val="Normal"/>
     <w:next w:val="BodyText"/>
@@ -1652,13 +2093,13 @@
       <w:outlineLvl w:val="7"/>
     </w:pPr>
     <w:rPr>
-      <w:rFonts w:cstheme="majorBidi" w:eastAsiaTheme="majorEastAsia"/>
+      <w:rFonts w:eastAsiaTheme="majorEastAsia" w:cstheme="majorBidi"/>
       <w:i/>
       <w:iCs/>
-      <w:color w:themeColor="text1" w:themeTint="D8" w:val="272727"/>
-    </w:rPr>
-  </w:style>
-  <w:style w:styleId="Heading9" w:type="paragraph">
+      <w:color w:val="272727" w:themeColor="text1" w:themeTint="D8"/>
+    </w:rPr>
+  </w:style>
+  <w:style w:type="paragraph" w:styleId="Heading9">
     <w:name w:val="heading 9"/>
     <w:basedOn w:val="Normal"/>
     <w:next w:val="BodyText"/>
@@ -1675,24 +2116,202 @@
       <w:outlineLvl w:val="8"/>
     </w:pPr>
     <w:rPr>
-      <w:rFonts w:cstheme="majorBidi" w:eastAsiaTheme="majorEastAsia"/>
-      <w:color w:themeColor="text1" w:themeTint="D8" w:val="272727"/>
-    </w:rPr>
-  </w:style>
-  <w:style w:customStyle="1" w:styleId="Heading1Char" w:type="character">
+      <w:rFonts w:eastAsiaTheme="majorEastAsia" w:cstheme="majorBidi"/>
+      <w:color w:val="272727" w:themeColor="text1" w:themeTint="D8"/>
+    </w:rPr>
+  </w:style>
+  <w:style w:type="character" w:default="1" w:styleId="DefaultParagraphFont">
+    <w:name w:val="Default Paragraph Font"/>
+    <w:uiPriority w:val="1"/>
+    <w:semiHidden/>
+    <w:unhideWhenUsed/>
+  </w:style>
+  <w:style w:type="table" w:default="1" w:styleId="TableNormal">
+    <w:name w:val="Normal Table"/>
+    <w:uiPriority w:val="99"/>
+    <w:semiHidden/>
+    <w:unhideWhenUsed/>
+    <w:tblPr>
+      <w:tblInd w:w="0" w:type="dxa"/>
+      <w:tblCellMar>
+        <w:top w:w="0" w:type="dxa"/>
+        <w:left w:w="108" w:type="dxa"/>
+        <w:bottom w:w="0" w:type="dxa"/>
+        <w:right w:w="108" w:type="dxa"/>
+      </w:tblCellMar>
+    </w:tblPr>
+  </w:style>
+  <w:style w:type="numbering" w:default="1" w:styleId="NoList">
+    <w:name w:val="No List"/>
+    <w:uiPriority w:val="99"/>
+    <w:semiHidden/>
+    <w:unhideWhenUsed/>
+  </w:style>
+  <w:style w:type="paragraph" w:styleId="BodyText">
+    <w:name w:val="Body Text"/>
+    <w:basedOn w:val="Normal"/>
+    <w:qFormat/>
+    <w:pPr>
+      <w:spacing w:before="180" w:after="180"/>
+    </w:pPr>
+  </w:style>
+  <w:style w:type="paragraph" w:customStyle="1" w:styleId="FirstParagraph">
+    <w:name w:val="First Paragraph"/>
+    <w:basedOn w:val="BodyText"/>
+    <w:next w:val="BodyText"/>
+    <w:qFormat/>
+  </w:style>
+  <w:style w:type="paragraph" w:customStyle="1" w:styleId="Compact">
+    <w:name w:val="Compact"/>
+    <w:basedOn w:val="BodyText"/>
+    <w:qFormat/>
+    <w:pPr>
+      <w:spacing w:before="36" w:after="36"/>
+    </w:pPr>
+  </w:style>
+  <w:style w:type="paragraph" w:styleId="Title">
+    <w:name w:val="Title"/>
+    <w:basedOn w:val="Normal"/>
+    <w:next w:val="BodyText"/>
+    <w:link w:val="TitleChar"/>
+    <w:uiPriority w:val="10"/>
+    <w:qFormat/>
+    <w:rsid w:val="00A10FD9"/>
+    <w:pPr>
+      <w:spacing w:after="80"/>
+      <w:contextualSpacing/>
+      <w:jc w:val="center"/>
+    </w:pPr>
+    <w:rPr>
+      <w:rFonts w:asciiTheme="majorHAnsi" w:eastAsiaTheme="majorEastAsia" w:hAnsiTheme="majorHAnsi" w:cstheme="majorBidi"/>
+      <w:sz w:val="56"/>
+      <w:szCs w:val="56"/>
+    </w:rPr>
+  </w:style>
+  <w:style w:type="character" w:customStyle="1" w:styleId="TitleChar">
+    <w:name w:val="Title Char"/>
+    <w:basedOn w:val="DefaultParagraphFont"/>
+    <w:link w:val="Title"/>
+    <w:uiPriority w:val="10"/>
+    <w:rsid w:val="00A10FD9"/>
+    <w:rPr>
+      <w:rFonts w:asciiTheme="majorHAnsi" w:eastAsiaTheme="majorEastAsia" w:hAnsiTheme="majorHAnsi" w:cstheme="majorBidi"/>
+      <w:sz w:val="56"/>
+      <w:szCs w:val="56"/>
+    </w:rPr>
+  </w:style>
+  <w:style w:type="paragraph" w:styleId="Subtitle">
+    <w:name w:val="Subtitle"/>
+    <w:basedOn w:val="Title"/>
+    <w:next w:val="BodyText"/>
+    <w:link w:val="SubtitleChar"/>
+    <w:uiPriority w:val="11"/>
+    <w:qFormat/>
+    <w:rsid w:val="00A10FD9"/>
+    <w:pPr>
+      <w:numPr>
+        <w:ilvl w:val="1"/>
+      </w:numPr>
+    </w:pPr>
+    <w:rPr>
+      <w:spacing w:val="15"/>
+      <w:sz w:val="28"/>
+      <w:szCs w:val="28"/>
+    </w:rPr>
+  </w:style>
+  <w:style w:type="character" w:customStyle="1" w:styleId="SubtitleChar">
+    <w:name w:val="Subtitle Char"/>
+    <w:basedOn w:val="DefaultParagraphFont"/>
+    <w:link w:val="Subtitle"/>
+    <w:uiPriority w:val="11"/>
+    <w:rsid w:val="00A10FD9"/>
+    <w:rPr>
+      <w:rFonts w:eastAsiaTheme="majorEastAsia" w:cstheme="majorBidi"/>
+      <w:color w:val="595959" w:themeColor="text1" w:themeTint="A6"/>
+      <w:spacing w:val="15"/>
+      <w:sz w:val="28"/>
+      <w:szCs w:val="28"/>
+    </w:rPr>
+  </w:style>
+  <w:style w:type="paragraph" w:customStyle="1" w:styleId="Author">
+    <w:name w:val="Author"/>
+    <w:basedOn w:val="Title"/>
+    <w:next w:val="BodyText"/>
+    <w:qFormat/>
+    <w:pPr>
+      <w:keepNext/>
+      <w:keepLines/>
+    </w:pPr>
+    <w:rPr>
+      <w:sz w:val="24"/>
+      <w:szCs w:val="24"/>
+    </w:rPr>
+  </w:style>
+  <w:style w:type="paragraph" w:styleId="Date">
+    <w:name w:val="Date"/>
+    <w:basedOn w:val="Title"/>
+    <w:next w:val="BodyText"/>
+    <w:qFormat/>
+    <w:pPr>
+      <w:keepNext/>
+      <w:keepLines/>
+    </w:pPr>
+    <w:rPr>
+      <w:sz w:val="24"/>
+      <w:szCs w:val="24"/>
+    </w:rPr>
+  </w:style>
+  <w:style w:type="paragraph" w:customStyle="1" w:styleId="AbstractTitle">
+    <w:name w:val="Abstract Title"/>
+    <w:basedOn w:val="Normal"/>
+    <w:next w:val="Abstract"/>
+    <w:qFormat/>
+    <w:pPr>
+      <w:keepNext/>
+      <w:keepLines/>
+      <w:spacing w:before="300" w:after="0"/>
+      <w:jc w:val="center"/>
+    </w:pPr>
+    <w:rPr>
+      <w:b/>
+      <w:sz w:val="20"/>
+      <w:szCs w:val="20"/>
+    </w:rPr>
+  </w:style>
+  <w:style w:type="paragraph" w:customStyle="1" w:styleId="Abstract">
+    <w:name w:val="Abstract"/>
+    <w:basedOn w:val="Normal"/>
+    <w:next w:val="BodyText"/>
+    <w:qFormat/>
+    <w:pPr>
+      <w:keepNext/>
+      <w:keepLines/>
+      <w:spacing w:before="100" w:after="300"/>
+    </w:pPr>
+    <w:rPr>
+      <w:sz w:val="20"/>
+      <w:szCs w:val="20"/>
+    </w:rPr>
+  </w:style>
+  <w:style w:type="paragraph" w:styleId="Bibliography">
+    <w:name w:val="Bibliography"/>
+    <w:basedOn w:val="Normal"/>
+    <w:qFormat/>
+  </w:style>
+  <w:style w:type="character" w:customStyle="1" w:styleId="Heading1Char">
     <w:name w:val="Heading 1 Char"/>
     <w:basedOn w:val="DefaultParagraphFont"/>
     <w:link w:val="Heading1"/>
     <w:uiPriority w:val="9"/>
     <w:rsid w:val="00A10FD9"/>
     <w:rPr>
-      <w:rFonts w:asciiTheme="majorHAnsi" w:cstheme="majorBidi" w:eastAsiaTheme="majorEastAsia" w:hAnsiTheme="majorHAnsi"/>
-      <w:color w:themeColor="accent1" w:themeShade="BF" w:val="0F4761"/>
+      <w:rFonts w:asciiTheme="majorHAnsi" w:eastAsiaTheme="majorEastAsia" w:hAnsiTheme="majorHAnsi" w:cstheme="majorBidi"/>
+      <w:color w:val="0F4761" w:themeColor="accent1" w:themeShade="BF"/>
       <w:sz w:val="40"/>
       <w:szCs w:val="40"/>
     </w:rPr>
   </w:style>
-  <w:style w:customStyle="1" w:styleId="Heading2Char" w:type="character">
+  <w:style w:type="character" w:customStyle="1" w:styleId="Heading2Char">
     <w:name w:val="Heading 2 Char"/>
     <w:basedOn w:val="DefaultParagraphFont"/>
     <w:link w:val="Heading2"/>
@@ -1700,13 +2319,13 @@
     <w:semiHidden/>
     <w:rsid w:val="00A10FD9"/>
     <w:rPr>
-      <w:rFonts w:asciiTheme="majorHAnsi" w:cstheme="majorBidi" w:eastAsiaTheme="majorEastAsia" w:hAnsiTheme="majorHAnsi"/>
-      <w:color w:themeColor="accent1" w:themeShade="BF" w:val="0F4761"/>
+      <w:rFonts w:asciiTheme="majorHAnsi" w:eastAsiaTheme="majorEastAsia" w:hAnsiTheme="majorHAnsi" w:cstheme="majorBidi"/>
+      <w:color w:val="0F4761" w:themeColor="accent1" w:themeShade="BF"/>
       <w:sz w:val="32"/>
       <w:szCs w:val="32"/>
     </w:rPr>
   </w:style>
-  <w:style w:customStyle="1" w:styleId="Heading3Char" w:type="character">
+  <w:style w:type="character" w:customStyle="1" w:styleId="Heading3Char">
     <w:name w:val="Heading 3 Char"/>
     <w:basedOn w:val="DefaultParagraphFont"/>
     <w:link w:val="Heading3"/>
@@ -1714,13 +2333,13 @@
     <w:semiHidden/>
     <w:rsid w:val="00A10FD9"/>
     <w:rPr>
-      <w:rFonts w:cstheme="majorBidi" w:eastAsiaTheme="majorEastAsia"/>
-      <w:color w:themeColor="accent1" w:themeShade="BF" w:val="0F4761"/>
+      <w:rFonts w:eastAsiaTheme="majorEastAsia" w:cstheme="majorBidi"/>
+      <w:color w:val="0F4761" w:themeColor="accent1" w:themeShade="BF"/>
       <w:sz w:val="28"/>
       <w:szCs w:val="28"/>
     </w:rPr>
   </w:style>
-  <w:style w:customStyle="1" w:styleId="Heading4Char" w:type="character">
+  <w:style w:type="character" w:customStyle="1" w:styleId="Heading4Char">
     <w:name w:val="Heading 4 Char"/>
     <w:basedOn w:val="DefaultParagraphFont"/>
     <w:link w:val="Heading4"/>
@@ -1728,13 +2347,13 @@
     <w:semiHidden/>
     <w:rsid w:val="00A10FD9"/>
     <w:rPr>
-      <w:rFonts w:cstheme="majorBidi" w:eastAsiaTheme="majorEastAsia"/>
+      <w:rFonts w:eastAsiaTheme="majorEastAsia" w:cstheme="majorBidi"/>
       <w:i/>
       <w:iCs/>
-      <w:color w:themeColor="accent1" w:themeShade="BF" w:val="0F4761"/>
-    </w:rPr>
-  </w:style>
-  <w:style w:customStyle="1" w:styleId="Heading5Char" w:type="character">
+      <w:color w:val="0F4761" w:themeColor="accent1" w:themeShade="BF"/>
+    </w:rPr>
+  </w:style>
+  <w:style w:type="character" w:customStyle="1" w:styleId="Heading5Char">
     <w:name w:val="Heading 5 Char"/>
     <w:basedOn w:val="DefaultParagraphFont"/>
     <w:link w:val="Heading5"/>
@@ -1742,11 +2361,11 @@
     <w:semiHidden/>
     <w:rsid w:val="00A10FD9"/>
     <w:rPr>
-      <w:rFonts w:cstheme="majorBidi" w:eastAsiaTheme="majorEastAsia"/>
-      <w:color w:themeColor="accent1" w:themeShade="BF" w:val="0F4761"/>
-    </w:rPr>
-  </w:style>
-  <w:style w:customStyle="1" w:styleId="Heading6Char" w:type="character">
+      <w:rFonts w:eastAsiaTheme="majorEastAsia" w:cstheme="majorBidi"/>
+      <w:color w:val="0F4761" w:themeColor="accent1" w:themeShade="BF"/>
+    </w:rPr>
+  </w:style>
+  <w:style w:type="character" w:customStyle="1" w:styleId="Heading6Char">
     <w:name w:val="Heading 6 Char"/>
     <w:basedOn w:val="DefaultParagraphFont"/>
     <w:link w:val="Heading6"/>
@@ -1754,13 +2373,13 @@
     <w:semiHidden/>
     <w:rsid w:val="00A10FD9"/>
     <w:rPr>
-      <w:rFonts w:cstheme="majorBidi" w:eastAsiaTheme="majorEastAsia"/>
+      <w:rFonts w:eastAsiaTheme="majorEastAsia" w:cstheme="majorBidi"/>
       <w:i/>
       <w:iCs/>
-      <w:color w:themeColor="text1" w:themeTint="A6" w:val="595959"/>
-    </w:rPr>
-  </w:style>
-  <w:style w:customStyle="1" w:styleId="Heading7Char" w:type="character">
+      <w:color w:val="595959" w:themeColor="text1" w:themeTint="A6"/>
+    </w:rPr>
+  </w:style>
+  <w:style w:type="character" w:customStyle="1" w:styleId="Heading7Char">
     <w:name w:val="Heading 7 Char"/>
     <w:basedOn w:val="DefaultParagraphFont"/>
     <w:link w:val="Heading7"/>
@@ -1768,11 +2387,11 @@
     <w:semiHidden/>
     <w:rsid w:val="00A10FD9"/>
     <w:rPr>
-      <w:rFonts w:cstheme="majorBidi" w:eastAsiaTheme="majorEastAsia"/>
-      <w:color w:themeColor="text1" w:themeTint="A6" w:val="595959"/>
-    </w:rPr>
-  </w:style>
-  <w:style w:customStyle="1" w:styleId="Heading8Char" w:type="character">
+      <w:rFonts w:eastAsiaTheme="majorEastAsia" w:cstheme="majorBidi"/>
+      <w:color w:val="595959" w:themeColor="text1" w:themeTint="A6"/>
+    </w:rPr>
+  </w:style>
+  <w:style w:type="character" w:customStyle="1" w:styleId="Heading8Char">
     <w:name w:val="Heading 8 Char"/>
     <w:basedOn w:val="DefaultParagraphFont"/>
     <w:link w:val="Heading8"/>
@@ -1780,13 +2399,13 @@
     <w:semiHidden/>
     <w:rsid w:val="00A10FD9"/>
     <w:rPr>
-      <w:rFonts w:cstheme="majorBidi" w:eastAsiaTheme="majorEastAsia"/>
+      <w:rFonts w:eastAsiaTheme="majorEastAsia" w:cstheme="majorBidi"/>
       <w:i/>
       <w:iCs/>
-      <w:color w:themeColor="text1" w:themeTint="D8" w:val="272727"/>
-    </w:rPr>
-  </w:style>
-  <w:style w:customStyle="1" w:styleId="Heading9Char" w:type="character">
+      <w:color w:val="272727" w:themeColor="text1" w:themeTint="D8"/>
+    </w:rPr>
+  </w:style>
+  <w:style w:type="character" w:customStyle="1" w:styleId="Heading9Char">
     <w:name w:val="Heading 9 Char"/>
     <w:basedOn w:val="DefaultParagraphFont"/>
     <w:link w:val="Heading9"/>
@@ -1794,11 +2413,11 @@
     <w:semiHidden/>
     <w:rsid w:val="00A10FD9"/>
     <w:rPr>
-      <w:rFonts w:cstheme="majorBidi" w:eastAsiaTheme="majorEastAsia"/>
-      <w:color w:themeColor="text1" w:themeTint="D8" w:val="272727"/>
-    </w:rPr>
-  </w:style>
-  <w:style w:styleId="BlockText" w:type="paragraph">
+      <w:rFonts w:eastAsiaTheme="majorEastAsia" w:cstheme="majorBidi"/>
+      <w:color w:val="272727" w:themeColor="text1" w:themeTint="D8"/>
+    </w:rPr>
+  </w:style>
+  <w:style w:type="paragraph" w:styleId="BlockText">
     <w:name w:val="Block Text"/>
     <w:basedOn w:val="BodyText"/>
     <w:next w:val="BodyText"/>
@@ -1806,19 +2425,18 @@
     <w:unhideWhenUsed/>
     <w:qFormat/>
     <w:pPr>
-      <w:spacing w:after="100" w:before="100"/>
-      <w:ind w:firstLine="0" w:left="480" w:right="480"/>
+      <w:spacing w:before="100" w:after="100"/>
+      <w:ind w:left="480" w:right="480"/>
     </w:pPr>
   </w:style>
-  <w:style w:styleId="FootnoteText" w:type="paragraph">
-    <w:name w:val="Footnote Text"/>
+  <w:style w:type="paragraph" w:styleId="FootnoteText">
+    <w:name w:val="footnote text"/>
     <w:basedOn w:val="Normal"/>
-    <w:next w:val="FootnoteText"/>
     <w:uiPriority w:val="9"/>
     <w:unhideWhenUsed/>
     <w:qFormat/>
   </w:style>
-  <w:style w:styleId="FootnoteBlockText" w:type="paragraph">
+  <w:style w:type="paragraph" w:customStyle="1" w:styleId="FootnoteBlockText">
     <w:name w:val="Footnote Block Text"/>
     <w:basedOn w:val="FootnoteText"/>
     <w:next w:val="FootnoteText"/>
@@ -1826,32 +2444,26 @@
     <w:unhideWhenUsed/>
     <w:qFormat/>
     <w:pPr>
-      <w:spacing w:after="100" w:before="100"/>
-      <w:ind w:firstLine="0" w:left="480" w:right="480"/>
+      <w:spacing w:before="100" w:after="100"/>
+      <w:ind w:left="480" w:right="480"/>
     </w:pPr>
   </w:style>
-  <w:style w:default="1" w:styleId="DefaultParagraphFont" w:type="character">
-    <w:name w:val="Default Paragraph Font"/>
-    <w:semiHidden/>
-    <w:unhideWhenUsed/>
-  </w:style>
-  <w:style w:default="1" w:styleId="Table" w:type="table">
+  <w:style w:type="table" w:customStyle="1" w:styleId="Table">
     <w:name w:val="Table"/>
-    <w:basedOn w:val="TableNormal"/>
     <w:semiHidden/>
     <w:unhideWhenUsed/>
     <w:qFormat/>
     <w:tblPr>
-      <w:tblInd w:type="dxa" w:w="0"/>
+      <w:tblInd w:w="0" w:type="dxa"/>
       <w:tblCellMar>
-        <w:top w:type="dxa" w:w="0"/>
-        <w:left w:type="dxa" w:w="108"/>
-        <w:bottom w:type="dxa" w:w="0"/>
-        <w:right w:type="dxa" w:w="108"/>
+        <w:top w:w="0" w:type="dxa"/>
+        <w:left w:w="108" w:type="dxa"/>
+        <w:bottom w:w="0" w:type="dxa"/>
+        <w:right w:w="108" w:type="dxa"/>
       </w:tblCellMar>
     </w:tblPr>
   </w:style>
-  <w:style w:customStyle="1" w:styleId="DefinitionTerm" w:type="paragraph">
+  <w:style w:type="paragraph" w:customStyle="1" w:styleId="DefinitionTerm">
     <w:name w:val="Definition Term"/>
     <w:basedOn w:val="Normal"/>
     <w:next w:val="Definition"/>
@@ -1864,75 +2476,76 @@
       <w:b/>
     </w:rPr>
   </w:style>
-  <w:style w:customStyle="1" w:styleId="Definition" w:type="paragraph">
+  <w:style w:type="paragraph" w:customStyle="1" w:styleId="Definition">
     <w:name w:val="Definition"/>
     <w:basedOn w:val="Normal"/>
   </w:style>
-  <w:style w:styleId="Caption" w:type="paragraph">
-    <w:name w:val="Caption"/>
+  <w:style w:type="paragraph" w:styleId="Caption">
+    <w:name w:val="caption"/>
     <w:basedOn w:val="Normal"/>
-    <w:link w:val="BodyTextChar"/>
+    <w:link w:val="CaptionChar"/>
     <w:pPr>
-      <w:spacing w:after="120" w:before="0"/>
+      <w:spacing w:after="120"/>
     </w:pPr>
     <w:rPr>
       <w:i/>
     </w:rPr>
   </w:style>
-  <w:style w:customStyle="1" w:styleId="TableCaption" w:type="paragraph">
+  <w:style w:type="paragraph" w:customStyle="1" w:styleId="TableCaption">
     <w:name w:val="Table Caption"/>
     <w:basedOn w:val="Caption"/>
     <w:pPr>
       <w:keepNext/>
     </w:pPr>
   </w:style>
-  <w:style w:customStyle="1" w:styleId="ImageCaption" w:type="paragraph">
+  <w:style w:type="paragraph" w:customStyle="1" w:styleId="ImageCaption">
     <w:name w:val="Image Caption"/>
     <w:basedOn w:val="Caption"/>
   </w:style>
-  <w:style w:customStyle="1" w:styleId="Figure" w:type="paragraph">
+  <w:style w:type="paragraph" w:customStyle="1" w:styleId="Figure">
     <w:name w:val="Figure"/>
     <w:basedOn w:val="Normal"/>
   </w:style>
-  <w:style w:customStyle="1" w:styleId="CaptionedFigure" w:type="paragraph">
+  <w:style w:type="paragraph" w:customStyle="1" w:styleId="CaptionedFigure">
     <w:name w:val="Captioned Figure"/>
     <w:basedOn w:val="Figure"/>
     <w:pPr>
       <w:keepNext/>
     </w:pPr>
   </w:style>
-  <w:style w:customStyle="1" w:styleId="BodyTextChar" w:type="character">
-    <w:name w:val="Body Text Char"/>
+  <w:style w:type="character" w:customStyle="1" w:styleId="CaptionChar">
+    <w:name w:val="Caption Char"/>
     <w:basedOn w:val="DefaultParagraphFont"/>
-    <w:link w:val="BodyText"/>
-  </w:style>
-  <w:style w:customStyle="1" w:styleId="VerbatimChar" w:type="character">
+    <w:link w:val="Caption"/>
+  </w:style>
+  <w:style w:type="character" w:customStyle="1" w:styleId="VerbatimChar">
     <w:name w:val="Verbatim Char"/>
-    <w:basedOn w:val="BodyTextChar"/>
+    <w:basedOn w:val="CaptionChar"/>
+    <w:link w:val="SourceCode"/>
     <w:rPr>
       <w:rFonts w:ascii="Consolas" w:hAnsi="Consolas"/>
       <w:sz w:val="22"/>
     </w:rPr>
   </w:style>
-  <w:style w:customStyle="1" w:styleId="SectionNumber" w:type="character">
+  <w:style w:type="character" w:customStyle="1" w:styleId="SectionNumber">
     <w:name w:val="Section Number"/>
-    <w:basedOn w:val="BodyTextChar"/>
-  </w:style>
-  <w:style w:styleId="FootnoteReference" w:type="character">
-    <w:name w:val="Footnote Reference"/>
-    <w:basedOn w:val="BodyTextChar"/>
+    <w:basedOn w:val="CaptionChar"/>
+  </w:style>
+  <w:style w:type="character" w:styleId="FootnoteReference">
+    <w:name w:val="footnote reference"/>
+    <w:basedOn w:val="CaptionChar"/>
     <w:rPr>
       <w:vertAlign w:val="superscript"/>
     </w:rPr>
   </w:style>
-  <w:style w:styleId="Hyperlink" w:type="character">
+  <w:style w:type="character" w:styleId="Hyperlink">
     <w:name w:val="Hyperlink"/>
-    <w:basedOn w:val="BodyTextChar"/>
-    <w:rPr>
-      <w:color w:themeColor="accent1" w:val="4F81BD"/>
-    </w:rPr>
-  </w:style>
-  <w:style w:styleId="TOCHeading" w:type="paragraph">
+    <w:basedOn w:val="CaptionChar"/>
+    <w:rPr>
+      <w:color w:val="156082" w:themeColor="accent1"/>
+    </w:rPr>
+  </w:style>
+  <w:style w:type="paragraph" w:styleId="TOCHeading">
     <w:name w:val="TOC Heading"/>
     <w:basedOn w:val="Heading1"/>
     <w:next w:val="BodyText"/>
@@ -1943,246 +2556,305 @@
       <w:spacing w:before="240" w:line="259" w:lineRule="auto"/>
       <w:outlineLvl w:val="9"/>
     </w:pPr>
-    <w:rPr>
-      <w:rFonts w:asciiTheme="majorHAnsi" w:cstheme="majorBidi" w:eastAsiaTheme="majorEastAsia" w:hAnsiTheme="majorHAnsi"/>
-      <w:b w:val="0"/>
-      <w:bCs w:val="0"/>
-      <w:color w:themeColor="accent1" w:themeShade="BF" w:val="365F91"/>
-    </w:rPr>
   </w:style>
   <w:style w:type="paragraph" w:customStyle="1" w:styleId="SourceCode">
     <w:name w:val="Source Code"/>
     <w:basedOn w:val="Normal"/>
     <w:link w:val="VerbatimChar"/>
     <w:pPr>
-      <w:wordWrap w:val="off"/>
+      <w:wordWrap w:val="0"/>
     </w:pPr>
   </w:style>
   <w:style w:type="character" w:customStyle="1" w:styleId="KeywordTok">
     <w:name w:val="KeywordTok"/>
     <w:basedOn w:val="VerbatimChar"/>
     <w:rPr>
+      <w:rFonts w:ascii="Consolas" w:hAnsi="Consolas"/>
       <w:b/>
       <w:color w:val="007020"/>
+      <w:sz w:val="22"/>
     </w:rPr>
   </w:style>
   <w:style w:type="character" w:customStyle="1" w:styleId="DataTypeTok">
     <w:name w:val="DataTypeTok"/>
     <w:basedOn w:val="VerbatimChar"/>
     <w:rPr>
+      <w:rFonts w:ascii="Consolas" w:hAnsi="Consolas"/>
       <w:color w:val="902000"/>
+      <w:sz w:val="22"/>
     </w:rPr>
   </w:style>
   <w:style w:type="character" w:customStyle="1" w:styleId="DecValTok">
     <w:name w:val="DecValTok"/>
     <w:basedOn w:val="VerbatimChar"/>
     <w:rPr>
-      <w:color w:val="40a070"/>
+      <w:rFonts w:ascii="Consolas" w:hAnsi="Consolas"/>
+      <w:color w:val="40A070"/>
+      <w:sz w:val="22"/>
     </w:rPr>
   </w:style>
   <w:style w:type="character" w:customStyle="1" w:styleId="BaseNTok">
     <w:name w:val="BaseNTok"/>
     <w:basedOn w:val="VerbatimChar"/>
     <w:rPr>
-      <w:color w:val="40a070"/>
+      <w:rFonts w:ascii="Consolas" w:hAnsi="Consolas"/>
+      <w:color w:val="40A070"/>
+      <w:sz w:val="22"/>
     </w:rPr>
   </w:style>
   <w:style w:type="character" w:customStyle="1" w:styleId="FloatTok">
     <w:name w:val="FloatTok"/>
     <w:basedOn w:val="VerbatimChar"/>
     <w:rPr>
-      <w:color w:val="40a070"/>
+      <w:rFonts w:ascii="Consolas" w:hAnsi="Consolas"/>
+      <w:color w:val="40A070"/>
+      <w:sz w:val="22"/>
     </w:rPr>
   </w:style>
   <w:style w:type="character" w:customStyle="1" w:styleId="ConstantTok">
     <w:name w:val="ConstantTok"/>
     <w:basedOn w:val="VerbatimChar"/>
     <w:rPr>
+      <w:rFonts w:ascii="Consolas" w:hAnsi="Consolas"/>
       <w:color w:val="880000"/>
+      <w:sz w:val="22"/>
     </w:rPr>
   </w:style>
   <w:style w:type="character" w:customStyle="1" w:styleId="CharTok">
     <w:name w:val="CharTok"/>
     <w:basedOn w:val="VerbatimChar"/>
     <w:rPr>
-      <w:color w:val="4070a0"/>
+      <w:rFonts w:ascii="Consolas" w:hAnsi="Consolas"/>
+      <w:color w:val="4070A0"/>
+      <w:sz w:val="22"/>
     </w:rPr>
   </w:style>
   <w:style w:type="character" w:customStyle="1" w:styleId="SpecialCharTok">
     <w:name w:val="SpecialCharTok"/>
     <w:basedOn w:val="VerbatimChar"/>
     <w:rPr>
-      <w:color w:val="4070a0"/>
+      <w:rFonts w:ascii="Consolas" w:hAnsi="Consolas"/>
+      <w:color w:val="4070A0"/>
+      <w:sz w:val="22"/>
     </w:rPr>
   </w:style>
   <w:style w:type="character" w:customStyle="1" w:styleId="StringTok">
     <w:name w:val="StringTok"/>
     <w:basedOn w:val="VerbatimChar"/>
     <w:rPr>
-      <w:color w:val="4070a0"/>
+      <w:rFonts w:ascii="Consolas" w:hAnsi="Consolas"/>
+      <w:color w:val="4070A0"/>
+      <w:sz w:val="22"/>
     </w:rPr>
   </w:style>
   <w:style w:type="character" w:customStyle="1" w:styleId="VerbatimStringTok">
     <w:name w:val="VerbatimStringTok"/>
     <w:basedOn w:val="VerbatimChar"/>
     <w:rPr>
-      <w:color w:val="4070a0"/>
+      <w:rFonts w:ascii="Consolas" w:hAnsi="Consolas"/>
+      <w:color w:val="4070A0"/>
+      <w:sz w:val="22"/>
     </w:rPr>
   </w:style>
   <w:style w:type="character" w:customStyle="1" w:styleId="SpecialStringTok">
     <w:name w:val="SpecialStringTok"/>
     <w:basedOn w:val="VerbatimChar"/>
     <w:rPr>
-      <w:color w:val="bb6688"/>
+      <w:rFonts w:ascii="Consolas" w:hAnsi="Consolas"/>
+      <w:color w:val="BB6688"/>
+      <w:sz w:val="22"/>
     </w:rPr>
   </w:style>
   <w:style w:type="character" w:customStyle="1" w:styleId="ImportTok">
     <w:name w:val="ImportTok"/>
     <w:basedOn w:val="VerbatimChar"/>
     <w:rPr>
+      <w:rFonts w:ascii="Consolas" w:hAnsi="Consolas"/>
       <w:b/>
       <w:color w:val="008000"/>
+      <w:sz w:val="22"/>
     </w:rPr>
   </w:style>
   <w:style w:type="character" w:customStyle="1" w:styleId="CommentTok">
     <w:name w:val="CommentTok"/>
     <w:basedOn w:val="VerbatimChar"/>
     <w:rPr>
+      <w:rFonts w:ascii="Consolas" w:hAnsi="Consolas"/>
       <w:i/>
-      <w:color w:val="60a0b0"/>
+      <w:color w:val="60A0B0"/>
+      <w:sz w:val="22"/>
     </w:rPr>
   </w:style>
   <w:style w:type="character" w:customStyle="1" w:styleId="DocumentationTok">
     <w:name w:val="DocumentationTok"/>
     <w:basedOn w:val="VerbatimChar"/>
     <w:rPr>
+      <w:rFonts w:ascii="Consolas" w:hAnsi="Consolas"/>
       <w:i/>
-      <w:color w:val="ba2121"/>
+      <w:color w:val="BA2121"/>
+      <w:sz w:val="22"/>
     </w:rPr>
   </w:style>
   <w:style w:type="character" w:customStyle="1" w:styleId="AnnotationTok">
     <w:name w:val="AnnotationTok"/>
     <w:basedOn w:val="VerbatimChar"/>
     <w:rPr>
+      <w:rFonts w:ascii="Consolas" w:hAnsi="Consolas"/>
       <w:b/>
       <w:i/>
-      <w:color w:val="60a0b0"/>
+      <w:color w:val="60A0B0"/>
+      <w:sz w:val="22"/>
     </w:rPr>
   </w:style>
   <w:style w:type="character" w:customStyle="1" w:styleId="CommentVarTok">
     <w:name w:val="CommentVarTok"/>
     <w:basedOn w:val="VerbatimChar"/>
     <w:rPr>
+      <w:rFonts w:ascii="Consolas" w:hAnsi="Consolas"/>
       <w:b/>
       <w:i/>
-      <w:color w:val="60a0b0"/>
+      <w:color w:val="60A0B0"/>
+      <w:sz w:val="22"/>
     </w:rPr>
   </w:style>
   <w:style w:type="character" w:customStyle="1" w:styleId="OtherTok">
     <w:name w:val="OtherTok"/>
     <w:basedOn w:val="VerbatimChar"/>
     <w:rPr>
+      <w:rFonts w:ascii="Consolas" w:hAnsi="Consolas"/>
       <w:color w:val="007020"/>
+      <w:sz w:val="22"/>
     </w:rPr>
   </w:style>
   <w:style w:type="character" w:customStyle="1" w:styleId="FunctionTok">
     <w:name w:val="FunctionTok"/>
     <w:basedOn w:val="VerbatimChar"/>
     <w:rPr>
-      <w:color w:val="06287e"/>
+      <w:rFonts w:ascii="Consolas" w:hAnsi="Consolas"/>
+      <w:color w:val="06287E"/>
+      <w:sz w:val="22"/>
     </w:rPr>
   </w:style>
   <w:style w:type="character" w:customStyle="1" w:styleId="VariableTok">
     <w:name w:val="VariableTok"/>
     <w:basedOn w:val="VerbatimChar"/>
     <w:rPr>
-      <w:color w:val="19177c"/>
+      <w:rFonts w:ascii="Consolas" w:hAnsi="Consolas"/>
+      <w:color w:val="19177C"/>
+      <w:sz w:val="22"/>
     </w:rPr>
   </w:style>
   <w:style w:type="character" w:customStyle="1" w:styleId="ControlFlowTok">
     <w:name w:val="ControlFlowTok"/>
     <w:basedOn w:val="VerbatimChar"/>
     <w:rPr>
+      <w:rFonts w:ascii="Consolas" w:hAnsi="Consolas"/>
       <w:b/>
       <w:color w:val="007020"/>
+      <w:sz w:val="22"/>
     </w:rPr>
   </w:style>
   <w:style w:type="character" w:customStyle="1" w:styleId="OperatorTok">
     <w:name w:val="OperatorTok"/>
     <w:basedOn w:val="VerbatimChar"/>
     <w:rPr>
+      <w:rFonts w:ascii="Consolas" w:hAnsi="Consolas"/>
       <w:color w:val="666666"/>
+      <w:sz w:val="22"/>
     </w:rPr>
   </w:style>
   <w:style w:type="character" w:customStyle="1" w:styleId="BuiltInTok">
     <w:name w:val="BuiltInTok"/>
     <w:basedOn w:val="VerbatimChar"/>
     <w:rPr>
+      <w:rFonts w:ascii="Consolas" w:hAnsi="Consolas"/>
       <w:color w:val="008000"/>
+      <w:sz w:val="22"/>
     </w:rPr>
   </w:style>
   <w:style w:type="character" w:customStyle="1" w:styleId="ExtensionTok">
     <w:name w:val="ExtensionTok"/>
     <w:basedOn w:val="VerbatimChar"/>
-    <w:rPr/>
+    <w:rPr>
+      <w:rFonts w:ascii="Consolas" w:hAnsi="Consolas"/>
+      <w:sz w:val="22"/>
+    </w:rPr>
   </w:style>
   <w:style w:type="character" w:customStyle="1" w:styleId="PreprocessorTok">
     <w:name w:val="PreprocessorTok"/>
     <w:basedOn w:val="VerbatimChar"/>
     <w:rPr>
-      <w:color w:val="bc7a00"/>
+      <w:rFonts w:ascii="Consolas" w:hAnsi="Consolas"/>
+      <w:color w:val="BC7A00"/>
+      <w:sz w:val="22"/>
     </w:rPr>
   </w:style>
   <w:style w:type="character" w:customStyle="1" w:styleId="AttributeTok">
     <w:name w:val="AttributeTok"/>
     <w:basedOn w:val="VerbatimChar"/>
     <w:rPr>
-      <w:color w:val="7d9029"/>
+      <w:rFonts w:ascii="Consolas" w:hAnsi="Consolas"/>
+      <w:color w:val="7D9029"/>
+      <w:sz w:val="22"/>
     </w:rPr>
   </w:style>
   <w:style w:type="character" w:customStyle="1" w:styleId="RegionMarkerTok">
     <w:name w:val="RegionMarkerTok"/>
     <w:basedOn w:val="VerbatimChar"/>
-    <w:rPr/>
+    <w:rPr>
+      <w:rFonts w:ascii="Consolas" w:hAnsi="Consolas"/>
+      <w:sz w:val="22"/>
+    </w:rPr>
   </w:style>
   <w:style w:type="character" w:customStyle="1" w:styleId="InformationTok">
     <w:name w:val="InformationTok"/>
     <w:basedOn w:val="VerbatimChar"/>
     <w:rPr>
+      <w:rFonts w:ascii="Consolas" w:hAnsi="Consolas"/>
       <w:b/>
       <w:i/>
-      <w:color w:val="60a0b0"/>
+      <w:color w:val="60A0B0"/>
+      <w:sz w:val="22"/>
     </w:rPr>
   </w:style>
   <w:style w:type="character" w:customStyle="1" w:styleId="WarningTok">
     <w:name w:val="WarningTok"/>
     <w:basedOn w:val="VerbatimChar"/>
     <w:rPr>
+      <w:rFonts w:ascii="Consolas" w:hAnsi="Consolas"/>
       <w:b/>
       <w:i/>
-      <w:color w:val="60a0b0"/>
+      <w:color w:val="60A0B0"/>
+      <w:sz w:val="22"/>
     </w:rPr>
   </w:style>
   <w:style w:type="character" w:customStyle="1" w:styleId="AlertTok">
     <w:name w:val="AlertTok"/>
     <w:basedOn w:val="VerbatimChar"/>
     <w:rPr>
+      <w:rFonts w:ascii="Consolas" w:hAnsi="Consolas"/>
       <w:b/>
-      <w:color w:val="ff0000"/>
+      <w:color w:val="FF0000"/>
+      <w:sz w:val="22"/>
     </w:rPr>
   </w:style>
   <w:style w:type="character" w:customStyle="1" w:styleId="ErrorTok">
     <w:name w:val="ErrorTok"/>
     <w:basedOn w:val="VerbatimChar"/>
     <w:rPr>
+      <w:rFonts w:ascii="Consolas" w:hAnsi="Consolas"/>
       <w:b/>
-      <w:color w:val="ff0000"/>
+      <w:color w:val="FF0000"/>
+      <w:sz w:val="22"/>
     </w:rPr>
   </w:style>
   <w:style w:type="character" w:customStyle="1" w:styleId="NormalTok">
     <w:name w:val="NormalTok"/>
     <w:basedOn w:val="VerbatimChar"/>
-    <w:rPr/>
+    <w:rPr>
+      <w:rFonts w:ascii="Consolas" w:hAnsi="Consolas"/>
+      <w:sz w:val="22"/>
+    </w:rPr>
   </w:style>
 </w:styles>
 </file>

</xml_diff>

<commit_message>
Rewrite the prediction Results, Methods and legend around the two curves
Methods: the PRS framing stated at last -- the held-out replicate's control
pool is given and its selected pool is predicted, with Fig. Ya plotting the
change because the control frequency is in both sides. Then the two
quantities and why they differ: what the predictor explains, and how much the
N regions hold, the latter needing ranking and estimation in disjoint
replicates. Replaces the old paragraph rather than adding to it, which the
edits file now says.

Results: 30 markers explain 8.3-12.7% against 11.4-17.1% marker-based; the
regions hold 9.6-13.9%, so the predictor captures 84-91% of its regions and
the regions hold 78-84% of the genome. The limit is the number of regions.

Co-Authored-By: Claude Fable 5.1 <noreply@anthropic.com>
</commit_message>
<xml_diff>
--- a/temp_aging/Paragraph_to_paste.docx
+++ b/temp_aging/Paragraph_to_paste.docx
@@ -11,7 +11,7 @@
           <w:i/>
           <w:iCs/>
         </w:rPr>
-        <w:t xml:space="preserve">[Results — paste after the paragraph beginning</w:t>
+        <w:t xml:space="preserve">[Results — REPLACES the paragraph beginning</w:t>
       </w:r>
       <w:r>
         <w:rPr>
@@ -25,7 +25,7 @@
           <w:i/>
           <w:iCs/>
         </w:rPr>
-        <w:t xml:space="preserve">“A large-effect locus sits on top of the polygenic background”</w:t>
+        <w:t xml:space="preserve">“We can predict heritable variation in longevity”</w:t>
       </w:r>
       <w:r>
         <w:rPr>
@@ -40,7 +40,7 @@
         <w:pStyle w:val="BodyText"/>
       </w:pPr>
       <w:r>
-        <w:t xml:space="preserve">We can predict heritable variation in longevity in held-out replicates. Holding out each of the ten replicates in turn, founder-frequency changes at the</w:t>
+        <w:t xml:space="preserve">We can predict heritable variation in longevity in held-out replicates. Holding out each of the ten replicates in turn, its control pool and the frequency changes at the</w:t>
       </w:r>
       <w:r>
         <w:t xml:space="preserve"> </w:t>
@@ -56,7 +56,7 @@
         <w:t xml:space="preserve"> </w:t>
       </w:r>
       <w:r>
-        <w:t xml:space="preserve">best markers in the other nine were used to predict the held-out replicate. For the ten best markers the predicted haplotype frequency difference has</w:t>
+        <w:t xml:space="preserve">best markers in the other nine predict the founder frequencies of its selected pool; for the ten best markers, predicted and observed changes agree with</w:t>
       </w:r>
       <w:r>
         <w:t xml:space="preserve"> </w:t>
@@ -69,7 +69,7 @@
         <w:t xml:space="preserve">R</w:t>
       </w:r>
       <w:r>
-        <w:t xml:space="preserve">² = 0.60–0.69 across treatments (Fig. Ya). We estimated marker-based heritability for the whole genome from all 10 replicates as 11–17% across treatments (Methods), of which tiles that never reach an LWP of 7.5 carry 40–47%. A predictor built on the ten best markers explains 6.4–9.5% of phenotypic variance and one built on thirty explains 8.2–11.6% (Fig. Yb). By implication the thirty marker predictor explains 66–72% of the marker-based heritability. Despite variation in longevity being polygenic and spread throughout the genome, markers at thirty strategic locations account for most of the heritable variation in longevity.</w:t>
+        <w:t xml:space="preserve">² = 0.60–0.69 across treatments (Fig. Ya). A predictor built on thirty markers explains 8.3–12.7% of phenotypic variance in the held-out replicate, against a marker-based heritability of 11.4–17.1% for the whole genome (Fig. Yb; Methods). The thirty regions themselves hold 9.6–13.9%. A predictor therefore captures 84–91% of what its regions hold, while those regions hold 78–84% of the heritability in the genome: the limit is the number of regions, not the precision with which their effects are estimated. Both curves are still rising at forty markers, where 5 cM clumping exhausts the genome, and the gap between them stays small. Despite variation in longevity being polygenic and spread throughout the genome, a few dozen haplotype blocks account for most of the heritable variation we can detect.</w:t>
       </w:r>
     </w:p>
     <w:p>
@@ -329,7 +329,7 @@
           <w:i/>
           <w:iCs/>
         </w:rPr>
-        <w:t xml:space="preserve">[Methods — paste after the paragraph beginning</w:t>
+        <w:t xml:space="preserve">[Methods — REPLACES the existing</w:t>
       </w:r>
       <w:r>
         <w:rPr>
@@ -343,14 +343,21 @@
           <w:i/>
           <w:iCs/>
         </w:rPr>
-        <w:t xml:space="preserve">“The partitioning is carried out at every step”</w:t>
+        <w:t xml:space="preserve">“Out-of-sample prediction”</w:t>
       </w:r>
       <w:r>
         <w:rPr>
           <w:i/>
           <w:iCs/>
         </w:rPr>
-        <w:t xml:space="preserve">]</w:t>
+        <w:t xml:space="preserve"> </w:t>
+      </w:r>
+      <w:r>
+        <w:rPr>
+          <w:i/>
+          <w:iCs/>
+        </w:rPr>
+        <w:t xml:space="preserve">paragraph entirely (two paragraphs now)]</w:t>
       </w:r>
     </w:p>
     <w:p>
@@ -368,7 +375,23 @@
         <w:t xml:space="preserve"> </w:t>
       </w:r>
       <w:r>
-        <w:t xml:space="preserve">We asked if changes in founder haplotype frequencies at leading factors can predict an unseen experiment in a manner analogous to polygenic risk scores. Each of the ten independent replicates was held out in turn and the other nine were used to build the predictor; we write ⓡ for the held-out replicate. From the other nine we estimated founder frequency changes per unit of selection,</w:t>
+        <w:t xml:space="preserve">A polygenic risk score predicts a phenotype from a genotype it played no part in measuring. The counterpart here is to take the control pool of a held-out replicate as given — its founder frequencies are observed without any selection — and predict the founder frequencies of its</w:t>
+      </w:r>
+      <w:r>
+        <w:t xml:space="preserve"> </w:t>
+      </w:r>
+      <w:r>
+        <w:rPr>
+          <w:i/>
+          <w:iCs/>
+        </w:rPr>
+        <w:t xml:space="preserve">selected</w:t>
+      </w:r>
+      <w:r>
+        <w:t xml:space="preserve"> </w:t>
+      </w:r>
+      <w:r>
+        <w:t xml:space="preserve">pool, scoring the prediction against what that pool actually shows. Each of the ten replicates was held out in turn; we write ⓡ for the held-out one. From the other nine we estimated the response per unit of selection,</w:t>
       </w:r>
       <w:r>
         <w:t xml:space="preserve"> </w:t>
@@ -439,7 +462,7 @@
         <w:t xml:space="preserve"> </w:t>
       </w:r>
       <w:r>
-        <w:t xml:space="preserve">as in the heritability estimate above, and their mean</w:t>
+        <w:t xml:space="preserve">as in the heritability estimate above, with mean</w:t>
       </w:r>
       <w:r>
         <w:t xml:space="preserve"> </w:t>
@@ -466,10 +489,7 @@
         </m:sSub>
       </m:oMath>
       <w:r>
-        <w:t xml:space="preserve"> </w:t>
-      </w:r>
-      <w:r>
-        <w:t xml:space="preserve">(the bar denotes the average over the nine non-held-out replicates in the current context). We ranked steps by the heritability explained in those nine and kept the best</w:t>
+        <w:t xml:space="preserve">; ranked positions by the heritability explained in those nine; and kept the best</w:t>
       </w:r>
       <w:r>
         <w:t xml:space="preserve"> </w:t>
@@ -480,7 +500,10 @@
         </m:r>
       </m:oMath>
       <w:r>
-        <w:t xml:space="preserve">, each at least 5 cM from any better one. The predicted change in founder frequency in the held-out replicate at a chosen step is its known selection intensity times that mean,</w:t>
+        <w:t xml:space="preserve"> </w:t>
+      </w:r>
+      <w:r>
+        <w:t xml:space="preserve">as markers, each at least 5 cM from any better one. Since the held-out replicate’s selected proportion is known, its predicted selected-pool frequency at a marker is</w:t>
       </w:r>
     </w:p>
     <w:p>
@@ -500,13 +523,7 @@
                 </m:accPr>
                 <m:e>
                   <m:r>
-                    <m:rPr>
-                      <m:sty m:val="p"/>
-                    </m:rPr>
-                    <m:t>Δ</m:t>
-                  </m:r>
-                  <m:r>
-                    <m:t>p</m:t>
+                    <m:t>z</m:t>
                   </m:r>
                 </m:e>
               </m:acc>
@@ -528,6 +545,37 @@
               <m:sty m:val="p"/>
             </m:rPr>
             <m:t>=</m:t>
+          </m:r>
+          <m:sSub>
+            <m:e>
+              <m:acc>
+                <m:accPr>
+                  <m:chr m:val="̂"/>
+                </m:accPr>
+                <m:e>
+                  <m:r>
+                    <m:t>c</m:t>
+                  </m:r>
+                </m:e>
+              </m:acc>
+            </m:e>
+            <m:sub>
+              <m:r>
+                <m:t>f</m:t>
+              </m:r>
+              <m:r>
+                <m:rPr>
+                  <m:sty m:val="p"/>
+                </m:rPr>
+                <m:t>ⓡ</m:t>
+              </m:r>
+            </m:sub>
+          </m:sSub>
+          <m:r>
+            <m:rPr>
+              <m:sty m:val="p"/>
+            </m:rPr>
+            <m:t>+</m:t>
           </m:r>
           <m:sSub>
             <m:e>
@@ -580,7 +628,115 @@
         <w:pStyle w:val="FirstParagraph"/>
       </w:pPr>
       <w:r>
-        <w:t xml:space="preserve">which is plotted against the observed change in Figure Ya. Heritability explained in the held-out replicate at a step is by extension</w:t>
+        <w:t xml:space="preserve">with</w:t>
+      </w:r>
+      <w:r>
+        <w:t xml:space="preserve"> </w:t>
+      </w:r>
+      <m:oMath>
+        <m:sSub>
+          <m:e>
+            <m:acc>
+              <m:accPr>
+                <m:chr m:val="̂"/>
+              </m:accPr>
+              <m:e>
+                <m:r>
+                  <m:t>c</m:t>
+                </m:r>
+              </m:e>
+            </m:acc>
+          </m:e>
+          <m:sub>
+            <m:r>
+              <m:t>f</m:t>
+            </m:r>
+            <m:r>
+              <m:rPr>
+                <m:sty m:val="p"/>
+              </m:rPr>
+              <m:t>ⓡ</m:t>
+            </m:r>
+          </m:sub>
+        </m:sSub>
+      </m:oMath>
+      <w:r>
+        <w:t xml:space="preserve"> </w:t>
+      </w:r>
+      <w:r>
+        <w:t xml:space="preserve">the observed control frequency. Figure Ya plots the predicted change,</w:t>
+      </w:r>
+      <w:r>
+        <w:t xml:space="preserve"> </w:t>
+      </w:r>
+      <m:oMath>
+        <m:sSub>
+          <m:e>
+            <m:acc>
+              <m:accPr>
+                <m:chr m:val="̂"/>
+              </m:accPr>
+              <m:e>
+                <m:r>
+                  <m:t>z</m:t>
+                </m:r>
+              </m:e>
+            </m:acc>
+          </m:e>
+          <m:sub>
+            <m:r>
+              <m:t>f</m:t>
+            </m:r>
+            <m:r>
+              <m:rPr>
+                <m:sty m:val="p"/>
+              </m:rPr>
+              <m:t>ⓡ</m:t>
+            </m:r>
+          </m:sub>
+        </m:sSub>
+        <m:r>
+          <m:rPr>
+            <m:sty m:val="p"/>
+          </m:rPr>
+          <m:t>−</m:t>
+        </m:r>
+        <m:sSub>
+          <m:e>
+            <m:acc>
+              <m:accPr>
+                <m:chr m:val="̂"/>
+              </m:accPr>
+              <m:e>
+                <m:r>
+                  <m:t>c</m:t>
+                </m:r>
+              </m:e>
+            </m:acc>
+          </m:e>
+          <m:sub>
+            <m:r>
+              <m:t>f</m:t>
+            </m:r>
+            <m:r>
+              <m:rPr>
+                <m:sty m:val="p"/>
+              </m:rPr>
+              <m:t>ⓡ</m:t>
+            </m:r>
+          </m:sub>
+        </m:sSub>
+      </m:oMath>
+      <w:r>
+        <w:t xml:space="preserve">, against the observed change rather than the frequencies themselves: the control frequency enters both and would inflate the agreement.</w:t>
+      </w:r>
+    </w:p>
+    <w:p>
+      <w:pPr>
+        <w:pStyle w:val="BodyText"/>
+      </w:pPr>
+      <w:r>
+        <w:t xml:space="preserve">Heritability explained in the held-out replicate at a marker is by extension</w:t>
       </w:r>
     </w:p>
     <w:p>
@@ -867,21 +1023,7 @@
         </m:sSubSup>
       </m:oMath>
       <w:r>
-        <w:t xml:space="preserve">. We estimate the heritability a predictor of</w:t>
-      </w:r>
-      <w:r>
-        <w:t xml:space="preserve"> </w:t>
-      </w:r>
-      <m:oMath>
-        <m:r>
-          <m:t>N</m:t>
-        </m:r>
-      </m:oMath>
-      <w:r>
-        <w:t xml:space="preserve"> </w:t>
-      </w:r>
-      <w:r>
-        <w:t xml:space="preserve">steps explains in the held-out replicate as its summed</w:t>
+        <w:t xml:space="preserve">. Markers in linkage tag the same region and their heritabilities cannot simply be added, the double counting the constant above corrects genome-wide; among the markers of a predictor it is removed by inverting their measured correlation, which at a separation of 5 cM changes the sum by at most 5%. Two quantities follow, and they answer different questions. The first is what the predictor explains: the sum of</w:t>
       </w:r>
       <w:r>
         <w:t xml:space="preserve"> </w:t>
@@ -919,341 +1061,177 @@
         <w:t xml:space="preserve"> </w:t>
       </w:r>
       <w:r>
-        <w:t xml:space="preserve">scaled by the fraction of that sum reproduced from the nine,</w:t>
+        <w:t xml:space="preserve">over the</w:t>
+      </w:r>
+      <w:r>
+        <w:t xml:space="preserve"> </w:t>
+      </w:r>
+      <m:oMath>
+        <m:r>
+          <m:t>N</m:t>
+        </m:r>
+      </m:oMath>
+      <w:r>
+        <w:t xml:space="preserve"> </w:t>
+      </w:r>
+      <w:r>
+        <w:t xml:space="preserve">markers, squared and divided by the same sum with</w:t>
+      </w:r>
+      <w:r>
+        <w:t xml:space="preserve"> </w:t>
+      </w:r>
+      <m:oMath>
+        <m:sSub>
+          <m:e>
+            <m:r>
+              <m:t>e</m:t>
+            </m:r>
+          </m:e>
+          <m:sub>
+            <m:r>
+              <m:t>f</m:t>
+            </m:r>
+            <m:r>
+              <m:rPr>
+                <m:sty m:val="p"/>
+              </m:rPr>
+              <m:t>ⓡ</m:t>
+            </m:r>
+          </m:sub>
+        </m:sSub>
+      </m:oMath>
+      <w:r>
+        <w:t xml:space="preserve"> </w:t>
+      </w:r>
+      <w:r>
+        <w:t xml:space="preserve">replaced by</w:t>
+      </w:r>
+      <w:r>
+        <w:t xml:space="preserve"> </w:t>
+      </w:r>
+      <m:oMath>
+        <m:sSub>
+          <m:e>
+            <m:bar>
+              <m:barPr>
+                <m:pos m:val="top"/>
+              </m:barPr>
+              <m:e>
+                <m:r>
+                  <m:t>e</m:t>
+                </m:r>
+              </m:e>
+            </m:bar>
+          </m:e>
+          <m:sub>
+            <m:r>
+              <m:t>f</m:t>
+            </m:r>
+          </m:sub>
+        </m:sSub>
+      </m:oMath>
+      <w:r>
+        <w:t xml:space="preserve">, which is the squared covariance between predicted and observed changes over the variance of the predicted ones — a predictor’s share of variance, as in any polygenic score. The second is how much heritability the</w:t>
+      </w:r>
+      <w:r>
+        <w:t xml:space="preserve"> </w:t>
+      </w:r>
+      <m:oMath>
+        <m:r>
+          <m:t>N</m:t>
+        </m:r>
+      </m:oMath>
+      <w:r>
+        <w:t xml:space="preserve"> </w:t>
+      </w:r>
+      <w:r>
+        <w:t xml:space="preserve">regions hold, whoever estimates their effects. Ranking and effect estimation must then be separated, or a region is credited using the data that selected it: five replicates rank the positions, four others estimate</w:t>
+      </w:r>
+      <w:r>
+        <w:t xml:space="preserve"> </w:t>
+      </w:r>
+      <m:oMath>
+        <m:sSub>
+          <m:e>
+            <m:bar>
+              <m:barPr>
+                <m:pos m:val="top"/>
+              </m:barPr>
+              <m:e>
+                <m:r>
+                  <m:t>e</m:t>
+                </m:r>
+              </m:e>
+            </m:bar>
+          </m:e>
+          <m:sub>
+            <m:r>
+              <m:t>f</m:t>
+            </m:r>
+          </m:sub>
+        </m:sSub>
+      </m:oMath>
+      <w:r>
+        <w:t xml:space="preserve">, and the held-out replicate scores the result, averaged over five random splits of the nine. Without that separation the regions appear to hold about 10% more than they do.</w:t>
       </w:r>
     </w:p>
     <w:p>
       <w:pPr>
         <w:pStyle w:val="BodyText"/>
       </w:pPr>
-      <m:oMathPara>
-        <m:oMathParaPr>
-          <m:jc m:val="center"/>
-        </m:oMathParaPr>
-        <m:oMath>
-          <m:sSubSup>
-            <m:e>
-              <m:acc>
-                <m:accPr>
-                  <m:chr m:val="̂"/>
-                </m:accPr>
-                <m:e>
-                  <m:r>
-                    <m:t>h</m:t>
-                  </m:r>
-                </m:e>
-              </m:acc>
-            </m:e>
-            <m:sub>
-              <m:r>
-                <m:rPr>
-                  <m:sty m:val="p"/>
-                </m:rPr>
-                <m:t>p</m:t>
-              </m:r>
-              <m:r>
-                <m:rPr>
-                  <m:sty m:val="p"/>
-                </m:rPr>
-                <m:t>r</m:t>
-              </m:r>
-              <m:r>
-                <m:rPr>
-                  <m:sty m:val="p"/>
-                </m:rPr>
-                <m:t>e</m:t>
-              </m:r>
-              <m:r>
-                <m:rPr>
-                  <m:sty m:val="p"/>
-                </m:rPr>
-                <m:t>d</m:t>
-              </m:r>
-            </m:sub>
-            <m:sup>
-              <m:r>
-                <m:t>2</m:t>
-              </m:r>
-            </m:sup>
-          </m:sSubSup>
-          <m:r>
-            <m:rPr>
-              <m:sty m:val="p"/>
-            </m:rPr>
-            <m:t>=</m:t>
-          </m:r>
-          <m:f>
-            <m:fPr>
-              <m:type m:val="bar"/>
-            </m:fPr>
-            <m:num>
-              <m:sSup>
-                <m:e>
-                  <m:d>
-                    <m:dPr>
-                      <m:begChr m:val="("/>
-                      <m:sepChr m:val=""/>
-                      <m:endChr m:val=")"/>
-                      <m:grow/>
-                    </m:dPr>
-                    <m:e>
-                      <m:nary>
-                        <m:naryPr>
-                          <m:chr m:val="∑"/>
-                          <m:limLoc m:val="undOvr"/>
-                          <m:subHide m:val="off"/>
-                          <m:supHide m:val="on"/>
-                        </m:naryPr>
-                        <m:sub>
-                          <m:r>
-                            <m:t>N</m:t>
-                          </m:r>
-                        </m:sub>
-                        <m:sup>
-                          <m:r>
-                            <m:t>​</m:t>
-                          </m:r>
-                        </m:sup>
-                        <m:e>
-                          <m:sSubSup>
-                            <m:e>
-                              <m:acc>
-                                <m:accPr>
-                                  <m:chr m:val="̂"/>
-                                </m:accPr>
-                                <m:e>
-                                  <m:r>
-                                    <m:t>h</m:t>
-                                  </m:r>
-                                </m:e>
-                              </m:acc>
-                            </m:e>
-                            <m:sub>
-                              <m:r>
-                                <m:rPr>
-                                  <m:sty m:val="p"/>
-                                </m:rPr>
-                                <m:t>ⓡ</m:t>
-                              </m:r>
-                            </m:sub>
-                            <m:sup>
-                              <m:r>
-                                <m:t>2</m:t>
-                              </m:r>
-                            </m:sup>
-                          </m:sSubSup>
-                        </m:e>
-                      </m:nary>
-                    </m:e>
-                  </m:d>
-                </m:e>
-                <m:sup>
-                  <m:r>
-                    <m:t>2</m:t>
-                  </m:r>
-                </m:sup>
-              </m:sSup>
-            </m:num>
-            <m:den>
-              <m:nary>
-                <m:naryPr>
-                  <m:chr m:val="∑"/>
-                  <m:limLoc m:val="undOvr"/>
-                  <m:subHide m:val="off"/>
-                  <m:supHide m:val="on"/>
-                </m:naryPr>
-                <m:sub>
-                  <m:r>
-                    <m:t>N</m:t>
-                  </m:r>
-                </m:sub>
-                <m:sup>
-                  <m:r>
-                    <m:t>​</m:t>
-                  </m:r>
-                </m:sup>
-                <m:e>
-                  <m:r>
-                    <m:t>100</m:t>
-                  </m:r>
-                </m:e>
-              </m:nary>
-              <m:r>
-                <m:t> </m:t>
-              </m:r>
-              <m:r>
-                <m:t>k</m:t>
-              </m:r>
-              <m:nary>
-                <m:naryPr>
-                  <m:chr m:val="∑"/>
-                  <m:limLoc m:val="undOvr"/>
-                  <m:subHide m:val="off"/>
-                  <m:supHide m:val="on"/>
-                </m:naryPr>
-                <m:sub>
-                  <m:r>
-                    <m:t>f</m:t>
-                  </m:r>
-                </m:sub>
-                <m:sup>
-                  <m:r>
-                    <m:t>​</m:t>
-                  </m:r>
-                </m:sup>
-                <m:e>
-                  <m:sSubSup>
-                    <m:e>
-                      <m:bar>
-                        <m:barPr>
-                          <m:pos m:val="top"/>
-                        </m:barPr>
-                        <m:e>
-                          <m:r>
-                            <m:t>e</m:t>
-                          </m:r>
-                        </m:e>
-                      </m:bar>
-                    </m:e>
-                    <m:sub>
-                      <m:r>
-                        <m:t>f</m:t>
-                      </m:r>
-                    </m:sub>
-                    <m:sup>
-                      <m:r>
-                        <m:t> </m:t>
-                      </m:r>
-                      <m:r>
-                        <m:t>2</m:t>
-                      </m:r>
-                    </m:sup>
-                  </m:sSubSup>
-                </m:e>
-              </m:nary>
-              <m:r>
-                <m:rPr>
-                  <m:sty m:val="p"/>
-                </m:rPr>
-                <m:t>/</m:t>
-              </m:r>
-              <m:sSub>
-                <m:e>
-                  <m:acc>
-                    <m:accPr>
-                      <m:chr m:val="̂"/>
-                    </m:accPr>
-                    <m:e>
-                      <m:r>
-                        <m:t>p</m:t>
-                      </m:r>
-                    </m:e>
-                  </m:acc>
-                </m:e>
-                <m:sub>
-                  <m:r>
-                    <m:t>f</m:t>
-                  </m:r>
-                </m:sub>
-              </m:sSub>
-            </m:den>
-          </m:f>
-          <m:r>
-            <m:rPr>
-              <m:sty m:val="p"/>
-            </m:rPr>
-            <m:t>.</m:t>
-          </m:r>
-        </m:oMath>
-      </m:oMathPara>
+      <w:r>
+        <w:rPr>
+          <w:i/>
+          <w:iCs/>
+        </w:rPr>
+        <w:t xml:space="preserve">[Figure legend — REPLACES the current Figure Y legend]</w:t>
+      </w:r>
     </w:p>
     <w:p>
       <w:pPr>
-        <w:pStyle w:val="FirstParagraph"/>
+        <w:pStyle w:val="BodyText"/>
       </w:pPr>
       <w:r>
-        <w:t xml:space="preserve">Both sums are quadratic forms with the inverse of the correlation matrix</w:t>
-      </w:r>
-      <w:r>
-        <w:t xml:space="preserve"> </w:t>
-      </w:r>
-      <m:oMath>
-        <m:r>
-          <m:t>C</m:t>
-        </m:r>
-      </m:oMath>
-      <w:r>
-        <w:t xml:space="preserve"> </w:t>
-      </w:r>
-      <w:r>
-        <w:t xml:space="preserve">between the chosen steps, which accounts for correlation between markers; as the predictors are at least 5 cM apart, where the correlation is 0.25–0.34, this shrinks the simple sum by at most 5%. Figure Yb plots</w:t>
-      </w:r>
-      <w:r>
-        <w:t xml:space="preserve"> </w:t>
-      </w:r>
-      <m:oMath>
-        <m:sSubSup>
-          <m:e>
-            <m:acc>
-              <m:accPr>
-                <m:chr m:val="̂"/>
-              </m:accPr>
-              <m:e>
-                <m:r>
-                  <m:t>h</m:t>
-                </m:r>
-              </m:e>
-            </m:acc>
-          </m:e>
-          <m:sub>
-            <m:r>
-              <m:rPr>
-                <m:sty m:val="p"/>
-              </m:rPr>
-              <m:t>p</m:t>
-            </m:r>
-            <m:r>
-              <m:rPr>
-                <m:sty m:val="p"/>
-              </m:rPr>
-              <m:t>r</m:t>
-            </m:r>
-            <m:r>
-              <m:rPr>
-                <m:sty m:val="p"/>
-              </m:rPr>
-              <m:t>e</m:t>
-            </m:r>
-            <m:r>
-              <m:rPr>
-                <m:sty m:val="p"/>
-              </m:rPr>
-              <m:t>d</m:t>
-            </m:r>
-          </m:sub>
-          <m:sup>
-            <m:r>
-              <m:t>2</m:t>
-            </m:r>
-          </m:sup>
-        </m:sSubSup>
-      </m:oMath>
-      <w:r>
-        <w:t xml:space="preserve"> </w:t>
-      </w:r>
-      <w:r>
-        <w:t xml:space="preserve">against</w:t>
-      </w:r>
-      <w:r>
-        <w:t xml:space="preserve"> </w:t>
-      </w:r>
-      <m:oMath>
-        <m:r>
-          <m:t>N</m:t>
-        </m:r>
-      </m:oMath>
-      <w:r>
-        <w:t xml:space="preserve">, for each held-out replicate and for the ten combined.</w:t>
+        <w:rPr>
+          <w:b/>
+          <w:bCs/>
+        </w:rPr>
+        <w:t xml:space="preserve">Figure Y: Out of sample predictions.</w:t>
+      </w:r>
+      <w:r>
+        <w:t xml:space="preserve"> </w:t>
+      </w:r>
+      <w:r>
+        <w:t xml:space="preserve">A, Founder frequency change at the top 10 markers in nine replicates predicts the change in a tenth, held-out replicate. Colors are founder haplotypes as in Figure 2. The dashed line is the line of identity. B, Heritability as a function of the number of markers used, in percent of phenotypic variance. Red, the heritability the</w:t>
+      </w:r>
+      <w:r>
+        <w:t xml:space="preserve"> </w:t>
+      </w:r>
+      <w:r>
+        <w:rPr>
+          <w:i/>
+          <w:iCs/>
+        </w:rPr>
+        <w:t xml:space="preserve">N</w:t>
+      </w:r>
+      <w:r>
+        <w:t xml:space="preserve"> </w:t>
+      </w:r>
+      <w:r>
+        <w:t xml:space="preserve">regions hold, with the regions chosen in five replicates and their effects estimated in four others, so that no region is credited using the data that selected it. Blue, the heritability an</w:t>
+      </w:r>
+      <w:r>
+        <w:t xml:space="preserve"> </w:t>
+      </w:r>
+      <w:r>
+        <w:rPr>
+          <w:i/>
+          <w:iCs/>
+        </w:rPr>
+        <w:t xml:space="preserve">N</w:t>
+      </w:r>
+      <w:r>
+        <w:t xml:space="preserve">-marker predictor built on nine replicates explains in the held-out replicate; light lines are the ten replicates individually. The dashed line is the marker-based heritability of the whole genome and the grey band its interquartile range as the footprint width is taken from each peak of Table S1 in turn.</w:t>
       </w:r>
     </w:p>
     <w:sectPr>

</xml_diff>

<commit_message>
Tony's edits to Paragraph_to_paste.docx, round 3
Co-Authored-By: Claude Fable 5.1 <noreply@anthropic.com>
</commit_message>
<xml_diff>
--- a/temp_aging/Paragraph_to_paste.docx
+++ b/temp_aging/Paragraph_to_paste.docx
@@ -1,6 +1,6 @@
 
 <file path=word/document.xml><?xml version="1.0" encoding="utf-8"?>
-<w:document xmlns:w="http://schemas.openxmlformats.org/wordprocessingml/2006/main" xmlns:m="http://schemas.openxmlformats.org/officeDocument/2006/math" xmlns:r="http://schemas.openxmlformats.org/officeDocument/2006/relationships" xmlns:o="urn:schemas-microsoft-com:office:office" xmlns:v="urn:schemas-microsoft-com:vml" xmlns:w10="urn:schemas-microsoft-com:office:word" xmlns:a="http://schemas.openxmlformats.org/drawingml/2006/main" xmlns:pic="http://schemas.openxmlformats.org/drawingml/2006/picture" xmlns:wp="http://schemas.openxmlformats.org/drawingml/2006/wordprocessingDrawing">
+<w:document xmlns:wpc="http://schemas.microsoft.com/office/word/2010/wordprocessingCanvas" xmlns:cx="http://schemas.microsoft.com/office/drawing/2014/chartex" xmlns:cx1="http://schemas.microsoft.com/office/drawing/2015/9/8/chartex" xmlns:cx2="http://schemas.microsoft.com/office/drawing/2015/10/21/chartex" xmlns:cx3="http://schemas.microsoft.com/office/drawing/2016/5/9/chartex" xmlns:cx4="http://schemas.microsoft.com/office/drawing/2016/5/10/chartex" xmlns:cx5="http://schemas.microsoft.com/office/drawing/2016/5/11/chartex" xmlns:cx6="http://schemas.microsoft.com/office/drawing/2016/5/12/chartex" xmlns:cx7="http://schemas.microsoft.com/office/drawing/2016/5/13/chartex" xmlns:cx8="http://schemas.microsoft.com/office/drawing/2016/5/14/chartex" xmlns:mc="http://schemas.openxmlformats.org/markup-compatibility/2006" xmlns:m="http://schemas.openxmlformats.org/officeDocument/2006/math" xmlns:aink="http://schemas.microsoft.com/office/drawing/2016/ink" xmlns:am3d="http://schemas.microsoft.com/office/drawing/2017/model3d" xmlns:oel="http://schemas.microsoft.com/office/2019/extlst" xmlns:r="http://schemas.openxmlformats.org/officeDocument/2006/relationships" xmlns:wp14="http://schemas.microsoft.com/office/word/2010/wordprocessingDrawing" xmlns:wp="http://schemas.openxmlformats.org/drawingml/2006/wordprocessingDrawing" xmlns:wpg="http://schemas.microsoft.com/office/word/2010/wordprocessingGroup" xmlns:wpi="http://schemas.microsoft.com/office/word/2010/wordprocessingInk" xmlns:wps="http://schemas.microsoft.com/office/word/2010/wordprocessingShape" xmlns:o="urn:schemas-microsoft-com:office:office" xmlns:v="urn:schemas-microsoft-com:vml" xmlns:w10="urn:schemas-microsoft-com:office:word" xmlns:w="http://schemas.openxmlformats.org/wordprocessingml/2006/main" xmlns:w14="http://schemas.microsoft.com/office/word/2010/wordml" xmlns:w15="http://schemas.microsoft.com/office/word/2012/wordml" xmlns:w16cex="http://schemas.microsoft.com/office/word/2018/wordml/cex" xmlns:w16cid="http://schemas.microsoft.com/office/word/2016/wordml/cid" xmlns:w16="http://schemas.microsoft.com/office/word/2018/wordml" xmlns:w16sdtdh="http://schemas.microsoft.com/office/word/2020/wordml/sdtdatahash" xmlns:w16sdtfl="http://schemas.microsoft.com/office/word/2024/wordml/sdtformatlock" xmlns:w16se="http://schemas.microsoft.com/office/word/2015/wordml/symex" xmlns:w16du="http://schemas.microsoft.com/office/word/2023/wordml/word16du" xmlns:wne="http://schemas.microsoft.com/office/word/2006/wordml" mc:Ignorable="w14 w15 w16se w16cid w16 w16cex w16sdtdh w16sdtfl w16du wp14">
   <w:body>
     <w:p>
       <w:pPr>
@@ -11,28 +11,7 @@
           <w:i/>
           <w:iCs/>
         </w:rPr>
-        <w:t xml:space="preserve">[Results — REPLACES the paragraph beginning</w:t>
-      </w:r>
-      <w:r>
-        <w:rPr>
-          <w:i/>
-          <w:iCs/>
-        </w:rPr>
-        <w:t xml:space="preserve"> </w:t>
-      </w:r>
-      <w:r>
-        <w:rPr>
-          <w:i/>
-          <w:iCs/>
-        </w:rPr>
-        <w:t xml:space="preserve">“We can predict heritable variation in longevity”</w:t>
-      </w:r>
-      <w:r>
-        <w:rPr>
-          <w:i/>
-          <w:iCs/>
-        </w:rPr>
-        <w:t xml:space="preserve">]</w:t>
+        <w:t>[Results — REPLACES the paragraph beginning “We can predict heritable variation in longevity”]</w:t>
       </w:r>
     </w:p>
     <w:p>
@@ -40,68 +19,101 @@
         <w:pStyle w:val="BodyText"/>
       </w:pPr>
       <w:r>
-        <w:t xml:space="preserve">We can predict heritable variation in longevity in held-out replicates. Holding out each of the ten replicates in turn, its control pool and the frequency changes at the</w:t>
-      </w:r>
-      <w:r>
-        <w:t xml:space="preserve"> </w:t>
+        <w:t xml:space="preserve">We can predict heritable variation in longevity in held-out replicates. Holding out each of the ten replicates in turn, its control pool and the frequency changes at the </w:t>
       </w:r>
       <w:r>
         <w:rPr>
           <w:i/>
           <w:iCs/>
         </w:rPr>
-        <w:t xml:space="preserve">N</w:t>
-      </w:r>
-      <w:r>
-        <w:t xml:space="preserve"> </w:t>
-      </w:r>
-      <w:r>
-        <w:t xml:space="preserve">best markers in the other nine predict the founder frequencies of its selected pool. For the ten best markers, predicted and observed founder frequency changes agree with</w:t>
-      </w:r>
-      <w:r>
-        <w:t xml:space="preserve"> </w:t>
+        <w:t>N</w:t>
+      </w:r>
+      <w:r>
+        <w:t xml:space="preserve"> best markers in the other nine predict the founder frequencies of its selected pool. For the ten best markers, predicted and observed founder frequency changes agree with </w:t>
       </w:r>
       <w:r>
         <w:rPr>
           <w:i/>
           <w:iCs/>
         </w:rPr>
-        <w:t xml:space="preserve">R</w:t>
-      </w:r>
-      <w:r>
-        <w:t xml:space="preserve">² = 0.60–0.69 across treatments (Fig. Ya). Predicting founder frequencies in held-out selected pools further allows us to estimate the proportion of heritable variation in longevity explained. We first asked how much heritable variation the best</w:t>
-      </w:r>
-      <w:r>
-        <w:t xml:space="preserve"> </w:t>
+        <w:t>R</w:t>
+      </w:r>
+      <w:r>
+        <w:t xml:space="preserve">² = 0.60–0.69 across treatments (Fig. Ya). Predicting founder frequencies in held-out selected pools further allows us to estimate the proportion of heritable variation in longevity explained. We first asked how much heritable variation the best </w:t>
       </w:r>
       <w:r>
         <w:rPr>
           <w:i/>
           <w:iCs/>
         </w:rPr>
-        <w:t xml:space="preserve">N</w:t>
-      </w:r>
-      <w:r>
-        <w:t xml:space="preserve"> </w:t>
-      </w:r>
-      <w:r>
-        <w:t xml:space="preserve">markers explain. To do this we chose the markers in five replicates, estimated their effects in four others, and estimated the heritability they explain in the tenth. This sampling scheme accounts for the winner’s curse in choosing the best</w:t>
-      </w:r>
-      <w:r>
-        <w:t xml:space="preserve"> </w:t>
+        <w:t>N</w:t>
+      </w:r>
+      <w:r>
+        <w:t xml:space="preserve"> markers explain. To do this we chose the markers in five replicates, estimated their effects in four others, and estimated the heritability they explain in the tenth. This sampling scheme accounts for the winner’s curse in choosing the best </w:t>
       </w:r>
       <w:r>
         <w:rPr>
           <w:i/>
           <w:iCs/>
         </w:rPr>
-        <w:t xml:space="preserve">N</w:t>
+        <w:t>N</w:t>
+      </w:r>
+      <w:r>
+        <w:t xml:space="preserve"> markers. The best 20–30 markers explain 71–84% of marker-based heritability (red line, Fig. Yb), with the remainder presumably in smaller-effect polygenic regions. We then asked what fraction of this maximum is captured by a predictor whose effects are estimated from all nine replicates. At thirty markers the predictor explains 8.3–12.7% of phenotypic variance, which is 84–91% of what those markers explain. The predictor loses efficiency as markers are added, </w:t>
+      </w:r>
+      <w:r>
+        <w:t>apparent as</w:t>
+      </w:r>
+      <w:r>
+        <w:t xml:space="preserve"> the blue lines begin</w:t>
+      </w:r>
+      <w:r>
+        <w:t>ning</w:t>
+      </w:r>
+      <w:r>
+        <w:t xml:space="preserve"> to plateau at around 20–30 markers</w:t>
+      </w:r>
+      <w:r>
+        <w:t>. This is p</w:t>
+      </w:r>
+      <w:r>
+        <w:t xml:space="preserve">resumably </w:t>
+      </w:r>
+      <w:r>
+        <w:t>because</w:t>
       </w:r>
       <w:r>
         <w:t xml:space="preserve"> </w:t>
       </w:r>
       <w:r>
-        <w:t xml:space="preserve">markers. The best 20–30 markers explain 71–84% of marker-based heritability (red line, Fig. Yb), with the remainder presumably in smaller-effect polygenic regions. We then asked what fraction of this maximum is captured by a predictor whose effects are estimated from all nine replicates. At thirty markers the predictor explains 8.3–12.7% of phenotypic variance, which is 84–91% of what those markers explain. The predictor loses efficiency as markers are added, and the blue lines begin to plateau at around 20–30 markers, presumably because the effects of smaller-effect loci are estimated less precisely, so adding them helps the predictor less and less. These caveats aside, despite variation in longevity being polygenic and spread throughout the genome, a few dozen haplotype blocks account for a large fraction of the heritable variation we can detect.</w:t>
+        <w:t>effects at more polygenic</w:t>
+      </w:r>
+      <w:r>
+        <w:t xml:space="preserve"> loci </w:t>
+      </w:r>
+      <w:r>
+        <w:t>are</w:t>
+      </w:r>
+      <w:r>
+        <w:t xml:space="preserve"> estimated less precisely, so adding them </w:t>
+      </w:r>
+      <w:r>
+        <w:t>adds little additional predictive value</w:t>
+      </w:r>
+      <w:r>
+        <w:t xml:space="preserve">. </w:t>
+      </w:r>
+      <w:r>
+        <w:t>C</w:t>
+      </w:r>
+      <w:r>
+        <w:t xml:space="preserve">aveats aside, despite variation in longevity being polygenic and spread throughout the genome, a few dozen haplotype blocks </w:t>
+      </w:r>
+      <w:r>
+        <w:t xml:space="preserve">predictably </w:t>
+      </w:r>
+      <w:r>
+        <w:t>account for a large fraction of the heritable variation we can detect.</w:t>
       </w:r>
     </w:p>
     <w:p>
@@ -113,28 +125,7 @@
           <w:i/>
           <w:iCs/>
         </w:rPr>
-        <w:t xml:space="preserve">[Methods — paste after the Heritability section, before</w:t>
-      </w:r>
-      <w:r>
-        <w:rPr>
-          <w:i/>
-          <w:iCs/>
-        </w:rPr>
-        <w:t xml:space="preserve"> </w:t>
-      </w:r>
-      <w:r>
-        <w:rPr>
-          <w:i/>
-          <w:iCs/>
-        </w:rPr>
-        <w:t xml:space="preserve">“The relationship between the Wald test and h²”</w:t>
-      </w:r>
-      <w:r>
-        <w:rPr>
-          <w:i/>
-          <w:iCs/>
-        </w:rPr>
-        <w:t xml:space="preserve">]</w:t>
+        <w:t>[Methods — paste after the Heritability section, before “The relationship between the Wald test and h²”]</w:t>
       </w:r>
     </w:p>
     <w:p>
@@ -146,26 +137,34 @@
           <w:b/>
           <w:bCs/>
         </w:rPr>
-        <w:t xml:space="preserve">Marker-based heritability.</w:t>
-      </w:r>
-      <w:r>
-        <w:t xml:space="preserve"> </w:t>
-      </w:r>
-      <w:r>
-        <w:t xml:space="preserve">The heritability of each trait that founder haplotypes capture genome-wide is the sum of</w:t>
-      </w:r>
-      <w:r>
-        <w:t xml:space="preserve"> </w:t>
+        <w:t>Marker-based heritability.</w:t>
+      </w:r>
+      <w:r>
+        <w:t xml:space="preserve"> The heritability of each trait that founder haplotypes capture genome-wide is the sum of </w:t>
       </w:r>
       <m:oMath>
         <m:sSup>
+          <m:sSupPr>
+            <m:ctrlPr>
+              <w:rPr>
+                <w:rFonts w:ascii="Cambria Math" w:hAnsi="Cambria Math"/>
+              </w:rPr>
+            </m:ctrlPr>
+          </m:sSupPr>
           <m:e>
             <m:acc>
               <m:accPr>
-                <m:chr m:val="̂"/>
+                <m:ctrlPr>
+                  <w:rPr>
+                    <w:rFonts w:ascii="Cambria Math" w:hAnsi="Cambria Math"/>
+                  </w:rPr>
+                </m:ctrlPr>
               </m:accPr>
               <m:e>
                 <m:r>
+                  <w:rPr>
+                    <w:rFonts w:ascii="Cambria Math" w:hAnsi="Cambria Math"/>
+                  </w:rPr>
                   <m:t>h</m:t>
                 </m:r>
               </m:e>
@@ -173,29 +172,40 @@
           </m:e>
           <m:sup>
             <m:r>
+              <w:rPr>
+                <w:rFonts w:ascii="Cambria Math" w:hAnsi="Cambria Math"/>
+              </w:rPr>
               <m:t>2</m:t>
             </m:r>
           </m:sup>
         </m:sSup>
       </m:oMath>
       <w:r>
-        <w:t xml:space="preserve"> </w:t>
-      </w:r>
-      <w:r>
-        <w:t xml:space="preserve">over the 268 1 cM tiles, corrected by a multiplicative constant to account for adjacent tiles being correlated. We estimate the constant from the peaks of Table S1. For each peak, in the treatment where it is strongest, we plotted</w:t>
-      </w:r>
-      <w:r>
-        <w:t xml:space="preserve"> </w:t>
+        <w:t xml:space="preserve"> over the 268 1 cM tiles, corrected by a multiplicative constant to account for adjacent tiles being correlated. We estimate the constant from the peaks of Table S1. For each peak, in the treatment where it is strongest, we plotted </w:t>
       </w:r>
       <m:oMath>
         <m:sSup>
+          <m:sSupPr>
+            <m:ctrlPr>
+              <w:rPr>
+                <w:rFonts w:ascii="Cambria Math" w:hAnsi="Cambria Math"/>
+              </w:rPr>
+            </m:ctrlPr>
+          </m:sSupPr>
           <m:e>
             <m:acc>
               <m:accPr>
-                <m:chr m:val="̂"/>
+                <m:ctrlPr>
+                  <w:rPr>
+                    <w:rFonts w:ascii="Cambria Math" w:hAnsi="Cambria Math"/>
+                  </w:rPr>
+                </m:ctrlPr>
               </m:accPr>
               <m:e>
                 <m:r>
+                  <w:rPr>
+                    <w:rFonts w:ascii="Cambria Math" w:hAnsi="Cambria Math"/>
+                  </w:rPr>
                   <m:t>h</m:t>
                 </m:r>
               </m:e>
@@ -203,29 +213,40 @@
           </m:e>
           <m:sup>
             <m:r>
+              <w:rPr>
+                <w:rFonts w:ascii="Cambria Math" w:hAnsi="Cambria Math"/>
+              </w:rPr>
               <m:t>2</m:t>
             </m:r>
           </m:sup>
         </m:sSup>
       </m:oMath>
       <w:r>
-        <w:t xml:space="preserve"> </w:t>
-      </w:r>
-      <w:r>
-        <w:t xml:space="preserve">against distance from the peak, out to 6 cM on whichever side has no other peak, subtracted the floor of</w:t>
-      </w:r>
-      <w:r>
-        <w:t xml:space="preserve"> </w:t>
+        <w:t xml:space="preserve"> against distance from the peak, out to 6 cM on whichever side has no other peak, subtracted the floor of </w:t>
       </w:r>
       <m:oMath>
         <m:sSup>
+          <m:sSupPr>
+            <m:ctrlPr>
+              <w:rPr>
+                <w:rFonts w:ascii="Cambria Math" w:hAnsi="Cambria Math"/>
+              </w:rPr>
+            </m:ctrlPr>
+          </m:sSupPr>
           <m:e>
             <m:acc>
               <m:accPr>
-                <m:chr m:val="̂"/>
+                <m:ctrlPr>
+                  <w:rPr>
+                    <w:rFonts w:ascii="Cambria Math" w:hAnsi="Cambria Math"/>
+                  </w:rPr>
+                </m:ctrlPr>
               </m:accPr>
               <m:e>
                 <m:r>
+                  <w:rPr>
+                    <w:rFonts w:ascii="Cambria Math" w:hAnsi="Cambria Math"/>
+                  </w:rPr>
                   <m:t>h</m:t>
                 </m:r>
               </m:e>
@@ -233,16 +254,16 @@
           </m:e>
           <m:sup>
             <m:r>
+              <w:rPr>
+                <w:rFonts w:ascii="Cambria Math" w:hAnsi="Cambria Math"/>
+              </w:rPr>
               <m:t>2</m:t>
             </m:r>
           </m:sup>
         </m:sSup>
       </m:oMath>
       <w:r>
-        <w:t xml:space="preserve"> </w:t>
-      </w:r>
-      <w:r>
-        <w:t xml:space="preserve">at non-significant tiles, and divided the area under the curve by the height of the peak. Over the seventeen peaks that can be measured the signal spans from 1.0 to 8.3 tiles with a mean correction of 3.8 and quartiles of 2.6 and 4.1. Marker-based heritability is therefore</w:t>
+        <w:t xml:space="preserve"> at non-significant tiles, and divided the area under the curve by the height of the peak. Over the seventeen peaks that can be measured the signal spans from 1.0 to 8.3 tiles with a mean correction of 3.8 and quartiles of 2.6 and 4.1. Marker-based heritability is therefore</w:t>
       </w:r>
     </w:p>
     <w:p>
@@ -256,15 +277,25 @@
         <m:oMath>
           <m:f>
             <m:fPr>
-              <m:type m:val="bar"/>
+              <m:ctrlPr>
+                <w:rPr>
+                  <w:rFonts w:ascii="Cambria Math" w:hAnsi="Cambria Math"/>
+                </w:rPr>
+              </m:ctrlPr>
             </m:fPr>
             <m:num>
               <m:r>
+                <w:rPr>
+                  <w:rFonts w:ascii="Cambria Math" w:hAnsi="Cambria Math"/>
+                </w:rPr>
                 <m:t>1</m:t>
               </m:r>
             </m:num>
             <m:den>
               <m:r>
+                <w:rPr>
+                  <w:rFonts w:ascii="Cambria Math" w:hAnsi="Cambria Math"/>
+                </w:rPr>
                 <m:t>3.8</m:t>
               </m:r>
             </m:den>
@@ -273,55 +304,55 @@
             <m:naryPr>
               <m:chr m:val="∑"/>
               <m:limLoc m:val="undOvr"/>
-              <m:subHide m:val="off"/>
-              <m:supHide m:val="on"/>
+              <m:supHide m:val="1"/>
+              <m:ctrlPr>
+                <w:rPr>
+                  <w:rFonts w:ascii="Cambria Math" w:hAnsi="Cambria Math"/>
+                </w:rPr>
+              </m:ctrlPr>
             </m:naryPr>
             <m:sub>
               <m:r>
                 <m:rPr>
                   <m:sty m:val="p"/>
                 </m:rPr>
-                <m:t>t</m:t>
-              </m:r>
-              <m:r>
-                <m:rPr>
-                  <m:sty m:val="p"/>
-                </m:rPr>
-                <m:t>i</m:t>
-              </m:r>
-              <m:r>
-                <m:rPr>
-                  <m:sty m:val="p"/>
-                </m:rPr>
-                <m:t>l</m:t>
-              </m:r>
-              <m:r>
-                <m:rPr>
-                  <m:sty m:val="p"/>
-                </m:rPr>
-                <m:t>e</m:t>
-              </m:r>
-              <m:r>
-                <m:rPr>
-                  <m:sty m:val="p"/>
-                </m:rPr>
-                <m:t>s</m:t>
+                <w:rPr>
+                  <w:rFonts w:ascii="Cambria Math" w:hAnsi="Cambria Math"/>
+                </w:rPr>
+                <m:t>tiles</m:t>
               </m:r>
             </m:sub>
             <m:sup>
               <m:r>
+                <w:rPr>
+                  <w:rFonts w:ascii="Cambria Math" w:hAnsi="Cambria Math"/>
+                </w:rPr>
                 <m:t>​</m:t>
               </m:r>
             </m:sup>
             <m:e>
               <m:sSup>
+                <m:sSupPr>
+                  <m:ctrlPr>
+                    <w:rPr>
+                      <w:rFonts w:ascii="Cambria Math" w:hAnsi="Cambria Math"/>
+                    </w:rPr>
+                  </m:ctrlPr>
+                </m:sSupPr>
                 <m:e>
                   <m:acc>
                     <m:accPr>
-                      <m:chr m:val="̂"/>
+                      <m:ctrlPr>
+                        <w:rPr>
+                          <w:rFonts w:ascii="Cambria Math" w:hAnsi="Cambria Math"/>
+                        </w:rPr>
+                      </m:ctrlPr>
                     </m:accPr>
                     <m:e>
                       <m:r>
+                        <w:rPr>
+                          <w:rFonts w:ascii="Cambria Math" w:hAnsi="Cambria Math"/>
+                        </w:rPr>
                         <m:t>h</m:t>
                       </m:r>
                     </m:e>
@@ -329,6 +360,9 @@
                 </m:e>
                 <m:sup>
                   <m:r>
+                    <w:rPr>
+                      <w:rFonts w:ascii="Cambria Math" w:hAnsi="Cambria Math"/>
+                    </w:rPr>
                     <m:t>2</m:t>
                   </m:r>
                 </m:sup>
@@ -339,6 +373,9 @@
             <m:rPr>
               <m:sty m:val="p"/>
             </m:rPr>
+            <w:rPr>
+              <w:rFonts w:ascii="Cambria Math" w:hAnsi="Cambria Math"/>
+            </w:rPr>
             <m:t>.</m:t>
           </m:r>
         </m:oMath>
@@ -349,7 +386,7 @@
         <w:pStyle w:val="FirstParagraph"/>
       </w:pPr>
       <w:r>
-        <w:t xml:space="preserve">Resulting point estimates of marker-based heritability are 11.4, 17.1, 13.4 and 16.4% for SY10 females, SY10 males, SY20 females and SY20 males respectively. Dividing by the quartiles instead of 3.8 gives 10.6–16.7, 15.9–25.2, 12.5–19.7 and 15.3–24.2%.</w:t>
+        <w:t>Resulting point estimates of marker-based heritability are 11.4, 17.1, 13.4 and 16.4% for SY10 females, SY10 males, SY20 females and SY20 males respectively. Dividing by the quartiles instead of 3.8 gives 10.6–16.7, 15.9–25.2, 12.5–19.7 and 15.3–24.2%.</w:t>
       </w:r>
     </w:p>
     <w:p>
@@ -361,35 +398,7 @@
           <w:i/>
           <w:iCs/>
         </w:rPr>
-        <w:t xml:space="preserve">[Methods — REPLACES the existing</w:t>
-      </w:r>
-      <w:r>
-        <w:rPr>
-          <w:i/>
-          <w:iCs/>
-        </w:rPr>
-        <w:t xml:space="preserve"> </w:t>
-      </w:r>
-      <w:r>
-        <w:rPr>
-          <w:i/>
-          <w:iCs/>
-        </w:rPr>
-        <w:t xml:space="preserve">“Out-of-sample prediction”</w:t>
-      </w:r>
-      <w:r>
-        <w:rPr>
-          <w:i/>
-          <w:iCs/>
-        </w:rPr>
-        <w:t xml:space="preserve"> </w:t>
-      </w:r>
-      <w:r>
-        <w:rPr>
-          <w:i/>
-          <w:iCs/>
-        </w:rPr>
-        <w:t xml:space="preserve">paragraph entirely]</w:t>
+        <w:t>[Methods — REPLACES the existing “Out-of-sample prediction” paragraph entirely]</w:t>
       </w:r>
     </w:p>
     <w:p>
@@ -401,46 +410,45 @@
           <w:b/>
           <w:bCs/>
         </w:rPr>
-        <w:t xml:space="preserve">Out-of-sample prediction.</w:t>
-      </w:r>
-      <w:r>
-        <w:t xml:space="preserve"> </w:t>
-      </w:r>
-      <w:r>
-        <w:t xml:space="preserve">A polygenic risk score predicts a phenotype from an out of sample individual. The counterpart here is to take the control pool genotypes of a held-out replicate as given and predict the founder frequencies of its</w:t>
-      </w:r>
-      <w:r>
-        <w:t xml:space="preserve"> </w:t>
+        <w:lastRenderedPageBreak/>
+        <w:t>Out-of-sample prediction.</w:t>
+      </w:r>
+      <w:r>
+        <w:t xml:space="preserve"> A polygenic risk score predicts a phenotype from an out of sample individual. The counterpart here is to take the control pool genotypes of a held-out replicate as given and predict the founder frequencies of its </w:t>
       </w:r>
       <w:r>
         <w:rPr>
           <w:i/>
           <w:iCs/>
         </w:rPr>
-        <w:t xml:space="preserve">selected</w:t>
-      </w:r>
-      <w:r>
-        <w:t xml:space="preserve"> </w:t>
-      </w:r>
-      <w:r>
-        <w:t xml:space="preserve">pool, then score those predictions against what that pool shows. Each of the ten replicates was held out in turn and we write ⓡ to indicate the held-out sample below. From the other nine we estimate the response per unit of selection,</w:t>
-      </w:r>
-      <w:r>
-        <w:t xml:space="preserve"> </w:t>
+        <w:t>selected</w:t>
+      </w:r>
+      <w:r>
+        <w:t xml:space="preserve"> pool, then score those predictions against what that pool shows. Each of the ten replicates was held out in turn and we write ⓡ to indicate the held-out sample below. From the other nine we estimate the response per unit of selection, </w:t>
       </w:r>
       <m:oMath>
         <m:sSub>
+          <m:sSubPr>
+            <m:ctrlPr>
+              <w:rPr>
+                <w:rFonts w:ascii="Cambria Math" w:hAnsi="Cambria Math"/>
+              </w:rPr>
+            </m:ctrlPr>
+          </m:sSubPr>
           <m:e>
             <m:r>
+              <w:rPr>
+                <w:rFonts w:ascii="Cambria Math" w:hAnsi="Cambria Math"/>
+              </w:rPr>
               <m:t>e</m:t>
             </m:r>
           </m:e>
           <m:sub>
             <m:r>
-              <m:t>f</m:t>
-            </m:r>
-            <m:r>
-              <m:t>r</m:t>
+              <w:rPr>
+                <w:rFonts w:ascii="Cambria Math" w:hAnsi="Cambria Math"/>
+              </w:rPr>
+              <m:t>fr</m:t>
             </m:r>
           </m:sub>
         </m:sSub>
@@ -448,26 +456,33 @@
           <m:rPr>
             <m:sty m:val="p"/>
           </m:rPr>
-          <m:t>=</m:t>
-        </m:r>
-        <m:r>
-          <m:rPr>
-            <m:sty m:val="p"/>
-          </m:rPr>
-          <m:t>Δ</m:t>
+          <w:rPr>
+            <w:rFonts w:ascii="Cambria Math" w:hAnsi="Cambria Math"/>
+          </w:rPr>
+          <m:t>=Δ</m:t>
         </m:r>
         <m:sSub>
+          <m:sSubPr>
+            <m:ctrlPr>
+              <w:rPr>
+                <w:rFonts w:ascii="Cambria Math" w:hAnsi="Cambria Math"/>
+              </w:rPr>
+            </m:ctrlPr>
+          </m:sSubPr>
           <m:e>
             <m:r>
+              <w:rPr>
+                <w:rFonts w:ascii="Cambria Math" w:hAnsi="Cambria Math"/>
+              </w:rPr>
               <m:t>p</m:t>
             </m:r>
           </m:e>
           <m:sub>
             <m:r>
-              <m:t>f</m:t>
-            </m:r>
-            <m:r>
-              <m:t>r</m:t>
+              <w:rPr>
+                <w:rFonts w:ascii="Cambria Math" w:hAnsi="Cambria Math"/>
+              </w:rPr>
+              <m:t>fr</m:t>
             </m:r>
           </m:sub>
         </m:sSub>
@@ -475,39 +490,64 @@
           <m:rPr>
             <m:sty m:val="p"/>
           </m:rPr>
+          <w:rPr>
+            <w:rFonts w:ascii="Cambria Math" w:hAnsi="Cambria Math"/>
+          </w:rPr>
           <m:t>/</m:t>
         </m:r>
         <m:sSub>
+          <m:sSubPr>
+            <m:ctrlPr>
+              <w:rPr>
+                <w:rFonts w:ascii="Cambria Math" w:hAnsi="Cambria Math"/>
+              </w:rPr>
+            </m:ctrlPr>
+          </m:sSubPr>
           <m:e>
             <m:r>
+              <w:rPr>
+                <w:rFonts w:ascii="Cambria Math" w:hAnsi="Cambria Math"/>
+              </w:rPr>
               <m:t>i</m:t>
             </m:r>
           </m:e>
           <m:sub>
             <m:r>
+              <w:rPr>
+                <w:rFonts w:ascii="Cambria Math" w:hAnsi="Cambria Math"/>
+              </w:rPr>
               <m:t>r</m:t>
             </m:r>
           </m:sub>
         </m:sSub>
       </m:oMath>
       <w:r>
-        <w:t xml:space="preserve"> </w:t>
-      </w:r>
-      <w:r>
-        <w:t xml:space="preserve">as in the heritability estimate above, with mean</w:t>
-      </w:r>
-      <w:r>
-        <w:t xml:space="preserve"> </w:t>
+        <w:t xml:space="preserve"> as in the heritability estimate above, with mean </w:t>
       </w:r>
       <m:oMath>
         <m:sSub>
+          <m:sSubPr>
+            <m:ctrlPr>
+              <w:rPr>
+                <w:rFonts w:ascii="Cambria Math" w:hAnsi="Cambria Math"/>
+              </w:rPr>
+            </m:ctrlPr>
+          </m:sSubPr>
           <m:e>
             <m:bar>
               <m:barPr>
                 <m:pos m:val="top"/>
+                <m:ctrlPr>
+                  <w:rPr>
+                    <w:rFonts w:ascii="Cambria Math" w:hAnsi="Cambria Math"/>
+                  </w:rPr>
+                </m:ctrlPr>
               </m:barPr>
               <m:e>
                 <m:r>
+                  <w:rPr>
+                    <w:rFonts w:ascii="Cambria Math" w:hAnsi="Cambria Math"/>
+                  </w:rPr>
                   <m:t>e</m:t>
                 </m:r>
               </m:e>
@@ -515,27 +555,27 @@
           </m:e>
           <m:sub>
             <m:r>
+              <w:rPr>
+                <w:rFonts w:ascii="Cambria Math" w:hAnsi="Cambria Math"/>
+              </w:rPr>
               <m:t>f</m:t>
             </m:r>
           </m:sub>
         </m:sSub>
       </m:oMath>
       <w:r>
-        <w:t xml:space="preserve">; rank positions by the heritability explained in those nine; and keep the best</w:t>
-      </w:r>
-      <w:r>
-        <w:t xml:space="preserve"> </w:t>
+        <w:t xml:space="preserve">; rank positions by the heritability explained in those nine; and keep the best </w:t>
       </w:r>
       <m:oMath>
         <m:r>
+          <w:rPr>
+            <w:rFonts w:ascii="Cambria Math" w:hAnsi="Cambria Math"/>
+          </w:rPr>
           <m:t>N</m:t>
         </m:r>
       </m:oMath>
       <w:r>
-        <w:t xml:space="preserve"> </w:t>
-      </w:r>
-      <w:r>
-        <w:t xml:space="preserve">as markers, each at least 5 cM from any better one. Since the held-out replicate’s selected proportion is known, its predicted selected-pool frequency at a marker is</w:t>
+        <w:t xml:space="preserve"> as markers, each at least 5 cM from any better one. Since the held-out replicate’s selected proportion is known, its predicted selected-pool frequency at a marker is</w:t>
       </w:r>
     </w:p>
     <w:p>
@@ -548,13 +588,27 @@
         </m:oMathParaPr>
         <m:oMath>
           <m:sSub>
+            <m:sSubPr>
+              <m:ctrlPr>
+                <w:rPr>
+                  <w:rFonts w:ascii="Cambria Math" w:hAnsi="Cambria Math"/>
+                </w:rPr>
+              </m:ctrlPr>
+            </m:sSubPr>
             <m:e>
               <m:acc>
                 <m:accPr>
-                  <m:chr m:val="̂"/>
+                  <m:ctrlPr>
+                    <w:rPr>
+                      <w:rFonts w:ascii="Cambria Math" w:hAnsi="Cambria Math"/>
+                    </w:rPr>
+                  </m:ctrlPr>
                 </m:accPr>
                 <m:e>
                   <m:r>
+                    <w:rPr>
+                      <w:rFonts w:ascii="Cambria Math" w:hAnsi="Cambria Math"/>
+                    </w:rPr>
                     <m:t>z</m:t>
                   </m:r>
                 </m:e>
@@ -562,12 +616,18 @@
             </m:e>
             <m:sub>
               <m:r>
+                <w:rPr>
+                  <w:rFonts w:ascii="Cambria Math" w:hAnsi="Cambria Math"/>
+                </w:rPr>
                 <m:t>f</m:t>
               </m:r>
               <m:r>
                 <m:rPr>
                   <m:sty m:val="p"/>
                 </m:rPr>
+                <w:rPr>
+                  <w:rFonts w:ascii="Cambria Math" w:hAnsi="Cambria Math"/>
+                </w:rPr>
                 <m:t>ⓡ</m:t>
               </m:r>
             </m:sub>
@@ -576,16 +636,33 @@
             <m:rPr>
               <m:sty m:val="p"/>
             </m:rPr>
+            <w:rPr>
+              <w:rFonts w:ascii="Cambria Math" w:hAnsi="Cambria Math"/>
+            </w:rPr>
             <m:t>=</m:t>
           </m:r>
           <m:sSub>
+            <m:sSubPr>
+              <m:ctrlPr>
+                <w:rPr>
+                  <w:rFonts w:ascii="Cambria Math" w:hAnsi="Cambria Math"/>
+                </w:rPr>
+              </m:ctrlPr>
+            </m:sSubPr>
             <m:e>
               <m:acc>
                 <m:accPr>
-                  <m:chr m:val="̂"/>
+                  <m:ctrlPr>
+                    <w:rPr>
+                      <w:rFonts w:ascii="Cambria Math" w:hAnsi="Cambria Math"/>
+                    </w:rPr>
+                  </m:ctrlPr>
                 </m:accPr>
                 <m:e>
                   <m:r>
+                    <w:rPr>
+                      <w:rFonts w:ascii="Cambria Math" w:hAnsi="Cambria Math"/>
+                    </w:rPr>
                     <m:t>c</m:t>
                   </m:r>
                 </m:e>
@@ -593,12 +670,18 @@
             </m:e>
             <m:sub>
               <m:r>
+                <w:rPr>
+                  <w:rFonts w:ascii="Cambria Math" w:hAnsi="Cambria Math"/>
+                </w:rPr>
                 <m:t>f</m:t>
               </m:r>
               <m:r>
                 <m:rPr>
                   <m:sty m:val="p"/>
                 </m:rPr>
+                <w:rPr>
+                  <w:rFonts w:ascii="Cambria Math" w:hAnsi="Cambria Math"/>
+                </w:rPr>
                 <m:t>ⓡ</m:t>
               </m:r>
             </m:sub>
@@ -607,11 +690,24 @@
             <m:rPr>
               <m:sty m:val="p"/>
             </m:rPr>
+            <w:rPr>
+              <w:rFonts w:ascii="Cambria Math" w:hAnsi="Cambria Math"/>
+            </w:rPr>
             <m:t>+</m:t>
           </m:r>
           <m:sSub>
+            <m:sSubPr>
+              <m:ctrlPr>
+                <w:rPr>
+                  <w:rFonts w:ascii="Cambria Math" w:hAnsi="Cambria Math"/>
+                </w:rPr>
+              </m:ctrlPr>
+            </m:sSubPr>
             <m:e>
               <m:r>
+                <w:rPr>
+                  <w:rFonts w:ascii="Cambria Math" w:hAnsi="Cambria Math"/>
+                </w:rPr>
                 <m:t>i</m:t>
               </m:r>
             </m:e>
@@ -620,21 +716,42 @@
                 <m:rPr>
                   <m:sty m:val="p"/>
                 </m:rPr>
+                <w:rPr>
+                  <w:rFonts w:ascii="Cambria Math" w:hAnsi="Cambria Math"/>
+                </w:rPr>
                 <m:t>ⓡ</m:t>
               </m:r>
             </m:sub>
           </m:sSub>
           <m:r>
+            <w:rPr>
+              <w:rFonts w:ascii="Cambria Math" w:hAnsi="Cambria Math"/>
+            </w:rPr>
             <m:t> </m:t>
           </m:r>
           <m:sSub>
+            <m:sSubPr>
+              <m:ctrlPr>
+                <w:rPr>
+                  <w:rFonts w:ascii="Cambria Math" w:hAnsi="Cambria Math"/>
+                </w:rPr>
+              </m:ctrlPr>
+            </m:sSubPr>
             <m:e>
               <m:bar>
                 <m:barPr>
                   <m:pos m:val="top"/>
+                  <m:ctrlPr>
+                    <w:rPr>
+                      <w:rFonts w:ascii="Cambria Math" w:hAnsi="Cambria Math"/>
+                    </w:rPr>
+                  </m:ctrlPr>
                 </m:barPr>
                 <m:e>
                   <m:r>
+                    <w:rPr>
+                      <w:rFonts w:ascii="Cambria Math" w:hAnsi="Cambria Math"/>
+                    </w:rPr>
                     <m:t>e</m:t>
                   </m:r>
                 </m:e>
@@ -642,6 +759,9 @@
             </m:e>
             <m:sub>
               <m:r>
+                <w:rPr>
+                  <w:rFonts w:ascii="Cambria Math" w:hAnsi="Cambria Math"/>
+                </w:rPr>
                 <m:t>f</m:t>
               </m:r>
             </m:sub>
@@ -650,6 +770,9 @@
             <m:rPr>
               <m:sty m:val="p"/>
             </m:rPr>
+            <w:rPr>
+              <w:rFonts w:ascii="Cambria Math" w:hAnsi="Cambria Math"/>
+            </w:rPr>
             <m:t>,</m:t>
           </m:r>
         </m:oMath>
@@ -660,20 +783,31 @@
         <w:pStyle w:val="FirstParagraph"/>
       </w:pPr>
       <w:r>
-        <w:t xml:space="preserve">with</w:t>
-      </w:r>
-      <w:r>
-        <w:t xml:space="preserve"> </w:t>
+        <w:t xml:space="preserve">with </w:t>
       </w:r>
       <m:oMath>
         <m:sSub>
+          <m:sSubPr>
+            <m:ctrlPr>
+              <w:rPr>
+                <w:rFonts w:ascii="Cambria Math" w:hAnsi="Cambria Math"/>
+              </w:rPr>
+            </m:ctrlPr>
+          </m:sSubPr>
           <m:e>
             <m:acc>
               <m:accPr>
-                <m:chr m:val="̂"/>
+                <m:ctrlPr>
+                  <w:rPr>
+                    <w:rFonts w:ascii="Cambria Math" w:hAnsi="Cambria Math"/>
+                  </w:rPr>
+                </m:ctrlPr>
               </m:accPr>
               <m:e>
                 <m:r>
+                  <w:rPr>
+                    <w:rFonts w:ascii="Cambria Math" w:hAnsi="Cambria Math"/>
+                  </w:rPr>
                   <m:t>c</m:t>
                 </m:r>
               </m:e>
@@ -681,35 +815,49 @@
           </m:e>
           <m:sub>
             <m:r>
+              <w:rPr>
+                <w:rFonts w:ascii="Cambria Math" w:hAnsi="Cambria Math"/>
+              </w:rPr>
               <m:t>f</m:t>
             </m:r>
             <m:r>
               <m:rPr>
                 <m:sty m:val="p"/>
               </m:rPr>
+              <w:rPr>
+                <w:rFonts w:ascii="Cambria Math" w:hAnsi="Cambria Math"/>
+              </w:rPr>
               <m:t>ⓡ</m:t>
             </m:r>
           </m:sub>
         </m:sSub>
       </m:oMath>
       <w:r>
-        <w:t xml:space="preserve"> </w:t>
-      </w:r>
-      <w:r>
-        <w:t xml:space="preserve">the observed control frequency. Figure Ya plots the predicted change,</w:t>
-      </w:r>
-      <w:r>
-        <w:t xml:space="preserve"> </w:t>
+        <w:t xml:space="preserve"> the observed control frequency. Figure Ya plots the predicted change, </w:t>
       </w:r>
       <m:oMath>
         <m:sSub>
+          <m:sSubPr>
+            <m:ctrlPr>
+              <w:rPr>
+                <w:rFonts w:ascii="Cambria Math" w:hAnsi="Cambria Math"/>
+              </w:rPr>
+            </m:ctrlPr>
+          </m:sSubPr>
           <m:e>
             <m:acc>
               <m:accPr>
-                <m:chr m:val="̂"/>
+                <m:ctrlPr>
+                  <w:rPr>
+                    <w:rFonts w:ascii="Cambria Math" w:hAnsi="Cambria Math"/>
+                  </w:rPr>
+                </m:ctrlPr>
               </m:accPr>
               <m:e>
                 <m:r>
+                  <w:rPr>
+                    <w:rFonts w:ascii="Cambria Math" w:hAnsi="Cambria Math"/>
+                  </w:rPr>
                   <m:t>z</m:t>
                 </m:r>
               </m:e>
@@ -717,12 +865,18 @@
           </m:e>
           <m:sub>
             <m:r>
+              <w:rPr>
+                <w:rFonts w:ascii="Cambria Math" w:hAnsi="Cambria Math"/>
+              </w:rPr>
               <m:t>f</m:t>
             </m:r>
             <m:r>
               <m:rPr>
                 <m:sty m:val="p"/>
               </m:rPr>
+              <w:rPr>
+                <w:rFonts w:ascii="Cambria Math" w:hAnsi="Cambria Math"/>
+              </w:rPr>
               <m:t>ⓡ</m:t>
             </m:r>
           </m:sub>
@@ -731,16 +885,33 @@
           <m:rPr>
             <m:sty m:val="p"/>
           </m:rPr>
-          <m:t>−</m:t>
+          <w:rPr>
+            <w:rFonts w:ascii="Cambria Math" w:hAnsi="Cambria Math"/>
+          </w:rPr>
+          <m:t>-</m:t>
         </m:r>
         <m:sSub>
+          <m:sSubPr>
+            <m:ctrlPr>
+              <w:rPr>
+                <w:rFonts w:ascii="Cambria Math" w:hAnsi="Cambria Math"/>
+              </w:rPr>
+            </m:ctrlPr>
+          </m:sSubPr>
           <m:e>
             <m:acc>
               <m:accPr>
-                <m:chr m:val="̂"/>
+                <m:ctrlPr>
+                  <w:rPr>
+                    <w:rFonts w:ascii="Cambria Math" w:hAnsi="Cambria Math"/>
+                  </w:rPr>
+                </m:ctrlPr>
               </m:accPr>
               <m:e>
                 <m:r>
+                  <w:rPr>
+                    <w:rFonts w:ascii="Cambria Math" w:hAnsi="Cambria Math"/>
+                  </w:rPr>
                   <m:t>c</m:t>
                 </m:r>
               </m:e>
@@ -748,19 +919,25 @@
           </m:e>
           <m:sub>
             <m:r>
+              <w:rPr>
+                <w:rFonts w:ascii="Cambria Math" w:hAnsi="Cambria Math"/>
+              </w:rPr>
               <m:t>f</m:t>
             </m:r>
             <m:r>
               <m:rPr>
                 <m:sty m:val="p"/>
               </m:rPr>
+              <w:rPr>
+                <w:rFonts w:ascii="Cambria Math" w:hAnsi="Cambria Math"/>
+              </w:rPr>
               <m:t>ⓡ</m:t>
             </m:r>
           </m:sub>
         </m:sSub>
       </m:oMath>
       <w:r>
-        <w:t xml:space="preserve">, against the observed changes.</w:t>
+        <w:t>, against the observed changes.</w:t>
       </w:r>
     </w:p>
     <w:p>
@@ -768,7 +945,7 @@
         <w:pStyle w:val="BodyText"/>
       </w:pPr>
       <w:r>
-        <w:t xml:space="preserve">Heritability explained in the held-out replicate at a marker is by extension</w:t>
+        <w:t>Heritability explained in the held-out replicate at a marker is by extension</w:t>
       </w:r>
     </w:p>
     <w:p>
@@ -781,13 +958,27 @@
         </m:oMathParaPr>
         <m:oMath>
           <m:sSubSup>
+            <m:sSubSupPr>
+              <m:ctrlPr>
+                <w:rPr>
+                  <w:rFonts w:ascii="Cambria Math" w:hAnsi="Cambria Math"/>
+                </w:rPr>
+              </m:ctrlPr>
+            </m:sSubSupPr>
             <m:e>
               <m:acc>
                 <m:accPr>
-                  <m:chr m:val="̂"/>
+                  <m:ctrlPr>
+                    <w:rPr>
+                      <w:rFonts w:ascii="Cambria Math" w:hAnsi="Cambria Math"/>
+                    </w:rPr>
+                  </m:ctrlPr>
                 </m:accPr>
                 <m:e>
                   <m:r>
+                    <w:rPr>
+                      <w:rFonts w:ascii="Cambria Math" w:hAnsi="Cambria Math"/>
+                    </w:rPr>
                     <m:t>h</m:t>
                   </m:r>
                 </m:e>
@@ -798,11 +989,17 @@
                 <m:rPr>
                   <m:sty m:val="p"/>
                 </m:rPr>
+                <w:rPr>
+                  <w:rFonts w:ascii="Cambria Math" w:hAnsi="Cambria Math"/>
+                </w:rPr>
                 <m:t>ⓡ</m:t>
               </m:r>
             </m:sub>
             <m:sup>
               <m:r>
+                <w:rPr>
+                  <w:rFonts w:ascii="Cambria Math" w:hAnsi="Cambria Math"/>
+                </w:rPr>
                 <m:t>2</m:t>
               </m:r>
             </m:sup>
@@ -811,48 +1008,77 @@
             <m:rPr>
               <m:sty m:val="p"/>
             </m:rPr>
+            <w:rPr>
+              <w:rFonts w:ascii="Cambria Math" w:hAnsi="Cambria Math"/>
+            </w:rPr>
             <m:t>=</m:t>
           </m:r>
           <m:r>
-            <m:t>100</m:t>
-          </m:r>
-          <m:r>
-            <m:t> </m:t>
-          </m:r>
-          <m:r>
-            <m:t>k</m:t>
+            <w:rPr>
+              <w:rFonts w:ascii="Cambria Math" w:hAnsi="Cambria Math"/>
+            </w:rPr>
+            <m:t>100 k</m:t>
           </m:r>
           <m:nary>
             <m:naryPr>
               <m:chr m:val="∑"/>
               <m:limLoc m:val="undOvr"/>
-              <m:subHide m:val="off"/>
-              <m:supHide m:val="on"/>
+              <m:supHide m:val="1"/>
+              <m:ctrlPr>
+                <w:rPr>
+                  <w:rFonts w:ascii="Cambria Math" w:hAnsi="Cambria Math"/>
+                </w:rPr>
+              </m:ctrlPr>
             </m:naryPr>
             <m:sub>
               <m:r>
+                <w:rPr>
+                  <w:rFonts w:ascii="Cambria Math" w:hAnsi="Cambria Math"/>
+                </w:rPr>
                 <m:t>f</m:t>
               </m:r>
             </m:sub>
             <m:sup>
               <m:r>
+                <w:rPr>
+                  <w:rFonts w:ascii="Cambria Math" w:hAnsi="Cambria Math"/>
+                </w:rPr>
                 <m:t>​</m:t>
               </m:r>
             </m:sup>
             <m:e>
               <m:f>
                 <m:fPr>
-                  <m:type m:val="bar"/>
+                  <m:ctrlPr>
+                    <w:rPr>
+                      <w:rFonts w:ascii="Cambria Math" w:hAnsi="Cambria Math"/>
+                    </w:rPr>
+                  </m:ctrlPr>
                 </m:fPr>
                 <m:num>
                   <m:sSub>
+                    <m:sSubPr>
+                      <m:ctrlPr>
+                        <w:rPr>
+                          <w:rFonts w:ascii="Cambria Math" w:hAnsi="Cambria Math"/>
+                        </w:rPr>
+                      </m:ctrlPr>
+                    </m:sSubPr>
                     <m:e>
                       <m:bar>
                         <m:barPr>
                           <m:pos m:val="top"/>
+                          <m:ctrlPr>
+                            <w:rPr>
+                              <w:rFonts w:ascii="Cambria Math" w:hAnsi="Cambria Math"/>
+                            </w:rPr>
+                          </m:ctrlPr>
                         </m:barPr>
                         <m:e>
                           <m:r>
+                            <w:rPr>
+                              <w:rFonts w:ascii="Cambria Math" w:hAnsi="Cambria Math"/>
+                            </w:rPr>
                             <m:t>e</m:t>
                           </m:r>
                         </m:e>
@@ -860,27 +1086,49 @@
                     </m:e>
                     <m:sub>
                       <m:r>
+                        <w:rPr>
+                          <w:rFonts w:ascii="Cambria Math" w:hAnsi="Cambria Math"/>
+                        </w:rPr>
                         <m:t>f</m:t>
                       </m:r>
                     </m:sub>
                   </m:sSub>
                   <m:r>
+                    <w:rPr>
+                      <w:rFonts w:ascii="Cambria Math" w:hAnsi="Cambria Math"/>
+                    </w:rPr>
                     <m:t> </m:t>
                   </m:r>
                   <m:sSub>
+                    <m:sSubPr>
+                      <m:ctrlPr>
+                        <w:rPr>
+                          <w:rFonts w:ascii="Cambria Math" w:hAnsi="Cambria Math"/>
+                        </w:rPr>
+                      </m:ctrlPr>
+                    </m:sSubPr>
                     <m:e>
                       <m:r>
+                        <w:rPr>
+                          <w:rFonts w:ascii="Cambria Math" w:hAnsi="Cambria Math"/>
+                        </w:rPr>
                         <m:t>e</m:t>
                       </m:r>
                     </m:e>
                     <m:sub>
                       <m:r>
+                        <w:rPr>
+                          <w:rFonts w:ascii="Cambria Math" w:hAnsi="Cambria Math"/>
+                        </w:rPr>
                         <m:t>f</m:t>
                       </m:r>
                       <m:r>
                         <m:rPr>
                           <m:sty m:val="p"/>
                         </m:rPr>
+                        <w:rPr>
+                          <w:rFonts w:ascii="Cambria Math" w:hAnsi="Cambria Math"/>
+                        </w:rPr>
                         <m:t>ⓡ</m:t>
                       </m:r>
                     </m:sub>
@@ -888,13 +1136,27 @@
                 </m:num>
                 <m:den>
                   <m:sSub>
+                    <m:sSubPr>
+                      <m:ctrlPr>
+                        <w:rPr>
+                          <w:rFonts w:ascii="Cambria Math" w:hAnsi="Cambria Math"/>
+                        </w:rPr>
+                      </m:ctrlPr>
+                    </m:sSubPr>
                     <m:e>
                       <m:acc>
                         <m:accPr>
-                          <m:chr m:val="̂"/>
+                          <m:ctrlPr>
+                            <w:rPr>
+                              <w:rFonts w:ascii="Cambria Math" w:hAnsi="Cambria Math"/>
+                            </w:rPr>
+                          </m:ctrlPr>
                         </m:accPr>
                         <m:e>
                           <m:r>
+                            <w:rPr>
+                              <w:rFonts w:ascii="Cambria Math" w:hAnsi="Cambria Math"/>
+                            </w:rPr>
                             <m:t>p</m:t>
                           </m:r>
                         </m:e>
@@ -902,6 +1164,9 @@
                     </m:e>
                     <m:sub>
                       <m:r>
+                        <w:rPr>
+                          <w:rFonts w:ascii="Cambria Math" w:hAnsi="Cambria Math"/>
+                        </w:rPr>
                         <m:t>f</m:t>
                       </m:r>
                     </m:sub>
@@ -914,6 +1179,9 @@
             <m:rPr>
               <m:sty m:val="p"/>
             </m:rPr>
+            <w:rPr>
+              <w:rFonts w:ascii="Cambria Math" w:hAnsi="Cambria Math"/>
+            </w:rPr>
             <m:t>.</m:t>
           </m:r>
         </m:oMath>
@@ -924,25 +1192,38 @@
         <w:pStyle w:val="FirstParagraph"/>
       </w:pPr>
       <w:r>
-        <w:t xml:space="preserve">The</w:t>
-      </w:r>
-      <w:r>
-        <w:t xml:space="preserve"> </w:t>
+        <w:t xml:space="preserve">The </w:t>
       </w:r>
       <m:oMath>
         <m:sSubSup>
+          <m:sSubSupPr>
+            <m:ctrlPr>
+              <w:rPr>
+                <w:rFonts w:ascii="Cambria Math" w:hAnsi="Cambria Math"/>
+              </w:rPr>
+            </m:ctrlPr>
+          </m:sSubSupPr>
           <m:e>
             <m:r>
+              <w:rPr>
+                <w:rFonts w:ascii="Cambria Math" w:hAnsi="Cambria Math"/>
+              </w:rPr>
               <m:t>s</m:t>
             </m:r>
           </m:e>
           <m:sub>
             <m:r>
+              <w:rPr>
+                <w:rFonts w:ascii="Cambria Math" w:hAnsi="Cambria Math"/>
+              </w:rPr>
               <m:t>f</m:t>
             </m:r>
           </m:sub>
           <m:sup>
             <m:r>
+              <w:rPr>
+                <w:rFonts w:ascii="Cambria Math" w:hAnsi="Cambria Math"/>
+              </w:rPr>
               <m:t>2</m:t>
             </m:r>
           </m:sup>
@@ -951,30 +1232,45 @@
           <m:rPr>
             <m:sty m:val="p"/>
           </m:rPr>
+          <w:rPr>
+            <w:rFonts w:ascii="Cambria Math" w:hAnsi="Cambria Math"/>
+          </w:rPr>
           <m:t>/</m:t>
         </m:r>
         <m:r>
+          <w:rPr>
+            <w:rFonts w:ascii="Cambria Math" w:hAnsi="Cambria Math"/>
+          </w:rPr>
           <m:t>R</m:t>
         </m:r>
       </m:oMath>
       <w:r>
-        <w:t xml:space="preserve"> </w:t>
-      </w:r>
-      <w:r>
-        <w:t xml:space="preserve">term of the earlier heritability estimator does not appear, as</w:t>
-      </w:r>
-      <w:r>
-        <w:t xml:space="preserve"> </w:t>
+        <w:t xml:space="preserve"> term of the earlier heritability estimator does not appear, as </w:t>
       </w:r>
       <m:oMath>
         <m:sSub>
+          <m:sSubPr>
+            <m:ctrlPr>
+              <w:rPr>
+                <w:rFonts w:ascii="Cambria Math" w:hAnsi="Cambria Math"/>
+              </w:rPr>
+            </m:ctrlPr>
+          </m:sSubPr>
           <m:e>
             <m:bar>
               <m:barPr>
                 <m:pos m:val="top"/>
+                <m:ctrlPr>
+                  <w:rPr>
+                    <w:rFonts w:ascii="Cambria Math" w:hAnsi="Cambria Math"/>
+                  </w:rPr>
+                </m:ctrlPr>
               </m:barPr>
               <m:e>
                 <m:r>
+                  <w:rPr>
+                    <w:rFonts w:ascii="Cambria Math" w:hAnsi="Cambria Math"/>
+                  </w:rPr>
                   <m:t>e</m:t>
                 </m:r>
               </m:e>
@@ -982,58 +1278,80 @@
           </m:e>
           <m:sub>
             <m:r>
+              <w:rPr>
+                <w:rFonts w:ascii="Cambria Math" w:hAnsi="Cambria Math"/>
+              </w:rPr>
               <m:t>f</m:t>
             </m:r>
           </m:sub>
         </m:sSub>
       </m:oMath>
       <w:r>
-        <w:t xml:space="preserve"> </w:t>
-      </w:r>
-      <w:r>
-        <w:t xml:space="preserve">and</w:t>
-      </w:r>
-      <w:r>
-        <w:t xml:space="preserve"> </w:t>
+        <w:t xml:space="preserve"> and </w:t>
       </w:r>
       <m:oMath>
         <m:sSub>
+          <m:sSubPr>
+            <m:ctrlPr>
+              <w:rPr>
+                <w:rFonts w:ascii="Cambria Math" w:hAnsi="Cambria Math"/>
+              </w:rPr>
+            </m:ctrlPr>
+          </m:sSubPr>
           <m:e>
             <m:r>
+              <w:rPr>
+                <w:rFonts w:ascii="Cambria Math" w:hAnsi="Cambria Math"/>
+              </w:rPr>
               <m:t>e</m:t>
             </m:r>
           </m:e>
           <m:sub>
             <m:r>
+              <w:rPr>
+                <w:rFonts w:ascii="Cambria Math" w:hAnsi="Cambria Math"/>
+              </w:rPr>
               <m:t>f</m:t>
             </m:r>
             <m:r>
               <m:rPr>
                 <m:sty m:val="p"/>
               </m:rPr>
+              <w:rPr>
+                <w:rFonts w:ascii="Cambria Math" w:hAnsi="Cambria Math"/>
+              </w:rPr>
               <m:t>ⓡ</m:t>
             </m:r>
           </m:sub>
         </m:sSub>
       </m:oMath>
       <w:r>
-        <w:t xml:space="preserve"> </w:t>
-      </w:r>
-      <w:r>
-        <w:t xml:space="preserve">are independent estimates of the same quantity, so their product has expectation</w:t>
-      </w:r>
-      <w:r>
-        <w:t xml:space="preserve"> </w:t>
+        <w:t xml:space="preserve"> are independent estimates of the same quantity, so their product has expectation </w:t>
       </w:r>
       <m:oMath>
         <m:sSubSup>
+          <m:sSubSupPr>
+            <m:ctrlPr>
+              <w:rPr>
+                <w:rFonts w:ascii="Cambria Math" w:hAnsi="Cambria Math"/>
+              </w:rPr>
+            </m:ctrlPr>
+          </m:sSubSupPr>
           <m:e>
             <m:bar>
               <m:barPr>
                 <m:pos m:val="top"/>
+                <m:ctrlPr>
+                  <w:rPr>
+                    <w:rFonts w:ascii="Cambria Math" w:hAnsi="Cambria Math"/>
+                  </w:rPr>
+                </m:ctrlPr>
               </m:barPr>
               <m:e>
                 <m:r>
+                  <w:rPr>
+                    <w:rFonts w:ascii="Cambria Math" w:hAnsi="Cambria Math"/>
+                  </w:rPr>
                   <m:t>e</m:t>
                 </m:r>
               </m:e>
@@ -1041,34 +1359,48 @@
           </m:e>
           <m:sub>
             <m:r>
+              <w:rPr>
+                <w:rFonts w:ascii="Cambria Math" w:hAnsi="Cambria Math"/>
+              </w:rPr>
               <m:t>f</m:t>
             </m:r>
           </m:sub>
           <m:sup>
             <m:r>
-              <m:t> </m:t>
-            </m:r>
-            <m:r>
-              <m:t>2</m:t>
+              <w:rPr>
+                <w:rFonts w:ascii="Cambria Math" w:hAnsi="Cambria Math"/>
+              </w:rPr>
+              <m:t> 2</m:t>
             </m:r>
           </m:sup>
         </m:sSubSup>
       </m:oMath>
       <w:r>
-        <w:t xml:space="preserve">. Markers in linkage tag the same region and their heritabilities cannot simply be added. We therefore summed</w:t>
-      </w:r>
-      <w:r>
-        <w:t xml:space="preserve"> </w:t>
+        <w:t xml:space="preserve">. Markers in linkage tag the same region and their heritabilities cannot simply be added. We therefore summed </w:t>
       </w:r>
       <m:oMath>
         <m:sSubSup>
+          <m:sSubSupPr>
+            <m:ctrlPr>
+              <w:rPr>
+                <w:rFonts w:ascii="Cambria Math" w:hAnsi="Cambria Math"/>
+              </w:rPr>
+            </m:ctrlPr>
+          </m:sSubSupPr>
           <m:e>
             <m:acc>
               <m:accPr>
-                <m:chr m:val="̂"/>
+                <m:ctrlPr>
+                  <w:rPr>
+                    <w:rFonts w:ascii="Cambria Math" w:hAnsi="Cambria Math"/>
+                  </w:rPr>
+                </m:ctrlPr>
               </m:accPr>
               <m:e>
                 <m:r>
+                  <w:rPr>
+                    <w:rFonts w:ascii="Cambria Math" w:hAnsi="Cambria Math"/>
+                  </w:rPr>
                   <m:t>h</m:t>
                 </m:r>
               </m:e>
@@ -1079,35 +1411,41 @@
               <m:rPr>
                 <m:sty m:val="p"/>
               </m:rPr>
+              <w:rPr>
+                <w:rFonts w:ascii="Cambria Math" w:hAnsi="Cambria Math"/>
+              </w:rPr>
               <m:t>ⓡ</m:t>
             </m:r>
           </m:sub>
           <m:sup>
             <m:r>
+              <w:rPr>
+                <w:rFonts w:ascii="Cambria Math" w:hAnsi="Cambria Math"/>
+              </w:rPr>
               <m:t>2</m:t>
             </m:r>
           </m:sup>
         </m:sSubSup>
       </m:oMath>
       <w:r>
-        <w:t xml:space="preserve"> </w:t>
-      </w:r>
-      <w:r>
-        <w:t xml:space="preserve">over the</w:t>
-      </w:r>
-      <w:r>
-        <w:t xml:space="preserve"> </w:t>
+        <w:t xml:space="preserve"> over the </w:t>
       </w:r>
       <m:oMath>
         <m:r>
+          <w:rPr>
+            <w:rFonts w:ascii="Cambria Math" w:hAnsi="Cambria Math"/>
+          </w:rPr>
           <m:t>N</m:t>
         </m:r>
       </m:oMath>
       <w:r>
-        <w:t xml:space="preserve"> </w:t>
-      </w:r>
-      <w:r>
-        <w:t xml:space="preserve">markers of a predictor using the inverse of their correlation matrix, estimated from the correlation in founder frequency change between markers as a function of distance. Because markers are at least 5 cM apart, this changes the sum by at most 5%.</w:t>
+        <w:t xml:space="preserve"> markers of a predictor using the inverse of their correlation matrix, estimated from the correlation in founder frequency change between markers as a function of distance. Because markers are at least 5 cM apart, this changes the sum</w:t>
+      </w:r>
+      <w:r>
+        <w:t xml:space="preserve"> over simple addition</w:t>
+      </w:r>
+      <w:r>
+        <w:t xml:space="preserve"> by at most 5%.</w:t>
       </w:r>
     </w:p>
     <w:p>
@@ -1115,48 +1453,60 @@
         <w:pStyle w:val="BodyText"/>
       </w:pPr>
       <w:r>
-        <w:t xml:space="preserve">We used this sum in two ways. First, to estimate the heritability explained by the best</w:t>
-      </w:r>
-      <w:r>
-        <w:t xml:space="preserve"> </w:t>
+        <w:t xml:space="preserve">We used this </w:t>
+      </w:r>
+      <w:r>
+        <w:t>estimate of heritability explained</w:t>
+      </w:r>
+      <w:r>
+        <w:t xml:space="preserve"> in two ways. First, to estimate the heritability explained by the best </w:t>
       </w:r>
       <m:oMath>
         <m:r>
+          <w:rPr>
+            <w:rFonts w:ascii="Cambria Math" w:hAnsi="Cambria Math"/>
+          </w:rPr>
           <m:t>N</m:t>
         </m:r>
       </m:oMath>
       <w:r>
-        <w:t xml:space="preserve"> </w:t>
-      </w:r>
-      <w:r>
-        <w:t xml:space="preserve">markers themselves (red line, Fig. Yb). If the same replicates both choose the markers and estimate their effects, the estimate is inflated by the winner’s curse. We therefore split the nine non-held-out replicates: five were used to rank positions and choose the</w:t>
-      </w:r>
-      <w:r>
-        <w:t xml:space="preserve"> </w:t>
+        <w:t xml:space="preserve"> markers themselves (red line, Fig. Yb). If the same replicates both choose the markers and estimate their effects, the estimate is inflated by the winner’s curse. We therefore split the nine non-held-out replicates: five were used to rank positions and choose the </w:t>
       </w:r>
       <m:oMath>
         <m:r>
+          <w:rPr>
+            <w:rFonts w:ascii="Cambria Math" w:hAnsi="Cambria Math"/>
+          </w:rPr>
           <m:t>N</m:t>
         </m:r>
       </m:oMath>
       <w:r>
-        <w:t xml:space="preserve"> </w:t>
-      </w:r>
-      <w:r>
-        <w:t xml:space="preserve">markers, the other four to estimate</w:t>
-      </w:r>
-      <w:r>
-        <w:t xml:space="preserve"> </w:t>
+        <w:t xml:space="preserve"> markers, the other four to estimate </w:t>
       </w:r>
       <m:oMath>
         <m:sSub>
+          <m:sSubPr>
+            <m:ctrlPr>
+              <w:rPr>
+                <w:rFonts w:ascii="Cambria Math" w:hAnsi="Cambria Math"/>
+              </w:rPr>
+            </m:ctrlPr>
+          </m:sSubPr>
           <m:e>
             <m:bar>
               <m:barPr>
                 <m:pos m:val="top"/>
+                <m:ctrlPr>
+                  <w:rPr>
+                    <w:rFonts w:ascii="Cambria Math" w:hAnsi="Cambria Math"/>
+                  </w:rPr>
+                </m:ctrlPr>
               </m:barPr>
               <m:e>
                 <m:r>
+                  <w:rPr>
+                    <w:rFonts w:ascii="Cambria Math" w:hAnsi="Cambria Math"/>
+                  </w:rPr>
                   <m:t>e</m:t>
                 </m:r>
               </m:e>
@@ -1164,37 +1514,63 @@
           </m:e>
           <m:sub>
             <m:r>
+              <w:rPr>
+                <w:rFonts w:ascii="Cambria Math" w:hAnsi="Cambria Math"/>
+              </w:rPr>
               <m:t>f</m:t>
             </m:r>
           </m:sub>
         </m:sSub>
       </m:oMath>
       <w:r>
-        <w:t xml:space="preserve">, and the held-out replicate to estimate the heritability explained, averaging over five random splits. Omitting the split inflates the estimate by about 10%. Second, to estimate the heritability explained by an</w:t>
-      </w:r>
-      <w:r>
-        <w:t xml:space="preserve"> </w:t>
+        <w:t>, and the held-out replicate to estimate the heritability explained, averaging over five random splits. Omitting the split inflates the estimate by about 10%.</w:t>
+      </w:r>
+      <w:r>
+        <w:t xml:space="preserve"> This term should can be thought of as a perfect best N-marker estimator.</w:t>
+      </w:r>
+      <w:r>
+        <w:t xml:space="preserve"> Second, to estimate the heritability explained by an </w:t>
       </w:r>
       <m:oMath>
         <m:r>
+          <w:rPr>
+            <w:rFonts w:ascii="Cambria Math" w:hAnsi="Cambria Math"/>
+          </w:rPr>
           <m:t>N</m:t>
         </m:r>
       </m:oMath>
       <w:r>
-        <w:t xml:space="preserve">-marker predictor whose effects come from all nine replicates (blue line). This is the squared covariance between predicted and observed frequency changes divided by the variance of the predicted changes, that is, the sum of</w:t>
-      </w:r>
-      <w:r>
-        <w:t xml:space="preserve"> </w:t>
+        <w:t>-marker predictor whose effects come from all nine replicates (blue line). This is the squared covariance between predicted and observed frequency changes divided by the variance of the predicted changes</w:t>
+      </w:r>
+      <w:r>
+        <w:t>. T</w:t>
+      </w:r>
+      <w:r>
+        <w:t xml:space="preserve">hat is, the sum of </w:t>
       </w:r>
       <m:oMath>
         <m:sSubSup>
+          <m:sSubSupPr>
+            <m:ctrlPr>
+              <w:rPr>
+                <w:rFonts w:ascii="Cambria Math" w:hAnsi="Cambria Math"/>
+              </w:rPr>
+            </m:ctrlPr>
+          </m:sSubSupPr>
           <m:e>
             <m:acc>
               <m:accPr>
-                <m:chr m:val="̂"/>
+                <m:ctrlPr>
+                  <w:rPr>
+                    <w:rFonts w:ascii="Cambria Math" w:hAnsi="Cambria Math"/>
+                  </w:rPr>
+                </m:ctrlPr>
               </m:accPr>
               <m:e>
                 <m:r>
+                  <w:rPr>
+                    <w:rFonts w:ascii="Cambria Math" w:hAnsi="Cambria Math"/>
+                  </w:rPr>
                   <m:t>h</m:t>
                 </m:r>
               </m:e>
@@ -1205,77 +1581,99 @@
               <m:rPr>
                 <m:sty m:val="p"/>
               </m:rPr>
+              <w:rPr>
+                <w:rFonts w:ascii="Cambria Math" w:hAnsi="Cambria Math"/>
+              </w:rPr>
               <m:t>ⓡ</m:t>
             </m:r>
           </m:sub>
           <m:sup>
             <m:r>
+              <w:rPr>
+                <w:rFonts w:ascii="Cambria Math" w:hAnsi="Cambria Math"/>
+              </w:rPr>
               <m:t>2</m:t>
             </m:r>
           </m:sup>
         </m:sSubSup>
       </m:oMath>
       <w:r>
-        <w:t xml:space="preserve"> </w:t>
-      </w:r>
-      <w:r>
-        <w:t xml:space="preserve">over the</w:t>
-      </w:r>
-      <w:r>
-        <w:t xml:space="preserve"> </w:t>
+        <w:t xml:space="preserve"> over the </w:t>
       </w:r>
       <m:oMath>
         <m:r>
+          <w:rPr>
+            <w:rFonts w:ascii="Cambria Math" w:hAnsi="Cambria Math"/>
+          </w:rPr>
           <m:t>N</m:t>
         </m:r>
       </m:oMath>
       <w:r>
-        <w:t xml:space="preserve"> </w:t>
-      </w:r>
-      <w:r>
-        <w:t xml:space="preserve">markers, squared, divided by the same sum with</w:t>
-      </w:r>
-      <w:r>
-        <w:t xml:space="preserve"> </w:t>
+        <w:t xml:space="preserve"> markers, squared, divided by the same sum with </w:t>
       </w:r>
       <m:oMath>
         <m:sSub>
+          <m:sSubPr>
+            <m:ctrlPr>
+              <w:rPr>
+                <w:rFonts w:ascii="Cambria Math" w:hAnsi="Cambria Math"/>
+              </w:rPr>
+            </m:ctrlPr>
+          </m:sSubPr>
           <m:e>
             <m:r>
+              <w:rPr>
+                <w:rFonts w:ascii="Cambria Math" w:hAnsi="Cambria Math"/>
+              </w:rPr>
               <m:t>e</m:t>
             </m:r>
           </m:e>
           <m:sub>
             <m:r>
+              <w:rPr>
+                <w:rFonts w:ascii="Cambria Math" w:hAnsi="Cambria Math"/>
+              </w:rPr>
               <m:t>f</m:t>
             </m:r>
             <m:r>
               <m:rPr>
                 <m:sty m:val="p"/>
               </m:rPr>
+              <w:rPr>
+                <w:rFonts w:ascii="Cambria Math" w:hAnsi="Cambria Math"/>
+              </w:rPr>
               <m:t>ⓡ</m:t>
             </m:r>
           </m:sub>
         </m:sSub>
       </m:oMath>
       <w:r>
-        <w:t xml:space="preserve"> </w:t>
-      </w:r>
-      <w:r>
-        <w:t xml:space="preserve">replaced by</w:t>
-      </w:r>
-      <w:r>
-        <w:t xml:space="preserve"> </w:t>
+        <w:t xml:space="preserve"> replaced by </w:t>
       </w:r>
       <m:oMath>
         <m:sSub>
+          <m:sSubPr>
+            <m:ctrlPr>
+              <w:rPr>
+                <w:rFonts w:ascii="Cambria Math" w:hAnsi="Cambria Math"/>
+              </w:rPr>
+            </m:ctrlPr>
+          </m:sSubPr>
           <m:e>
             <m:bar>
               <m:barPr>
                 <m:pos m:val="top"/>
+                <m:ctrlPr>
+                  <w:rPr>
+                    <w:rFonts w:ascii="Cambria Math" w:hAnsi="Cambria Math"/>
+                  </w:rPr>
+                </m:ctrlPr>
               </m:barPr>
               <m:e>
                 <m:r>
+                  <w:rPr>
+                    <w:rFonts w:ascii="Cambria Math" w:hAnsi="Cambria Math"/>
+                  </w:rPr>
                   <m:t>e</m:t>
                 </m:r>
               </m:e>
@@ -1283,26 +1681,41 @@
           </m:e>
           <m:sub>
             <m:r>
+              <w:rPr>
+                <w:rFonts w:ascii="Cambria Math" w:hAnsi="Cambria Math"/>
+              </w:rPr>
               <m:t>f</m:t>
             </m:r>
           </m:sub>
         </m:sSub>
       </m:oMath>
       <w:r>
-        <w:t xml:space="preserve">. It is smaller than the heritability explained by the markers themselves because</w:t>
-      </w:r>
-      <w:r>
-        <w:t xml:space="preserve"> </w:t>
+        <w:t xml:space="preserve">. It is smaller than the heritability explained by the markers themselves because </w:t>
       </w:r>
       <m:oMath>
         <m:sSub>
+          <m:sSubPr>
+            <m:ctrlPr>
+              <w:rPr>
+                <w:rFonts w:ascii="Cambria Math" w:hAnsi="Cambria Math"/>
+              </w:rPr>
+            </m:ctrlPr>
+          </m:sSubPr>
           <m:e>
             <m:bar>
               <m:barPr>
                 <m:pos m:val="top"/>
+                <m:ctrlPr>
+                  <w:rPr>
+                    <w:rFonts w:ascii="Cambria Math" w:hAnsi="Cambria Math"/>
+                  </w:rPr>
+                </m:ctrlPr>
               </m:barPr>
               <m:e>
                 <m:r>
+                  <w:rPr>
+                    <w:rFonts w:ascii="Cambria Math" w:hAnsi="Cambria Math"/>
+                  </w:rPr>
                   <m:t>e</m:t>
                 </m:r>
               </m:e>
@@ -1310,16 +1723,27 @@
           </m:e>
           <m:sub>
             <m:r>
+              <w:rPr>
+                <w:rFonts w:ascii="Cambria Math" w:hAnsi="Cambria Math"/>
+              </w:rPr>
               <m:t>f</m:t>
             </m:r>
           </m:sub>
         </m:sSub>
       </m:oMath>
       <w:r>
-        <w:t xml:space="preserve"> </w:t>
-      </w:r>
-      <w:r>
-        <w:t xml:space="preserve">is an estimate.</w:t>
+        <w:t xml:space="preserve"> is an estimate</w:t>
+      </w:r>
+      <w:r>
+        <w:t xml:space="preserve">, and can be thought of as how well we predict heritability in a </w:t>
+      </w:r>
+      <w:proofErr w:type="spellStart"/>
+      <w:r>
+        <w:t>heldout</w:t>
+      </w:r>
+      <w:proofErr w:type="spellEnd"/>
+      <w:r>
+        <w:t xml:space="preserve"> sample where founder allele frequencies are unknown in the selected pool.</w:t>
       </w:r>
     </w:p>
     <w:p>
@@ -1331,7 +1755,8 @@
           <w:i/>
           <w:iCs/>
         </w:rPr>
-        <w:t xml:space="preserve">[Figure legend — REPLACES the current Figure Y legend]</w:t>
+        <w:lastRenderedPageBreak/>
+        <w:t>[Figure legend — REPLACES the current Figure Y legend]</w:t>
       </w:r>
     </w:p>
     <w:p>
@@ -1343,83 +1768,50 @@
           <w:b/>
           <w:bCs/>
         </w:rPr>
-        <w:t xml:space="preserve">Figure Y: Out of sample predictions.</w:t>
-      </w:r>
-      <w:r>
-        <w:t xml:space="preserve"> </w:t>
-      </w:r>
-      <w:r>
-        <w:t xml:space="preserve">A, Founder frequency change at the top 10 markers in nine replicates predicts the change in a tenth, held-out replicate. Colors are founder haplotypes as in Figure 2. The dashed line is the line of identity. B, Heritability as a function of the number of markers used, as a percent of phenotypic variation. The dashed line is the marker-based heritability of the whole genome and the grey band its interquartile range as the footprint width is taken from each peak of Table S1 in turn. The red line is the heritability explained by the best</w:t>
-      </w:r>
-      <w:r>
-        <w:t xml:space="preserve"> </w:t>
+        <w:t>Figure Y: Out of sample predictions.</w:t>
+      </w:r>
+      <w:r>
+        <w:t xml:space="preserve"> A, Founder frequency change at the top 10 markers in nine replicates predicts the change in a tenth, held-out replicate. Colors are founder haplotypes as in Figure 2. The dashed line is the line of identity. B, Heritability as a function of the number of markers used, as a percent of phenotypic variation. The dashed line is the marker-based heritability of the whole genome and the grey band its interquartile range as the footprint width is taken from each peak of Table S1 in turn. The red line is the heritability explained by the best </w:t>
       </w:r>
       <w:r>
         <w:rPr>
           <w:i/>
           <w:iCs/>
         </w:rPr>
-        <w:t xml:space="preserve">N</w:t>
-      </w:r>
-      <w:r>
-        <w:t xml:space="preserve"> </w:t>
-      </w:r>
-      <w:r>
-        <w:t xml:space="preserve">markers, with the markers chosen in five replicates, their effects estimated in four others, and the heritability they explain estimated in the held-out replicate. The blue line is the heritability an</w:t>
-      </w:r>
-      <w:r>
-        <w:t xml:space="preserve"> </w:t>
+        <w:t>N</w:t>
+      </w:r>
+      <w:r>
+        <w:t xml:space="preserve"> markers, with the markers chosen in five replicates, their effects estimated in four others, and the heritability they explain estimated in the held-out replicate. The blue line is the heritability an </w:t>
       </w:r>
       <w:r>
         <w:rPr>
           <w:i/>
           <w:iCs/>
         </w:rPr>
-        <w:t xml:space="preserve">N</w:t>
-      </w:r>
-      <w:r>
-        <w:t xml:space="preserve">-marker predictor built on nine replicates explains in the held-out replicate, with the lighter blue lines each individual replicate.</w:t>
+        <w:t>N</w:t>
+      </w:r>
+      <w:r>
+        <w:t>-marker predictor built on nine replicates explains in the held-out replicate, with the lighter blue lines each individual replicate.</w:t>
       </w:r>
     </w:p>
     <w:sectPr>
-      <w:pgSz w:h="15840" w:w="12240"/>
-      <w:pgMar w:bottom="1440" w:footer="720" w:gutter="0" w:header="720" w:left="1440" w:right="1440" w:top="1440"/>
       <w:footnotePr>
         <w:numRestart w:val="eachSect"/>
       </w:footnotePr>
+      <w:pgSz w:w="12240" w:h="15840"/>
+      <w:pgMar w:top="1440" w:right="1440" w:bottom="1440" w:left="1440" w:header="720" w:footer="720" w:gutter="0"/>
+      <w:cols w:space="720"/>
     </w:sectPr>
   </w:body>
 </w:document>
 </file>
 
-<file path=word/comments.xml><?xml version="1.0" encoding="utf-8"?>
-<w:comments xmlns:w="http://schemas.openxmlformats.org/wordprocessingml/2006/main" xmlns:m="http://schemas.openxmlformats.org/officeDocument/2006/math" xmlns:r="http://schemas.openxmlformats.org/officeDocument/2006/relationships" xmlns:o="urn:schemas-microsoft-com:office:office" xmlns:v="urn:schemas-microsoft-com:vml" xmlns:w10="urn:schemas-microsoft-com:office:word" xmlns:a="http://schemas.openxmlformats.org/drawingml/2006/main" xmlns:pic="http://schemas.openxmlformats.org/drawingml/2006/picture" xmlns:wp="http://schemas.openxmlformats.org/drawingml/2006/wordprocessingDrawing"/>
-</file>
-
-<file path=word/footnotes.xml><?xml version="1.0" encoding="utf-8"?>
-<w:footnotes xmlns:w="http://schemas.openxmlformats.org/wordprocessingml/2006/main" xmlns:m="http://schemas.openxmlformats.org/officeDocument/2006/math" xmlns:r="http://schemas.openxmlformats.org/officeDocument/2006/relationships" xmlns:o="urn:schemas-microsoft-com:office:office" xmlns:v="urn:schemas-microsoft-com:vml" xmlns:w10="urn:schemas-microsoft-com:office:word" xmlns:a="http://schemas.openxmlformats.org/drawingml/2006/main" xmlns:pic="http://schemas.openxmlformats.org/drawingml/2006/picture" xmlns:wp="http://schemas.openxmlformats.org/drawingml/2006/wordprocessingDrawing">
-  <w:footnote w:type="continuationSeparator" w:id="0">
-    <w:p>
-      <w:r>
-        <w:continuationSeparator/>
-      </w:r>
-    </w:p>
-  </w:footnote>
-  <w:footnote w:type="separator" w:id="-1">
-    <w:p>
-      <w:r>
-        <w:separator/>
-      </w:r>
-    </w:p>
-  </w:footnote>
-</w:footnotes>
-</file>
-
 <file path=word/numbering.xml><?xml version="1.0" encoding="utf-8"?>
-<w:numbering xmlns:w="http://schemas.openxmlformats.org/wordprocessingml/2006/main">
-  <w:abstractNum w:abstractNumId="990">
+<w:numbering xmlns:wpc="http://schemas.microsoft.com/office/word/2010/wordprocessingCanvas" xmlns:cx="http://schemas.microsoft.com/office/drawing/2014/chartex" xmlns:cx1="http://schemas.microsoft.com/office/drawing/2015/9/8/chartex" xmlns:cx2="http://schemas.microsoft.com/office/drawing/2015/10/21/chartex" xmlns:cx3="http://schemas.microsoft.com/office/drawing/2016/5/9/chartex" xmlns:cx4="http://schemas.microsoft.com/office/drawing/2016/5/10/chartex" xmlns:cx5="http://schemas.microsoft.com/office/drawing/2016/5/11/chartex" xmlns:cx6="http://schemas.microsoft.com/office/drawing/2016/5/12/chartex" xmlns:cx7="http://schemas.microsoft.com/office/drawing/2016/5/13/chartex" xmlns:cx8="http://schemas.microsoft.com/office/drawing/2016/5/14/chartex" xmlns:mc="http://schemas.openxmlformats.org/markup-compatibility/2006" xmlns:m="http://schemas.openxmlformats.org/officeDocument/2006/math" xmlns:aink="http://schemas.microsoft.com/office/drawing/2016/ink" xmlns:am3d="http://schemas.microsoft.com/office/drawing/2017/model3d" xmlns:oel="http://schemas.microsoft.com/office/2019/extlst" xmlns:r="http://schemas.openxmlformats.org/officeDocument/2006/relationships" xmlns:wp14="http://schemas.microsoft.com/office/word/2010/wordprocessingDrawing" xmlns:wp="http://schemas.openxmlformats.org/drawingml/2006/wordprocessingDrawing" xmlns:wpg="http://schemas.microsoft.com/office/word/2010/wordprocessingGroup" xmlns:wpi="http://schemas.microsoft.com/office/word/2010/wordprocessingInk" xmlns:wps="http://schemas.microsoft.com/office/word/2010/wordprocessingShape" xmlns:o="urn:schemas-microsoft-com:office:office" xmlns:v="urn:schemas-microsoft-com:vml" xmlns:w10="urn:schemas-microsoft-com:office:word" xmlns:w="http://schemas.openxmlformats.org/wordprocessingml/2006/main" xmlns:w14="http://schemas.microsoft.com/office/word/2010/wordml" xmlns:w15="http://schemas.microsoft.com/office/word/2012/wordml" xmlns:w16cex="http://schemas.microsoft.com/office/word/2018/wordml/cex" xmlns:w16cid="http://schemas.microsoft.com/office/word/2016/wordml/cid" xmlns:w16="http://schemas.microsoft.com/office/word/2018/wordml" xmlns:w16sdtdh="http://schemas.microsoft.com/office/word/2020/wordml/sdtdatahash" xmlns:w16sdtfl="http://schemas.microsoft.com/office/word/2024/wordml/sdtformatlock" xmlns:w16se="http://schemas.microsoft.com/office/word/2015/wordml/symex" xmlns:w16du="http://schemas.microsoft.com/office/word/2023/wordml/word16du" xmlns:wne="http://schemas.microsoft.com/office/word/2006/wordml" mc:Ignorable="w14 w15 w16se w16cid w16 w16cex w16sdtdh w16sdtfl w16du wp14">
+  <w:abstractNum w:abstractNumId="0" w15:restartNumberingAfterBreak="0">
     <w:nsid w:val="0000A990"/>
     <w:multiLevelType w:val="multilevel"/>
+    <w:tmpl w:val="B19090AE"/>
     <w:lvl w:ilvl="0">
       <w:numFmt w:val="bullet"/>
       <w:lvlText w:val=" "/>
@@ -1493,21 +1885,21 @@
       </w:pPr>
     </w:lvl>
   </w:abstractNum>
-  <w:num w:numId="1000">
-    <w:abstractNumId w:val="990"/>
+  <w:num w:numId="1" w16cid:durableId="1615290528">
+    <w:abstractNumId w:val="0"/>
   </w:num>
 </w:numbering>
 </file>
 
 <file path=word/styles.xml><?xml version="1.0" encoding="utf-8"?>
-<w:styles xmlns:r="http://schemas.openxmlformats.org/officeDocument/2006/relationships" xmlns:w="http://schemas.openxmlformats.org/wordprocessingml/2006/main">
+<w:styles xmlns:mc="http://schemas.openxmlformats.org/markup-compatibility/2006" xmlns:r="http://schemas.openxmlformats.org/officeDocument/2006/relationships" xmlns:w="http://schemas.openxmlformats.org/wordprocessingml/2006/main" xmlns:w14="http://schemas.microsoft.com/office/word/2010/wordml" xmlns:w15="http://schemas.microsoft.com/office/word/2012/wordml" xmlns:w16cex="http://schemas.microsoft.com/office/word/2018/wordml/cex" xmlns:w16cid="http://schemas.microsoft.com/office/word/2016/wordml/cid" xmlns:w16="http://schemas.microsoft.com/office/word/2018/wordml" xmlns:w16sdtdh="http://schemas.microsoft.com/office/word/2020/wordml/sdtdatahash" xmlns:w16sdtfl="http://schemas.microsoft.com/office/word/2024/wordml/sdtformatlock" xmlns:w16se="http://schemas.microsoft.com/office/word/2015/wordml/symex" xmlns:w16du="http://schemas.microsoft.com/office/word/2023/wordml/word16du" mc:Ignorable="w14 w15 w16se w16cid w16 w16cex w16sdtdh w16sdtfl w16du">
   <w:docDefaults>
     <w:rPrDefault>
       <w:rPr>
-        <w:rFonts w:asciiTheme="minorHAnsi" w:cstheme="minorBidi" w:eastAsiaTheme="minorEastAsia" w:hAnsiTheme="minorHAnsi"/>
+        <w:rFonts w:asciiTheme="minorHAnsi" w:eastAsiaTheme="minorEastAsia" w:hAnsiTheme="minorHAnsi" w:cstheme="minorBidi"/>
         <w:sz w:val="24"/>
         <w:szCs w:val="24"/>
-        <w:lang w:bidi="ar-SA" w:eastAsia="zh-CN" w:val="en-US"/>
+        <w:lang w:val="en-US" w:eastAsia="zh-CN" w:bidi="ar-SA"/>
       </w:rPr>
     </w:rPrDefault>
     <w:pPrDefault>
@@ -1516,168 +1908,255 @@
       </w:pPr>
     </w:pPrDefault>
   </w:docDefaults>
-  <w:latentStyles w:count="276" w:defLockedState="0" w:defQFormat="0" w:defSemiHidden="0" w:defUIPriority="0" w:defUnhideWhenUsed="0"/>
-  <w:style w:default="1" w:styleId="Normal" w:type="paragraph">
+  <w:latentStyles w:defLockedState="0" w:defUIPriority="0" w:defSemiHidden="0" w:defUnhideWhenUsed="0" w:defQFormat="0" w:count="376">
+    <w:lsdException w:name="Normal Table" w:semiHidden="1" w:unhideWhenUsed="1"/>
+    <w:lsdException w:name="Table Simple 1" w:semiHidden="1" w:unhideWhenUsed="1"/>
+    <w:lsdException w:name="Table Simple 2" w:semiHidden="1" w:unhideWhenUsed="1"/>
+    <w:lsdException w:name="Table Simple 3" w:semiHidden="1" w:unhideWhenUsed="1"/>
+    <w:lsdException w:name="Table Classic 1" w:semiHidden="1" w:unhideWhenUsed="1"/>
+    <w:lsdException w:name="Table Classic 2" w:semiHidden="1" w:unhideWhenUsed="1"/>
+    <w:lsdException w:name="Table Classic 3" w:semiHidden="1" w:unhideWhenUsed="1"/>
+    <w:lsdException w:name="Table Classic 4" w:semiHidden="1" w:unhideWhenUsed="1"/>
+    <w:lsdException w:name="Table Colorful 1" w:semiHidden="1" w:unhideWhenUsed="1"/>
+    <w:lsdException w:name="Table Colorful 2" w:semiHidden="1" w:unhideWhenUsed="1"/>
+    <w:lsdException w:name="Table Colorful 3" w:semiHidden="1" w:unhideWhenUsed="1"/>
+    <w:lsdException w:name="Table Columns 1" w:semiHidden="1" w:unhideWhenUsed="1"/>
+    <w:lsdException w:name="Table Columns 2" w:semiHidden="1" w:unhideWhenUsed="1"/>
+    <w:lsdException w:name="Table Columns 3" w:semiHidden="1" w:unhideWhenUsed="1"/>
+    <w:lsdException w:name="Table Columns 4" w:semiHidden="1" w:unhideWhenUsed="1"/>
+    <w:lsdException w:name="Table Columns 5" w:semiHidden="1" w:unhideWhenUsed="1"/>
+    <w:lsdException w:name="Table Grid 1" w:semiHidden="1" w:unhideWhenUsed="1"/>
+    <w:lsdException w:name="Table Grid 2" w:semiHidden="1" w:unhideWhenUsed="1"/>
+    <w:lsdException w:name="Table Grid 3" w:semiHidden="1" w:unhideWhenUsed="1"/>
+    <w:lsdException w:name="Table Grid 4" w:semiHidden="1" w:unhideWhenUsed="1"/>
+    <w:lsdException w:name="Table Grid 5" w:semiHidden="1" w:unhideWhenUsed="1"/>
+    <w:lsdException w:name="Table Grid 6" w:semiHidden="1" w:unhideWhenUsed="1"/>
+    <w:lsdException w:name="Table Grid 7" w:semiHidden="1" w:unhideWhenUsed="1"/>
+    <w:lsdException w:name="Table Grid 8" w:semiHidden="1" w:unhideWhenUsed="1"/>
+    <w:lsdException w:name="Table List 1" w:semiHidden="1" w:unhideWhenUsed="1"/>
+    <w:lsdException w:name="Table List 2" w:semiHidden="1" w:unhideWhenUsed="1"/>
+    <w:lsdException w:name="Table List 3" w:semiHidden="1" w:unhideWhenUsed="1"/>
+    <w:lsdException w:name="Table List 4" w:semiHidden="1" w:unhideWhenUsed="1"/>
+    <w:lsdException w:name="Table List 5" w:semiHidden="1" w:unhideWhenUsed="1"/>
+    <w:lsdException w:name="Table List 6" w:semiHidden="1" w:unhideWhenUsed="1"/>
+    <w:lsdException w:name="Table List 7" w:semiHidden="1" w:unhideWhenUsed="1"/>
+    <w:lsdException w:name="Table List 8" w:semiHidden="1" w:unhideWhenUsed="1"/>
+    <w:lsdException w:name="Table 3D effects 1" w:semiHidden="1" w:unhideWhenUsed="1"/>
+    <w:lsdException w:name="Table 3D effects 2" w:semiHidden="1" w:unhideWhenUsed="1"/>
+    <w:lsdException w:name="Table 3D effects 3" w:semiHidden="1" w:unhideWhenUsed="1"/>
+    <w:lsdException w:name="Table Contemporary" w:semiHidden="1" w:unhideWhenUsed="1"/>
+    <w:lsdException w:name="Table Elegant" w:semiHidden="1" w:unhideWhenUsed="1"/>
+    <w:lsdException w:name="Table Professional" w:semiHidden="1" w:unhideWhenUsed="1"/>
+    <w:lsdException w:name="Table Subtle 1" w:semiHidden="1" w:unhideWhenUsed="1"/>
+    <w:lsdException w:name="Table Subtle 2" w:semiHidden="1" w:unhideWhenUsed="1"/>
+    <w:lsdException w:name="Table Web 1" w:semiHidden="1" w:unhideWhenUsed="1"/>
+    <w:lsdException w:name="Table Web 2" w:semiHidden="1" w:unhideWhenUsed="1"/>
+    <w:lsdException w:name="Table Web 3" w:semiHidden="1" w:unhideWhenUsed="1"/>
+    <w:lsdException w:name="Table Theme" w:semiHidden="1" w:unhideWhenUsed="1"/>
+    <w:lsdException w:name="Light Shading"/>
+    <w:lsdException w:name="Light List"/>
+    <w:lsdException w:name="Light Grid"/>
+    <w:lsdException w:name="Medium Shading 1"/>
+    <w:lsdException w:name="Medium Shading 2"/>
+    <w:lsdException w:name="Medium List 1"/>
+    <w:lsdException w:name="Medium List 2"/>
+    <w:lsdException w:name="Medium Grid 1"/>
+    <w:lsdException w:name="Medium Grid 2"/>
+    <w:lsdException w:name="Medium Grid 3"/>
+    <w:lsdException w:name="Dark List"/>
+    <w:lsdException w:name="Colorful Shading"/>
+    <w:lsdException w:name="Colorful List"/>
+    <w:lsdException w:name="Colorful Grid"/>
+    <w:lsdException w:name="Light Shading Accent 1"/>
+    <w:lsdException w:name="Light List Accent 1"/>
+    <w:lsdException w:name="Light Grid Accent 1"/>
+    <w:lsdException w:name="Medium Shading 1 Accent 1"/>
+    <w:lsdException w:name="Medium Shading 2 Accent 1"/>
+    <w:lsdException w:name="Medium List 1 Accent 1"/>
+    <w:lsdException w:name="Medium List 2 Accent 1"/>
+    <w:lsdException w:name="Medium Grid 1 Accent 1"/>
+    <w:lsdException w:name="Medium Grid 2 Accent 1"/>
+    <w:lsdException w:name="Medium Grid 3 Accent 1"/>
+    <w:lsdException w:name="Dark List Accent 1"/>
+    <w:lsdException w:name="Colorful Shading Accent 1"/>
+    <w:lsdException w:name="Colorful List Accent 1"/>
+    <w:lsdException w:name="Colorful Grid Accent 1"/>
+    <w:lsdException w:name="Light Shading Accent 2"/>
+    <w:lsdException w:name="Light List Accent 2"/>
+    <w:lsdException w:name="Light Grid Accent 2"/>
+    <w:lsdException w:name="Medium Shading 1 Accent 2"/>
+    <w:lsdException w:name="Medium Shading 2 Accent 2"/>
+    <w:lsdException w:name="Medium List 1 Accent 2"/>
+    <w:lsdException w:name="Medium List 2 Accent 2"/>
+    <w:lsdException w:name="Medium Grid 1 Accent 2"/>
+    <w:lsdException w:name="Medium Grid 2 Accent 2"/>
+    <w:lsdException w:name="Medium Grid 3 Accent 2"/>
+    <w:lsdException w:name="Dark List Accent 2"/>
+    <w:lsdException w:name="Colorful Shading Accent 2"/>
+    <w:lsdException w:name="Colorful List Accent 2"/>
+    <w:lsdException w:name="Colorful Grid Accent 2"/>
+    <w:lsdException w:name="Light Shading Accent 3"/>
+    <w:lsdException w:name="Light List Accent 3"/>
+    <w:lsdException w:name="Light Grid Accent 3"/>
+    <w:lsdException w:name="Medium Shading 1 Accent 3"/>
+    <w:lsdException w:name="Medium Shading 2 Accent 3"/>
+    <w:lsdException w:name="Medium List 1 Accent 3"/>
+    <w:lsdException w:name="Medium List 2 Accent 3"/>
+    <w:lsdException w:name="Medium Grid 1 Accent 3"/>
+    <w:lsdException w:name="Medium Grid 2 Accent 3"/>
+    <w:lsdException w:name="Medium Grid 3 Accent 3"/>
+    <w:lsdException w:name="Dark List Accent 3"/>
+    <w:lsdException w:name="Colorful Shading Accent 3"/>
+    <w:lsdException w:name="Colorful List Accent 3"/>
+    <w:lsdException w:name="Colorful Grid Accent 3"/>
+    <w:lsdException w:name="Light Shading Accent 4"/>
+    <w:lsdException w:name="Light List Accent 4"/>
+    <w:lsdException w:name="Light Grid Accent 4"/>
+    <w:lsdException w:name="Medium Shading 1 Accent 4"/>
+    <w:lsdException w:name="Medium Shading 2 Accent 4"/>
+    <w:lsdException w:name="Medium List 1 Accent 4"/>
+    <w:lsdException w:name="Medium List 2 Accent 4"/>
+    <w:lsdException w:name="Medium Grid 1 Accent 4"/>
+    <w:lsdException w:name="Medium Grid 2 Accent 4"/>
+    <w:lsdException w:name="Medium Grid 3 Accent 4"/>
+    <w:lsdException w:name="Dark List Accent 4"/>
+    <w:lsdException w:name="Colorful Shading Accent 4"/>
+    <w:lsdException w:name="Colorful List Accent 4"/>
+    <w:lsdException w:name="Colorful Grid Accent 4"/>
+    <w:lsdException w:name="Light Shading Accent 5"/>
+    <w:lsdException w:name="Light List Accent 5"/>
+    <w:lsdException w:name="Light Grid Accent 5"/>
+    <w:lsdException w:name="Medium Shading 1 Accent 5"/>
+    <w:lsdException w:name="Medium Shading 2 Accent 5"/>
+    <w:lsdException w:name="Medium List 1 Accent 5"/>
+    <w:lsdException w:name="Medium List 2 Accent 5"/>
+    <w:lsdException w:name="Medium Grid 1 Accent 5"/>
+    <w:lsdException w:name="Medium Grid 2 Accent 5"/>
+    <w:lsdException w:name="Medium Grid 3 Accent 5"/>
+    <w:lsdException w:name="Dark List Accent 5"/>
+    <w:lsdException w:name="Colorful Shading Accent 5"/>
+    <w:lsdException w:name="Colorful List Accent 5"/>
+    <w:lsdException w:name="Colorful Grid Accent 5"/>
+    <w:lsdException w:name="Light Shading Accent 6"/>
+    <w:lsdException w:name="Light List Accent 6"/>
+    <w:lsdException w:name="Light Grid Accent 6"/>
+    <w:lsdException w:name="Medium Shading 1 Accent 6"/>
+    <w:lsdException w:name="Medium Shading 2 Accent 6"/>
+    <w:lsdException w:name="Medium List 1 Accent 6"/>
+    <w:lsdException w:name="Medium List 2 Accent 6"/>
+    <w:lsdException w:name="Medium Grid 1 Accent 6"/>
+    <w:lsdException w:name="Medium Grid 2 Accent 6"/>
+    <w:lsdException w:name="Medium Grid 3 Accent 6"/>
+    <w:lsdException w:name="Dark List Accent 6"/>
+    <w:lsdException w:name="Colorful Shading Accent 6"/>
+    <w:lsdException w:name="Colorful List Accent 6"/>
+    <w:lsdException w:name="Colorful Grid Accent 6"/>
+    <w:lsdException w:name="Grid Table 4" w:uiPriority="49"/>
+    <w:lsdException w:name="Grid Table 5 Dark" w:uiPriority="50"/>
+    <w:lsdException w:name="Grid Table 6 Colorful" w:uiPriority="51"/>
+    <w:lsdException w:name="Grid Table 7 Colorful" w:uiPriority="52"/>
+    <w:lsdException w:name="Grid Table 1 Light Accent 1" w:uiPriority="46"/>
+    <w:lsdException w:name="Grid Table 2 Accent 1" w:uiPriority="47"/>
+    <w:lsdException w:name="Grid Table 3 Accent 1" w:uiPriority="48"/>
+    <w:lsdException w:name="Grid Table 4 Accent 1" w:uiPriority="49"/>
+    <w:lsdException w:name="Grid Table 5 Dark Accent 1" w:uiPriority="50"/>
+    <w:lsdException w:name="Grid Table 6 Colorful Accent 1" w:uiPriority="51"/>
+    <w:lsdException w:name="Grid Table 7 Colorful Accent 1" w:uiPriority="52"/>
+    <w:lsdException w:name="Grid Table 1 Light Accent 2" w:uiPriority="46"/>
+    <w:lsdException w:name="Grid Table 2 Accent 2" w:uiPriority="47"/>
+    <w:lsdException w:name="Grid Table 3 Accent 2" w:uiPriority="48"/>
+    <w:lsdException w:name="Grid Table 4 Accent 2" w:uiPriority="49"/>
+    <w:lsdException w:name="Grid Table 5 Dark Accent 2" w:uiPriority="50"/>
+    <w:lsdException w:name="Grid Table 6 Colorful Accent 2" w:uiPriority="51"/>
+    <w:lsdException w:name="Grid Table 7 Colorful Accent 2" w:uiPriority="52"/>
+    <w:lsdException w:name="Grid Table 1 Light Accent 3" w:uiPriority="46"/>
+    <w:lsdException w:name="Grid Table 2 Accent 3" w:uiPriority="47"/>
+    <w:lsdException w:name="Grid Table 3 Accent 3" w:uiPriority="48"/>
+    <w:lsdException w:name="Grid Table 4 Accent 3" w:uiPriority="49"/>
+    <w:lsdException w:name="Grid Table 5 Dark Accent 3" w:uiPriority="50"/>
+    <w:lsdException w:name="Grid Table 6 Colorful Accent 3" w:uiPriority="51"/>
+    <w:lsdException w:name="Grid Table 7 Colorful Accent 3" w:uiPriority="52"/>
+    <w:lsdException w:name="Grid Table 1 Light Accent 4" w:uiPriority="46"/>
+    <w:lsdException w:name="Grid Table 2 Accent 4" w:uiPriority="47"/>
+    <w:lsdException w:name="Grid Table 3 Accent 4" w:uiPriority="48"/>
+    <w:lsdException w:name="Grid Table 4 Accent 4" w:uiPriority="49"/>
+    <w:lsdException w:name="Grid Table 5 Dark Accent 4" w:uiPriority="50"/>
+    <w:lsdException w:name="Grid Table 6 Colorful Accent 4" w:uiPriority="51"/>
+    <w:lsdException w:name="Grid Table 7 Colorful Accent 4" w:uiPriority="52"/>
+    <w:lsdException w:name="Grid Table 1 Light Accent 5" w:uiPriority="46"/>
+    <w:lsdException w:name="Grid Table 2 Accent 5" w:uiPriority="47"/>
+    <w:lsdException w:name="Grid Table 3 Accent 5" w:uiPriority="48"/>
+    <w:lsdException w:name="Grid Table 4 Accent 5" w:uiPriority="49"/>
+    <w:lsdException w:name="Grid Table 5 Dark Accent 5" w:uiPriority="50"/>
+    <w:lsdException w:name="Grid Table 6 Colorful Accent 5" w:uiPriority="51"/>
+    <w:lsdException w:name="Grid Table 7 Colorful Accent 5" w:uiPriority="52"/>
+    <w:lsdException w:name="Grid Table 1 Light Accent 6" w:uiPriority="46"/>
+    <w:lsdException w:name="Grid Table 2 Accent 6" w:uiPriority="47"/>
+    <w:lsdException w:name="Grid Table 3 Accent 6" w:uiPriority="48"/>
+    <w:lsdException w:name="Grid Table 4 Accent 6" w:uiPriority="49"/>
+    <w:lsdException w:name="Grid Table 5 Dark Accent 6" w:uiPriority="50"/>
+    <w:lsdException w:name="Grid Table 6 Colorful Accent 6" w:uiPriority="51"/>
+    <w:lsdException w:name="Grid Table 7 Colorful Accent 6" w:uiPriority="52"/>
+    <w:lsdException w:name="List Table 1 Light" w:uiPriority="46"/>
+    <w:lsdException w:name="List Table 2" w:uiPriority="47"/>
+    <w:lsdException w:name="List Table 3" w:uiPriority="48"/>
+    <w:lsdException w:name="List Table 4" w:uiPriority="49"/>
+    <w:lsdException w:name="List Table 5 Dark" w:uiPriority="50"/>
+    <w:lsdException w:name="List Table 6 Colorful" w:uiPriority="51"/>
+    <w:lsdException w:name="List Table 7 Colorful" w:uiPriority="52"/>
+    <w:lsdException w:name="List Table 1 Light Accent 1" w:uiPriority="46"/>
+    <w:lsdException w:name="List Table 2 Accent 1" w:uiPriority="47"/>
+    <w:lsdException w:name="List Table 3 Accent 1" w:uiPriority="48"/>
+    <w:lsdException w:name="List Table 4 Accent 1" w:uiPriority="49"/>
+    <w:lsdException w:name="List Table 5 Dark Accent 1" w:uiPriority="50"/>
+    <w:lsdException w:name="List Table 6 Colorful Accent 1" w:uiPriority="51"/>
+    <w:lsdException w:name="List Table 7 Colorful Accent 1" w:uiPriority="52"/>
+    <w:lsdException w:name="List Table 1 Light Accent 2" w:uiPriority="46"/>
+    <w:lsdException w:name="List Table 2 Accent 2" w:uiPriority="47"/>
+    <w:lsdException w:name="List Table 3 Accent 2" w:uiPriority="48"/>
+    <w:lsdException w:name="List Table 4 Accent 2" w:uiPriority="49"/>
+    <w:lsdException w:name="List Table 5 Dark Accent 2" w:uiPriority="50"/>
+    <w:lsdException w:name="List Table 6 Colorful Accent 2" w:uiPriority="51"/>
+    <w:lsdException w:name="List Table 7 Colorful Accent 2" w:uiPriority="52"/>
+    <w:lsdException w:name="List Table 1 Light Accent 3" w:uiPriority="46"/>
+    <w:lsdException w:name="List Table 2 Accent 3" w:uiPriority="47"/>
+    <w:lsdException w:name="List Table 3 Accent 3" w:uiPriority="48"/>
+    <w:lsdException w:name="List Table 4 Accent 3" w:uiPriority="49"/>
+    <w:lsdException w:name="List Table 5 Dark Accent 3" w:uiPriority="50"/>
+    <w:lsdException w:name="List Table 6 Colorful Accent 3" w:uiPriority="51"/>
+    <w:lsdException w:name="List Table 7 Colorful Accent 3" w:uiPriority="52"/>
+    <w:lsdException w:name="List Table 1 Light Accent 4" w:uiPriority="46"/>
+    <w:lsdException w:name="List Table 2 Accent 4" w:uiPriority="47"/>
+    <w:lsdException w:name="List Table 3 Accent 4" w:uiPriority="48"/>
+    <w:lsdException w:name="List Table 4 Accent 4" w:uiPriority="49"/>
+    <w:lsdException w:name="List Table 5 Dark Accent 4" w:uiPriority="50"/>
+    <w:lsdException w:name="List Table 6 Colorful Accent 4" w:uiPriority="51"/>
+    <w:lsdException w:name="List Table 7 Colorful Accent 4" w:uiPriority="52"/>
+    <w:lsdException w:name="List Table 1 Light Accent 5" w:uiPriority="46"/>
+    <w:lsdException w:name="List Table 2 Accent 5" w:uiPriority="47"/>
+    <w:lsdException w:name="List Table 3 Accent 5" w:uiPriority="48"/>
+    <w:lsdException w:name="List Table 4 Accent 5" w:uiPriority="49"/>
+    <w:lsdException w:name="List Table 5 Dark Accent 5" w:uiPriority="50"/>
+    <w:lsdException w:name="List Table 6 Colorful Accent 5" w:uiPriority="51"/>
+    <w:lsdException w:name="List Table 7 Colorful Accent 5" w:uiPriority="52"/>
+    <w:lsdException w:name="List Table 1 Light Accent 6" w:uiPriority="46"/>
+    <w:lsdException w:name="List Table 2 Accent 6" w:uiPriority="47"/>
+    <w:lsdException w:name="List Table 3 Accent 6" w:uiPriority="48"/>
+    <w:lsdException w:name="List Table 4 Accent 6" w:uiPriority="49"/>
+    <w:lsdException w:name="List Table 5 Dark Accent 6" w:uiPriority="50"/>
+    <w:lsdException w:name="List Table 6 Colorful Accent 6" w:uiPriority="51"/>
+    <w:lsdException w:name="List Table 7 Colorful Accent 6" w:uiPriority="52"/>
+    <w:lsdException w:name="Mention" w:semiHidden="1" w:uiPriority="99" w:unhideWhenUsed="1"/>
+    <w:lsdException w:name="Smart Hyperlink" w:semiHidden="1" w:uiPriority="99" w:unhideWhenUsed="1"/>
+    <w:lsdException w:name="Hashtag" w:semiHidden="1" w:uiPriority="99" w:unhideWhenUsed="1"/>
+    <w:lsdException w:name="Unresolved Mention" w:semiHidden="1" w:uiPriority="99" w:unhideWhenUsed="1"/>
+    <w:lsdException w:name="Smart Link" w:semiHidden="1" w:uiPriority="99" w:unhideWhenUsed="1"/>
+  </w:latentStyles>
+  <w:style w:type="paragraph" w:default="1" w:styleId="Normal">
     <w:name w:val="Normal"/>
     <w:qFormat/>
   </w:style>
-  <w:style w:styleId="BodyText" w:type="paragraph">
-    <w:name w:val="Body Text"/>
-    <w:basedOn w:val="Normal"/>
-    <w:link w:val="BodyTextChar"/>
-    <w:qFormat/>
-    <w:pPr>
-      <w:spacing w:after="180" w:before="180"/>
-    </w:pPr>
-  </w:style>
-  <w:style w:customStyle="1" w:styleId="FirstParagraph" w:type="paragraph">
-    <w:name w:val="First Paragraph"/>
-    <w:basedOn w:val="BodyText"/>
-    <w:next w:val="BodyText"/>
-    <w:qFormat/>
-  </w:style>
-  <w:style w:customStyle="1" w:styleId="Compact" w:type="paragraph">
-    <w:name w:val="Compact"/>
-    <w:basedOn w:val="BodyText"/>
-    <w:qFormat/>
-    <w:pPr>
-      <w:spacing w:after="36" w:before="36"/>
-    </w:pPr>
-  </w:style>
-  <w:style w:styleId="Title" w:type="paragraph">
-    <w:name w:val="Title"/>
-    <w:basedOn w:val="Normal"/>
-    <w:next w:val="BodyText"/>
-    <w:link w:val="TitleChar"/>
-    <w:uiPriority w:val="10"/>
-    <w:qFormat/>
-    <w:rsid w:val="00A10FD9"/>
-    <w:pPr>
-      <w:spacing w:after="80" w:line="240" w:lineRule="auto"/>
-      <w:contextualSpacing/>
-      <w:jc w:val="center"/>
-    </w:pPr>
-    <w:rPr>
-      <w:rFonts w:asciiTheme="majorHAnsi" w:cstheme="majorBidi" w:eastAsiaTheme="majorEastAsia" w:hAnsiTheme="majorHAnsi"/>
-      <w:sz w:val="56"/>
-      <w:szCs w:val="56"/>
-    </w:rPr>
-  </w:style>
-  <w:style w:customStyle="1" w:styleId="TitleChar" w:type="character">
-    <w:name w:val="Title Char"/>
-    <w:basedOn w:val="DefaultParagraphFont"/>
-    <w:link w:val="Title"/>
-    <w:uiPriority w:val="10"/>
-    <w:rsid w:val="00A10FD9"/>
-    <w:rPr>
-      <w:rFonts w:asciiTheme="majorHAnsi" w:cstheme="majorBidi" w:eastAsiaTheme="majorEastAsia" w:hAnsiTheme="majorHAnsi"/>
-      <w:sz w:val="56"/>
-      <w:szCs w:val="56"/>
-    </w:rPr>
-  </w:style>
-  <w:style w:styleId="Subtitle" w:type="paragraph">
-    <w:name w:val="Subtitle"/>
-    <w:basedOn w:val="Title"/>
-    <w:next w:val="BodyText"/>
-    <w:link w:val="SubtitleChar"/>
-    <w:uiPriority w:val="11"/>
-    <w:qFormat/>
-    <w:rsid w:val="00A10FD9"/>
-    <w:pPr>
-      <w:numPr>
-        <w:ilvl w:val="1"/>
-      </w:numPr>
-    </w:pPr>
-    <w:rPr>
-      <w:rFonts w:cstheme="majorBidi" w:eastAsiaTheme="majorEastAsia"/>
-      <w:spacing w:val="15"/>
-      <w:sz w:val="28"/>
-      <w:szCs w:val="28"/>
-    </w:rPr>
-  </w:style>
-  <w:style w:customStyle="1" w:styleId="SubtitleChar" w:type="character">
-    <w:name w:val="Subtitle Char"/>
-    <w:basedOn w:val="DefaultParagraphFont"/>
-    <w:link w:val="Subtitle"/>
-    <w:uiPriority w:val="11"/>
-    <w:rsid w:val="00A10FD9"/>
-    <w:rPr>
-      <w:rFonts w:cstheme="majorBidi" w:eastAsiaTheme="majorEastAsia"/>
-      <w:color w:themeColor="text1" w:themeTint="A6" w:val="595959"/>
-      <w:spacing w:val="15"/>
-      <w:sz w:val="28"/>
-      <w:szCs w:val="28"/>
-    </w:rPr>
-  </w:style>
-  <w:style w:customStyle="1" w:styleId="Author" w:type="paragraph">
-    <w:name w:val="Author"/>
-    <w:basedOn w:val="Title"/>
-    <w:next w:val="BodyText"/>
-    <w:qFormat/>
-    <w:pPr>
-      <w:keepNext/>
-      <w:keepLines/>
-    </w:pPr>
-    <w:rPr>
-      <w:sz w:val="24"/>
-      <w:szCs w:val="24"/>
-    </w:rPr>
-  </w:style>
-  <w:style w:styleId="Date" w:type="paragraph">
-    <w:name w:val="Date"/>
-    <w:basedOn w:val="Title"/>
-    <w:next w:val="BodyText"/>
-    <w:qFormat/>
-    <w:pPr>
-      <w:keepNext/>
-      <w:keepLines/>
-    </w:pPr>
-    <w:rPr>
-      <w:sz w:val="24"/>
-      <w:szCs w:val="24"/>
-    </w:rPr>
-  </w:style>
-  <w:style w:customStyle="1" w:styleId="AbstractTitle" w:type="paragraph">
-    <w:name w:val="Abstract Title"/>
-    <w:basedOn w:val="Normal"/>
-    <w:next w:val="Abstract"/>
-    <w:qFormat/>
-    <w:pPr>
-      <w:keepNext/>
-      <w:keepLines/>
-      <w:spacing w:after="0" w:before="300"/>
-      <w:jc w:val="center"/>
-    </w:pPr>
-    <w:rPr>
-      <w:b/>
-      <w:sz w:val="20"/>
-      <w:szCs w:val="20"/>
-    </w:rPr>
-  </w:style>
-  <w:style w:customStyle="1" w:styleId="Abstract" w:type="paragraph">
-    <w:name w:val="Abstract"/>
-    <w:basedOn w:val="Normal"/>
-    <w:next w:val="BodyText"/>
-    <w:qFormat/>
-    <w:pPr>
-      <w:keepNext/>
-      <w:keepLines/>
-      <w:spacing w:after="300" w:before="100"/>
-    </w:pPr>
-    <w:rPr>
-      <w:sz w:val="20"/>
-      <w:szCs w:val="20"/>
-    </w:rPr>
-  </w:style>
-  <w:style w:styleId="Bibliography" w:type="paragraph">
-    <w:name w:val="Bibliography"/>
-    <w:basedOn w:val="Normal"/>
-    <w:next w:val="Bibliography"/>
-    <w:qFormat/>
-    <w:pPr/>
-    <w:rPr/>
-  </w:style>
-  <w:style w:styleId="Heading1" w:type="paragraph">
+  <w:style w:type="paragraph" w:styleId="Heading1">
     <w:name w:val="heading 1"/>
     <w:basedOn w:val="Normal"/>
     <w:next w:val="BodyText"/>
@@ -1688,17 +2167,17 @@
     <w:pPr>
       <w:keepNext/>
       <w:keepLines/>
-      <w:spacing w:after="80" w:before="360"/>
+      <w:spacing w:before="360" w:after="80"/>
       <w:outlineLvl w:val="0"/>
     </w:pPr>
     <w:rPr>
-      <w:rFonts w:asciiTheme="majorHAnsi" w:cstheme="majorBidi" w:eastAsiaTheme="majorEastAsia" w:hAnsiTheme="majorHAnsi"/>
-      <w:color w:themeColor="accent1" w:themeShade="BF" w:val="0F4761"/>
+      <w:rFonts w:asciiTheme="majorHAnsi" w:eastAsiaTheme="majorEastAsia" w:hAnsiTheme="majorHAnsi" w:cstheme="majorBidi"/>
+      <w:color w:val="0F4761" w:themeColor="accent1" w:themeShade="BF"/>
       <w:sz w:val="40"/>
       <w:szCs w:val="40"/>
     </w:rPr>
   </w:style>
-  <w:style w:styleId="Heading2" w:type="paragraph">
+  <w:style w:type="paragraph" w:styleId="Heading2">
     <w:name w:val="heading 2"/>
     <w:basedOn w:val="Normal"/>
     <w:next w:val="BodyText"/>
@@ -1711,17 +2190,17 @@
     <w:pPr>
       <w:keepNext/>
       <w:keepLines/>
-      <w:spacing w:after="80" w:before="160"/>
+      <w:spacing w:before="160" w:after="80"/>
       <w:outlineLvl w:val="1"/>
     </w:pPr>
     <w:rPr>
-      <w:rFonts w:asciiTheme="majorHAnsi" w:cstheme="majorBidi" w:eastAsiaTheme="majorEastAsia" w:hAnsiTheme="majorHAnsi"/>
-      <w:color w:themeColor="accent1" w:themeShade="BF" w:val="0F4761"/>
+      <w:rFonts w:asciiTheme="majorHAnsi" w:eastAsiaTheme="majorEastAsia" w:hAnsiTheme="majorHAnsi" w:cstheme="majorBidi"/>
+      <w:color w:val="0F4761" w:themeColor="accent1" w:themeShade="BF"/>
       <w:sz w:val="32"/>
       <w:szCs w:val="32"/>
     </w:rPr>
   </w:style>
-  <w:style w:styleId="Heading3" w:type="paragraph">
+  <w:style w:type="paragraph" w:styleId="Heading3">
     <w:name w:val="heading 3"/>
     <w:basedOn w:val="Normal"/>
     <w:next w:val="BodyText"/>
@@ -1734,17 +2213,17 @@
     <w:pPr>
       <w:keepNext/>
       <w:keepLines/>
-      <w:spacing w:after="80" w:before="160"/>
+      <w:spacing w:before="160" w:after="80"/>
       <w:outlineLvl w:val="2"/>
     </w:pPr>
     <w:rPr>
-      <w:rFonts w:cstheme="majorBidi" w:eastAsiaTheme="majorEastAsia"/>
-      <w:color w:themeColor="accent1" w:themeShade="BF" w:val="0F4761"/>
+      <w:rFonts w:eastAsiaTheme="majorEastAsia" w:cstheme="majorBidi"/>
+      <w:color w:val="0F4761" w:themeColor="accent1" w:themeShade="BF"/>
       <w:sz w:val="28"/>
       <w:szCs w:val="28"/>
     </w:rPr>
   </w:style>
-  <w:style w:styleId="Heading4" w:type="paragraph">
+  <w:style w:type="paragraph" w:styleId="Heading4">
     <w:name w:val="heading 4"/>
     <w:basedOn w:val="Normal"/>
     <w:next w:val="BodyText"/>
@@ -1757,17 +2236,17 @@
     <w:pPr>
       <w:keepNext/>
       <w:keepLines/>
-      <w:spacing w:after="40" w:before="80"/>
+      <w:spacing w:before="80" w:after="40"/>
       <w:outlineLvl w:val="3"/>
     </w:pPr>
     <w:rPr>
-      <w:rFonts w:cstheme="majorBidi" w:eastAsiaTheme="majorEastAsia"/>
+      <w:rFonts w:eastAsiaTheme="majorEastAsia" w:cstheme="majorBidi"/>
       <w:i/>
       <w:iCs/>
-      <w:color w:themeColor="accent1" w:themeShade="BF" w:val="0F4761"/>
-    </w:rPr>
-  </w:style>
-  <w:style w:styleId="Heading5" w:type="paragraph">
+      <w:color w:val="0F4761" w:themeColor="accent1" w:themeShade="BF"/>
+    </w:rPr>
+  </w:style>
+  <w:style w:type="paragraph" w:styleId="Heading5">
     <w:name w:val="heading 5"/>
     <w:basedOn w:val="Normal"/>
     <w:next w:val="BodyText"/>
@@ -1780,15 +2259,15 @@
     <w:pPr>
       <w:keepNext/>
       <w:keepLines/>
-      <w:spacing w:after="40" w:before="80"/>
+      <w:spacing w:before="80" w:after="40"/>
       <w:outlineLvl w:val="4"/>
     </w:pPr>
     <w:rPr>
-      <w:rFonts w:cstheme="majorBidi" w:eastAsiaTheme="majorEastAsia"/>
-      <w:color w:themeColor="accent1" w:themeShade="BF" w:val="0F4761"/>
-    </w:rPr>
-  </w:style>
-  <w:style w:styleId="Heading6" w:type="paragraph">
+      <w:rFonts w:eastAsiaTheme="majorEastAsia" w:cstheme="majorBidi"/>
+      <w:color w:val="0F4761" w:themeColor="accent1" w:themeShade="BF"/>
+    </w:rPr>
+  </w:style>
+  <w:style w:type="paragraph" w:styleId="Heading6">
     <w:name w:val="heading 6"/>
     <w:basedOn w:val="Normal"/>
     <w:next w:val="BodyText"/>
@@ -1801,17 +2280,17 @@
     <w:pPr>
       <w:keepNext/>
       <w:keepLines/>
-      <w:spacing w:after="0" w:before="40"/>
+      <w:spacing w:before="40" w:after="0"/>
       <w:outlineLvl w:val="5"/>
     </w:pPr>
     <w:rPr>
-      <w:rFonts w:cstheme="majorBidi" w:eastAsiaTheme="majorEastAsia"/>
+      <w:rFonts w:eastAsiaTheme="majorEastAsia" w:cstheme="majorBidi"/>
       <w:i/>
       <w:iCs/>
-      <w:color w:themeColor="text1" w:themeTint="A6" w:val="595959"/>
-    </w:rPr>
-  </w:style>
-  <w:style w:styleId="Heading7" w:type="paragraph">
+      <w:color w:val="595959" w:themeColor="text1" w:themeTint="A6"/>
+    </w:rPr>
+  </w:style>
+  <w:style w:type="paragraph" w:styleId="Heading7">
     <w:name w:val="heading 7"/>
     <w:basedOn w:val="Normal"/>
     <w:next w:val="BodyText"/>
@@ -1824,15 +2303,15 @@
     <w:pPr>
       <w:keepNext/>
       <w:keepLines/>
-      <w:spacing w:after="0" w:before="40"/>
+      <w:spacing w:before="40" w:after="0"/>
       <w:outlineLvl w:val="6"/>
     </w:pPr>
     <w:rPr>
-      <w:rFonts w:cstheme="majorBidi" w:eastAsiaTheme="majorEastAsia"/>
-      <w:color w:themeColor="text1" w:themeTint="A6" w:val="595959"/>
-    </w:rPr>
-  </w:style>
-  <w:style w:styleId="Heading8" w:type="paragraph">
+      <w:rFonts w:eastAsiaTheme="majorEastAsia" w:cstheme="majorBidi"/>
+      <w:color w:val="595959" w:themeColor="text1" w:themeTint="A6"/>
+    </w:rPr>
+  </w:style>
+  <w:style w:type="paragraph" w:styleId="Heading8">
     <w:name w:val="heading 8"/>
     <w:basedOn w:val="Normal"/>
     <w:next w:val="BodyText"/>
@@ -1849,13 +2328,13 @@
       <w:outlineLvl w:val="7"/>
     </w:pPr>
     <w:rPr>
-      <w:rFonts w:cstheme="majorBidi" w:eastAsiaTheme="majorEastAsia"/>
+      <w:rFonts w:eastAsiaTheme="majorEastAsia" w:cstheme="majorBidi"/>
       <w:i/>
       <w:iCs/>
-      <w:color w:themeColor="text1" w:themeTint="D8" w:val="272727"/>
-    </w:rPr>
-  </w:style>
-  <w:style w:styleId="Heading9" w:type="paragraph">
+      <w:color w:val="272727" w:themeColor="text1" w:themeTint="D8"/>
+    </w:rPr>
+  </w:style>
+  <w:style w:type="paragraph" w:styleId="Heading9">
     <w:name w:val="heading 9"/>
     <w:basedOn w:val="Normal"/>
     <w:next w:val="BodyText"/>
@@ -1872,24 +2351,202 @@
       <w:outlineLvl w:val="8"/>
     </w:pPr>
     <w:rPr>
-      <w:rFonts w:cstheme="majorBidi" w:eastAsiaTheme="majorEastAsia"/>
-      <w:color w:themeColor="text1" w:themeTint="D8" w:val="272727"/>
-    </w:rPr>
-  </w:style>
-  <w:style w:customStyle="1" w:styleId="Heading1Char" w:type="character">
+      <w:rFonts w:eastAsiaTheme="majorEastAsia" w:cstheme="majorBidi"/>
+      <w:color w:val="272727" w:themeColor="text1" w:themeTint="D8"/>
+    </w:rPr>
+  </w:style>
+  <w:style w:type="character" w:default="1" w:styleId="DefaultParagraphFont">
+    <w:name w:val="Default Paragraph Font"/>
+    <w:uiPriority w:val="1"/>
+    <w:semiHidden/>
+    <w:unhideWhenUsed/>
+  </w:style>
+  <w:style w:type="table" w:default="1" w:styleId="TableNormal">
+    <w:name w:val="Normal Table"/>
+    <w:uiPriority w:val="99"/>
+    <w:semiHidden/>
+    <w:unhideWhenUsed/>
+    <w:tblPr>
+      <w:tblInd w:w="0" w:type="dxa"/>
+      <w:tblCellMar>
+        <w:top w:w="0" w:type="dxa"/>
+        <w:left w:w="108" w:type="dxa"/>
+        <w:bottom w:w="0" w:type="dxa"/>
+        <w:right w:w="108" w:type="dxa"/>
+      </w:tblCellMar>
+    </w:tblPr>
+  </w:style>
+  <w:style w:type="numbering" w:default="1" w:styleId="NoList">
+    <w:name w:val="No List"/>
+    <w:uiPriority w:val="99"/>
+    <w:semiHidden/>
+    <w:unhideWhenUsed/>
+  </w:style>
+  <w:style w:type="paragraph" w:styleId="BodyText">
+    <w:name w:val="Body Text"/>
+    <w:basedOn w:val="Normal"/>
+    <w:qFormat/>
+    <w:pPr>
+      <w:spacing w:before="180" w:after="180"/>
+    </w:pPr>
+  </w:style>
+  <w:style w:type="paragraph" w:customStyle="1" w:styleId="FirstParagraph">
+    <w:name w:val="First Paragraph"/>
+    <w:basedOn w:val="BodyText"/>
+    <w:next w:val="BodyText"/>
+    <w:qFormat/>
+  </w:style>
+  <w:style w:type="paragraph" w:customStyle="1" w:styleId="Compact">
+    <w:name w:val="Compact"/>
+    <w:basedOn w:val="BodyText"/>
+    <w:qFormat/>
+    <w:pPr>
+      <w:spacing w:before="36" w:after="36"/>
+    </w:pPr>
+  </w:style>
+  <w:style w:type="paragraph" w:styleId="Title">
+    <w:name w:val="Title"/>
+    <w:basedOn w:val="Normal"/>
+    <w:next w:val="BodyText"/>
+    <w:link w:val="TitleChar"/>
+    <w:uiPriority w:val="10"/>
+    <w:qFormat/>
+    <w:rsid w:val="00A10FD9"/>
+    <w:pPr>
+      <w:spacing w:after="80"/>
+      <w:contextualSpacing/>
+      <w:jc w:val="center"/>
+    </w:pPr>
+    <w:rPr>
+      <w:rFonts w:asciiTheme="majorHAnsi" w:eastAsiaTheme="majorEastAsia" w:hAnsiTheme="majorHAnsi" w:cstheme="majorBidi"/>
+      <w:sz w:val="56"/>
+      <w:szCs w:val="56"/>
+    </w:rPr>
+  </w:style>
+  <w:style w:type="character" w:customStyle="1" w:styleId="TitleChar">
+    <w:name w:val="Title Char"/>
+    <w:basedOn w:val="DefaultParagraphFont"/>
+    <w:link w:val="Title"/>
+    <w:uiPriority w:val="10"/>
+    <w:rsid w:val="00A10FD9"/>
+    <w:rPr>
+      <w:rFonts w:asciiTheme="majorHAnsi" w:eastAsiaTheme="majorEastAsia" w:hAnsiTheme="majorHAnsi" w:cstheme="majorBidi"/>
+      <w:sz w:val="56"/>
+      <w:szCs w:val="56"/>
+    </w:rPr>
+  </w:style>
+  <w:style w:type="paragraph" w:styleId="Subtitle">
+    <w:name w:val="Subtitle"/>
+    <w:basedOn w:val="Title"/>
+    <w:next w:val="BodyText"/>
+    <w:link w:val="SubtitleChar"/>
+    <w:uiPriority w:val="11"/>
+    <w:qFormat/>
+    <w:rsid w:val="00A10FD9"/>
+    <w:pPr>
+      <w:numPr>
+        <w:ilvl w:val="1"/>
+      </w:numPr>
+    </w:pPr>
+    <w:rPr>
+      <w:spacing w:val="15"/>
+      <w:sz w:val="28"/>
+      <w:szCs w:val="28"/>
+    </w:rPr>
+  </w:style>
+  <w:style w:type="character" w:customStyle="1" w:styleId="SubtitleChar">
+    <w:name w:val="Subtitle Char"/>
+    <w:basedOn w:val="DefaultParagraphFont"/>
+    <w:link w:val="Subtitle"/>
+    <w:uiPriority w:val="11"/>
+    <w:rsid w:val="00A10FD9"/>
+    <w:rPr>
+      <w:rFonts w:eastAsiaTheme="majorEastAsia" w:cstheme="majorBidi"/>
+      <w:color w:val="595959" w:themeColor="text1" w:themeTint="A6"/>
+      <w:spacing w:val="15"/>
+      <w:sz w:val="28"/>
+      <w:szCs w:val="28"/>
+    </w:rPr>
+  </w:style>
+  <w:style w:type="paragraph" w:customStyle="1" w:styleId="Author">
+    <w:name w:val="Author"/>
+    <w:basedOn w:val="Title"/>
+    <w:next w:val="BodyText"/>
+    <w:qFormat/>
+    <w:pPr>
+      <w:keepNext/>
+      <w:keepLines/>
+    </w:pPr>
+    <w:rPr>
+      <w:sz w:val="24"/>
+      <w:szCs w:val="24"/>
+    </w:rPr>
+  </w:style>
+  <w:style w:type="paragraph" w:styleId="Date">
+    <w:name w:val="Date"/>
+    <w:basedOn w:val="Title"/>
+    <w:next w:val="BodyText"/>
+    <w:qFormat/>
+    <w:pPr>
+      <w:keepNext/>
+      <w:keepLines/>
+    </w:pPr>
+    <w:rPr>
+      <w:sz w:val="24"/>
+      <w:szCs w:val="24"/>
+    </w:rPr>
+  </w:style>
+  <w:style w:type="paragraph" w:customStyle="1" w:styleId="AbstractTitle">
+    <w:name w:val="Abstract Title"/>
+    <w:basedOn w:val="Normal"/>
+    <w:next w:val="Abstract"/>
+    <w:qFormat/>
+    <w:pPr>
+      <w:keepNext/>
+      <w:keepLines/>
+      <w:spacing w:before="300" w:after="0"/>
+      <w:jc w:val="center"/>
+    </w:pPr>
+    <w:rPr>
+      <w:b/>
+      <w:sz w:val="20"/>
+      <w:szCs w:val="20"/>
+    </w:rPr>
+  </w:style>
+  <w:style w:type="paragraph" w:customStyle="1" w:styleId="Abstract">
+    <w:name w:val="Abstract"/>
+    <w:basedOn w:val="Normal"/>
+    <w:next w:val="BodyText"/>
+    <w:qFormat/>
+    <w:pPr>
+      <w:keepNext/>
+      <w:keepLines/>
+      <w:spacing w:before="100" w:after="300"/>
+    </w:pPr>
+    <w:rPr>
+      <w:sz w:val="20"/>
+      <w:szCs w:val="20"/>
+    </w:rPr>
+  </w:style>
+  <w:style w:type="paragraph" w:styleId="Bibliography">
+    <w:name w:val="Bibliography"/>
+    <w:basedOn w:val="Normal"/>
+    <w:qFormat/>
+  </w:style>
+  <w:style w:type="character" w:customStyle="1" w:styleId="Heading1Char">
     <w:name w:val="Heading 1 Char"/>
     <w:basedOn w:val="DefaultParagraphFont"/>
     <w:link w:val="Heading1"/>
     <w:uiPriority w:val="9"/>
     <w:rsid w:val="00A10FD9"/>
     <w:rPr>
-      <w:rFonts w:asciiTheme="majorHAnsi" w:cstheme="majorBidi" w:eastAsiaTheme="majorEastAsia" w:hAnsiTheme="majorHAnsi"/>
-      <w:color w:themeColor="accent1" w:themeShade="BF" w:val="0F4761"/>
+      <w:rFonts w:asciiTheme="majorHAnsi" w:eastAsiaTheme="majorEastAsia" w:hAnsiTheme="majorHAnsi" w:cstheme="majorBidi"/>
+      <w:color w:val="0F4761" w:themeColor="accent1" w:themeShade="BF"/>
       <w:sz w:val="40"/>
       <w:szCs w:val="40"/>
     </w:rPr>
   </w:style>
-  <w:style w:customStyle="1" w:styleId="Heading2Char" w:type="character">
+  <w:style w:type="character" w:customStyle="1" w:styleId="Heading2Char">
     <w:name w:val="Heading 2 Char"/>
     <w:basedOn w:val="DefaultParagraphFont"/>
     <w:link w:val="Heading2"/>
@@ -1897,13 +2554,13 @@
     <w:semiHidden/>
     <w:rsid w:val="00A10FD9"/>
     <w:rPr>
-      <w:rFonts w:asciiTheme="majorHAnsi" w:cstheme="majorBidi" w:eastAsiaTheme="majorEastAsia" w:hAnsiTheme="majorHAnsi"/>
-      <w:color w:themeColor="accent1" w:themeShade="BF" w:val="0F4761"/>
+      <w:rFonts w:asciiTheme="majorHAnsi" w:eastAsiaTheme="majorEastAsia" w:hAnsiTheme="majorHAnsi" w:cstheme="majorBidi"/>
+      <w:color w:val="0F4761" w:themeColor="accent1" w:themeShade="BF"/>
       <w:sz w:val="32"/>
       <w:szCs w:val="32"/>
     </w:rPr>
   </w:style>
-  <w:style w:customStyle="1" w:styleId="Heading3Char" w:type="character">
+  <w:style w:type="character" w:customStyle="1" w:styleId="Heading3Char">
     <w:name w:val="Heading 3 Char"/>
     <w:basedOn w:val="DefaultParagraphFont"/>
     <w:link w:val="Heading3"/>
@@ -1911,13 +2568,13 @@
     <w:semiHidden/>
     <w:rsid w:val="00A10FD9"/>
     <w:rPr>
-      <w:rFonts w:cstheme="majorBidi" w:eastAsiaTheme="majorEastAsia"/>
-      <w:color w:themeColor="accent1" w:themeShade="BF" w:val="0F4761"/>
+      <w:rFonts w:eastAsiaTheme="majorEastAsia" w:cstheme="majorBidi"/>
+      <w:color w:val="0F4761" w:themeColor="accent1" w:themeShade="BF"/>
       <w:sz w:val="28"/>
       <w:szCs w:val="28"/>
     </w:rPr>
   </w:style>
-  <w:style w:customStyle="1" w:styleId="Heading4Char" w:type="character">
+  <w:style w:type="character" w:customStyle="1" w:styleId="Heading4Char">
     <w:name w:val="Heading 4 Char"/>
     <w:basedOn w:val="DefaultParagraphFont"/>
     <w:link w:val="Heading4"/>
@@ -1925,13 +2582,13 @@
     <w:semiHidden/>
     <w:rsid w:val="00A10FD9"/>
     <w:rPr>
-      <w:rFonts w:cstheme="majorBidi" w:eastAsiaTheme="majorEastAsia"/>
+      <w:rFonts w:eastAsiaTheme="majorEastAsia" w:cstheme="majorBidi"/>
       <w:i/>
       <w:iCs/>
-      <w:color w:themeColor="accent1" w:themeShade="BF" w:val="0F4761"/>
-    </w:rPr>
-  </w:style>
-  <w:style w:customStyle="1" w:styleId="Heading5Char" w:type="character">
+      <w:color w:val="0F4761" w:themeColor="accent1" w:themeShade="BF"/>
+    </w:rPr>
+  </w:style>
+  <w:style w:type="character" w:customStyle="1" w:styleId="Heading5Char">
     <w:name w:val="Heading 5 Char"/>
     <w:basedOn w:val="DefaultParagraphFont"/>
     <w:link w:val="Heading5"/>
@@ -1939,11 +2596,11 @@
     <w:semiHidden/>
     <w:rsid w:val="00A10FD9"/>
     <w:rPr>
-      <w:rFonts w:cstheme="majorBidi" w:eastAsiaTheme="majorEastAsia"/>
-      <w:color w:themeColor="accent1" w:themeShade="BF" w:val="0F4761"/>
-    </w:rPr>
-  </w:style>
-  <w:style w:customStyle="1" w:styleId="Heading6Char" w:type="character">
+      <w:rFonts w:eastAsiaTheme="majorEastAsia" w:cstheme="majorBidi"/>
+      <w:color w:val="0F4761" w:themeColor="accent1" w:themeShade="BF"/>
+    </w:rPr>
+  </w:style>
+  <w:style w:type="character" w:customStyle="1" w:styleId="Heading6Char">
     <w:name w:val="Heading 6 Char"/>
     <w:basedOn w:val="DefaultParagraphFont"/>
     <w:link w:val="Heading6"/>
@@ -1951,13 +2608,13 @@
     <w:semiHidden/>
     <w:rsid w:val="00A10FD9"/>
     <w:rPr>
-      <w:rFonts w:cstheme="majorBidi" w:eastAsiaTheme="majorEastAsia"/>
+      <w:rFonts w:eastAsiaTheme="majorEastAsia" w:cstheme="majorBidi"/>
       <w:i/>
       <w:iCs/>
-      <w:color w:themeColor="text1" w:themeTint="A6" w:val="595959"/>
-    </w:rPr>
-  </w:style>
-  <w:style w:customStyle="1" w:styleId="Heading7Char" w:type="character">
+      <w:color w:val="595959" w:themeColor="text1" w:themeTint="A6"/>
+    </w:rPr>
+  </w:style>
+  <w:style w:type="character" w:customStyle="1" w:styleId="Heading7Char">
     <w:name w:val="Heading 7 Char"/>
     <w:basedOn w:val="DefaultParagraphFont"/>
     <w:link w:val="Heading7"/>
@@ -1965,11 +2622,11 @@
     <w:semiHidden/>
     <w:rsid w:val="00A10FD9"/>
     <w:rPr>
-      <w:rFonts w:cstheme="majorBidi" w:eastAsiaTheme="majorEastAsia"/>
-      <w:color w:themeColor="text1" w:themeTint="A6" w:val="595959"/>
-    </w:rPr>
-  </w:style>
-  <w:style w:customStyle="1" w:styleId="Heading8Char" w:type="character">
+      <w:rFonts w:eastAsiaTheme="majorEastAsia" w:cstheme="majorBidi"/>
+      <w:color w:val="595959" w:themeColor="text1" w:themeTint="A6"/>
+    </w:rPr>
+  </w:style>
+  <w:style w:type="character" w:customStyle="1" w:styleId="Heading8Char">
     <w:name w:val="Heading 8 Char"/>
     <w:basedOn w:val="DefaultParagraphFont"/>
     <w:link w:val="Heading8"/>
@@ -1977,13 +2634,13 @@
     <w:semiHidden/>
     <w:rsid w:val="00A10FD9"/>
     <w:rPr>
-      <w:rFonts w:cstheme="majorBidi" w:eastAsiaTheme="majorEastAsia"/>
+      <w:rFonts w:eastAsiaTheme="majorEastAsia" w:cstheme="majorBidi"/>
       <w:i/>
       <w:iCs/>
-      <w:color w:themeColor="text1" w:themeTint="D8" w:val="272727"/>
-    </w:rPr>
-  </w:style>
-  <w:style w:customStyle="1" w:styleId="Heading9Char" w:type="character">
+      <w:color w:val="272727" w:themeColor="text1" w:themeTint="D8"/>
+    </w:rPr>
+  </w:style>
+  <w:style w:type="character" w:customStyle="1" w:styleId="Heading9Char">
     <w:name w:val="Heading 9 Char"/>
     <w:basedOn w:val="DefaultParagraphFont"/>
     <w:link w:val="Heading9"/>
@@ -1991,11 +2648,11 @@
     <w:semiHidden/>
     <w:rsid w:val="00A10FD9"/>
     <w:rPr>
-      <w:rFonts w:cstheme="majorBidi" w:eastAsiaTheme="majorEastAsia"/>
-      <w:color w:themeColor="text1" w:themeTint="D8" w:val="272727"/>
-    </w:rPr>
-  </w:style>
-  <w:style w:styleId="BlockText" w:type="paragraph">
+      <w:rFonts w:eastAsiaTheme="majorEastAsia" w:cstheme="majorBidi"/>
+      <w:color w:val="272727" w:themeColor="text1" w:themeTint="D8"/>
+    </w:rPr>
+  </w:style>
+  <w:style w:type="paragraph" w:styleId="BlockText">
     <w:name w:val="Block Text"/>
     <w:basedOn w:val="BodyText"/>
     <w:next w:val="BodyText"/>
@@ -2003,19 +2660,18 @@
     <w:unhideWhenUsed/>
     <w:qFormat/>
     <w:pPr>
-      <w:spacing w:after="100" w:before="100"/>
-      <w:ind w:firstLine="0" w:left="480" w:right="480"/>
+      <w:spacing w:before="100" w:after="100"/>
+      <w:ind w:left="480" w:right="480"/>
     </w:pPr>
   </w:style>
-  <w:style w:styleId="FootnoteText" w:type="paragraph">
-    <w:name w:val="Footnote Text"/>
+  <w:style w:type="paragraph" w:styleId="FootnoteText">
+    <w:name w:val="footnote text"/>
     <w:basedOn w:val="Normal"/>
-    <w:next w:val="FootnoteText"/>
     <w:uiPriority w:val="9"/>
     <w:unhideWhenUsed/>
     <w:qFormat/>
   </w:style>
-  <w:style w:styleId="FootnoteBlockText" w:type="paragraph">
+  <w:style w:type="paragraph" w:customStyle="1" w:styleId="FootnoteBlockText">
     <w:name w:val="Footnote Block Text"/>
     <w:basedOn w:val="FootnoteText"/>
     <w:next w:val="FootnoteText"/>
@@ -2023,32 +2679,26 @@
     <w:unhideWhenUsed/>
     <w:qFormat/>
     <w:pPr>
-      <w:spacing w:after="100" w:before="100"/>
-      <w:ind w:firstLine="0" w:left="480" w:right="480"/>
+      <w:spacing w:before="100" w:after="100"/>
+      <w:ind w:left="480" w:right="480"/>
     </w:pPr>
   </w:style>
-  <w:style w:default="1" w:styleId="DefaultParagraphFont" w:type="character">
-    <w:name w:val="Default Paragraph Font"/>
-    <w:semiHidden/>
-    <w:unhideWhenUsed/>
-  </w:style>
-  <w:style w:default="1" w:styleId="Table" w:type="table">
+  <w:style w:type="table" w:customStyle="1" w:styleId="Table">
     <w:name w:val="Table"/>
-    <w:basedOn w:val="TableNormal"/>
     <w:semiHidden/>
     <w:unhideWhenUsed/>
     <w:qFormat/>
     <w:tblPr>
-      <w:tblInd w:type="dxa" w:w="0"/>
+      <w:tblInd w:w="0" w:type="dxa"/>
       <w:tblCellMar>
-        <w:top w:type="dxa" w:w="0"/>
-        <w:left w:type="dxa" w:w="108"/>
-        <w:bottom w:type="dxa" w:w="0"/>
-        <w:right w:type="dxa" w:w="108"/>
+        <w:top w:w="0" w:type="dxa"/>
+        <w:left w:w="108" w:type="dxa"/>
+        <w:bottom w:w="0" w:type="dxa"/>
+        <w:right w:w="108" w:type="dxa"/>
       </w:tblCellMar>
     </w:tblPr>
   </w:style>
-  <w:style w:customStyle="1" w:styleId="DefinitionTerm" w:type="paragraph">
+  <w:style w:type="paragraph" w:customStyle="1" w:styleId="DefinitionTerm">
     <w:name w:val="Definition Term"/>
     <w:basedOn w:val="Normal"/>
     <w:next w:val="Definition"/>
@@ -2061,75 +2711,76 @@
       <w:b/>
     </w:rPr>
   </w:style>
-  <w:style w:customStyle="1" w:styleId="Definition" w:type="paragraph">
+  <w:style w:type="paragraph" w:customStyle="1" w:styleId="Definition">
     <w:name w:val="Definition"/>
     <w:basedOn w:val="Normal"/>
   </w:style>
-  <w:style w:styleId="Caption" w:type="paragraph">
-    <w:name w:val="Caption"/>
+  <w:style w:type="paragraph" w:styleId="Caption">
+    <w:name w:val="caption"/>
     <w:basedOn w:val="Normal"/>
-    <w:link w:val="BodyTextChar"/>
+    <w:link w:val="CaptionChar"/>
     <w:pPr>
-      <w:spacing w:after="120" w:before="0"/>
+      <w:spacing w:after="120"/>
     </w:pPr>
     <w:rPr>
       <w:i/>
     </w:rPr>
   </w:style>
-  <w:style w:customStyle="1" w:styleId="TableCaption" w:type="paragraph">
+  <w:style w:type="paragraph" w:customStyle="1" w:styleId="TableCaption">
     <w:name w:val="Table Caption"/>
     <w:basedOn w:val="Caption"/>
     <w:pPr>
       <w:keepNext/>
     </w:pPr>
   </w:style>
-  <w:style w:customStyle="1" w:styleId="ImageCaption" w:type="paragraph">
+  <w:style w:type="paragraph" w:customStyle="1" w:styleId="ImageCaption">
     <w:name w:val="Image Caption"/>
     <w:basedOn w:val="Caption"/>
   </w:style>
-  <w:style w:customStyle="1" w:styleId="Figure" w:type="paragraph">
+  <w:style w:type="paragraph" w:customStyle="1" w:styleId="Figure">
     <w:name w:val="Figure"/>
     <w:basedOn w:val="Normal"/>
   </w:style>
-  <w:style w:customStyle="1" w:styleId="CaptionedFigure" w:type="paragraph">
+  <w:style w:type="paragraph" w:customStyle="1" w:styleId="CaptionedFigure">
     <w:name w:val="Captioned Figure"/>
     <w:basedOn w:val="Figure"/>
     <w:pPr>
       <w:keepNext/>
     </w:pPr>
   </w:style>
-  <w:style w:customStyle="1" w:styleId="BodyTextChar" w:type="character">
-    <w:name w:val="Body Text Char"/>
+  <w:style w:type="character" w:customStyle="1" w:styleId="CaptionChar">
+    <w:name w:val="Caption Char"/>
     <w:basedOn w:val="DefaultParagraphFont"/>
-    <w:link w:val="BodyText"/>
-  </w:style>
-  <w:style w:customStyle="1" w:styleId="VerbatimChar" w:type="character">
+    <w:link w:val="Caption"/>
+  </w:style>
+  <w:style w:type="character" w:customStyle="1" w:styleId="VerbatimChar">
     <w:name w:val="Verbatim Char"/>
-    <w:basedOn w:val="BodyTextChar"/>
+    <w:basedOn w:val="CaptionChar"/>
+    <w:link w:val="SourceCode"/>
     <w:rPr>
       <w:rFonts w:ascii="Consolas" w:hAnsi="Consolas"/>
       <w:sz w:val="22"/>
     </w:rPr>
   </w:style>
-  <w:style w:customStyle="1" w:styleId="SectionNumber" w:type="character">
+  <w:style w:type="character" w:customStyle="1" w:styleId="SectionNumber">
     <w:name w:val="Section Number"/>
-    <w:basedOn w:val="BodyTextChar"/>
-  </w:style>
-  <w:style w:styleId="FootnoteReference" w:type="character">
-    <w:name w:val="Footnote Reference"/>
-    <w:basedOn w:val="BodyTextChar"/>
+    <w:basedOn w:val="CaptionChar"/>
+  </w:style>
+  <w:style w:type="character" w:styleId="FootnoteReference">
+    <w:name w:val="footnote reference"/>
+    <w:basedOn w:val="CaptionChar"/>
     <w:rPr>
       <w:vertAlign w:val="superscript"/>
     </w:rPr>
   </w:style>
-  <w:style w:styleId="Hyperlink" w:type="character">
+  <w:style w:type="character" w:styleId="Hyperlink">
     <w:name w:val="Hyperlink"/>
-    <w:basedOn w:val="BodyTextChar"/>
-    <w:rPr>
-      <w:color w:themeColor="accent1" w:val="4F81BD"/>
-    </w:rPr>
-  </w:style>
-  <w:style w:styleId="TOCHeading" w:type="paragraph">
+    <w:basedOn w:val="CaptionChar"/>
+    <w:rPr>
+      <w:color w:val="156082" w:themeColor="accent1"/>
+    </w:rPr>
+  </w:style>
+  <w:style w:type="paragraph" w:styleId="TOCHeading">
     <w:name w:val="TOC Heading"/>
     <w:basedOn w:val="Heading1"/>
     <w:next w:val="BodyText"/>
@@ -2140,246 +2791,305 @@
       <w:spacing w:before="240" w:line="259" w:lineRule="auto"/>
       <w:outlineLvl w:val="9"/>
     </w:pPr>
-    <w:rPr>
-      <w:rFonts w:asciiTheme="majorHAnsi" w:cstheme="majorBidi" w:eastAsiaTheme="majorEastAsia" w:hAnsiTheme="majorHAnsi"/>
-      <w:b w:val="0"/>
-      <w:bCs w:val="0"/>
-      <w:color w:themeColor="accent1" w:themeShade="BF" w:val="365F91"/>
-    </w:rPr>
   </w:style>
   <w:style w:type="paragraph" w:customStyle="1" w:styleId="SourceCode">
     <w:name w:val="Source Code"/>
     <w:basedOn w:val="Normal"/>
     <w:link w:val="VerbatimChar"/>
     <w:pPr>
-      <w:wordWrap w:val="off"/>
+      <w:wordWrap w:val="0"/>
     </w:pPr>
   </w:style>
   <w:style w:type="character" w:customStyle="1" w:styleId="KeywordTok">
     <w:name w:val="KeywordTok"/>
     <w:basedOn w:val="VerbatimChar"/>
     <w:rPr>
+      <w:rFonts w:ascii="Consolas" w:hAnsi="Consolas"/>
       <w:b/>
       <w:color w:val="007020"/>
+      <w:sz w:val="22"/>
     </w:rPr>
   </w:style>
   <w:style w:type="character" w:customStyle="1" w:styleId="DataTypeTok">
     <w:name w:val="DataTypeTok"/>
     <w:basedOn w:val="VerbatimChar"/>
     <w:rPr>
+      <w:rFonts w:ascii="Consolas" w:hAnsi="Consolas"/>
       <w:color w:val="902000"/>
+      <w:sz w:val="22"/>
     </w:rPr>
   </w:style>
   <w:style w:type="character" w:customStyle="1" w:styleId="DecValTok">
     <w:name w:val="DecValTok"/>
     <w:basedOn w:val="VerbatimChar"/>
     <w:rPr>
-      <w:color w:val="40a070"/>
+      <w:rFonts w:ascii="Consolas" w:hAnsi="Consolas"/>
+      <w:color w:val="40A070"/>
+      <w:sz w:val="22"/>
     </w:rPr>
   </w:style>
   <w:style w:type="character" w:customStyle="1" w:styleId="BaseNTok">
     <w:name w:val="BaseNTok"/>
     <w:basedOn w:val="VerbatimChar"/>
     <w:rPr>
-      <w:color w:val="40a070"/>
+      <w:rFonts w:ascii="Consolas" w:hAnsi="Consolas"/>
+      <w:color w:val="40A070"/>
+      <w:sz w:val="22"/>
     </w:rPr>
   </w:style>
   <w:style w:type="character" w:customStyle="1" w:styleId="FloatTok">
     <w:name w:val="FloatTok"/>
     <w:basedOn w:val="VerbatimChar"/>
     <w:rPr>
-      <w:color w:val="40a070"/>
+      <w:rFonts w:ascii="Consolas" w:hAnsi="Consolas"/>
+      <w:color w:val="40A070"/>
+      <w:sz w:val="22"/>
     </w:rPr>
   </w:style>
   <w:style w:type="character" w:customStyle="1" w:styleId="ConstantTok">
     <w:name w:val="ConstantTok"/>
     <w:basedOn w:val="VerbatimChar"/>
     <w:rPr>
+      <w:rFonts w:ascii="Consolas" w:hAnsi="Consolas"/>
       <w:color w:val="880000"/>
+      <w:sz w:val="22"/>
     </w:rPr>
   </w:style>
   <w:style w:type="character" w:customStyle="1" w:styleId="CharTok">
     <w:name w:val="CharTok"/>
     <w:basedOn w:val="VerbatimChar"/>
     <w:rPr>
-      <w:color w:val="4070a0"/>
+      <w:rFonts w:ascii="Consolas" w:hAnsi="Consolas"/>
+      <w:color w:val="4070A0"/>
+      <w:sz w:val="22"/>
     </w:rPr>
   </w:style>
   <w:style w:type="character" w:customStyle="1" w:styleId="SpecialCharTok">
     <w:name w:val="SpecialCharTok"/>
     <w:basedOn w:val="VerbatimChar"/>
     <w:rPr>
-      <w:color w:val="4070a0"/>
+      <w:rFonts w:ascii="Consolas" w:hAnsi="Consolas"/>
+      <w:color w:val="4070A0"/>
+      <w:sz w:val="22"/>
     </w:rPr>
   </w:style>
   <w:style w:type="character" w:customStyle="1" w:styleId="StringTok">
     <w:name w:val="StringTok"/>
     <w:basedOn w:val="VerbatimChar"/>
     <w:rPr>
-      <w:color w:val="4070a0"/>
+      <w:rFonts w:ascii="Consolas" w:hAnsi="Consolas"/>
+      <w:color w:val="4070A0"/>
+      <w:sz w:val="22"/>
     </w:rPr>
   </w:style>
   <w:style w:type="character" w:customStyle="1" w:styleId="VerbatimStringTok">
     <w:name w:val="VerbatimStringTok"/>
     <w:basedOn w:val="VerbatimChar"/>
     <w:rPr>
-      <w:color w:val="4070a0"/>
+      <w:rFonts w:ascii="Consolas" w:hAnsi="Consolas"/>
+      <w:color w:val="4070A0"/>
+      <w:sz w:val="22"/>
     </w:rPr>
   </w:style>
   <w:style w:type="character" w:customStyle="1" w:styleId="SpecialStringTok">
     <w:name w:val="SpecialStringTok"/>
     <w:basedOn w:val="VerbatimChar"/>
     <w:rPr>
-      <w:color w:val="bb6688"/>
+      <w:rFonts w:ascii="Consolas" w:hAnsi="Consolas"/>
+      <w:color w:val="BB6688"/>
+      <w:sz w:val="22"/>
     </w:rPr>
   </w:style>
   <w:style w:type="character" w:customStyle="1" w:styleId="ImportTok">
     <w:name w:val="ImportTok"/>
     <w:basedOn w:val="VerbatimChar"/>
     <w:rPr>
+      <w:rFonts w:ascii="Consolas" w:hAnsi="Consolas"/>
       <w:b/>
       <w:color w:val="008000"/>
+      <w:sz w:val="22"/>
     </w:rPr>
   </w:style>
   <w:style w:type="character" w:customStyle="1" w:styleId="CommentTok">
     <w:name w:val="CommentTok"/>
     <w:basedOn w:val="VerbatimChar"/>
     <w:rPr>
+      <w:rFonts w:ascii="Consolas" w:hAnsi="Consolas"/>
       <w:i/>
-      <w:color w:val="60a0b0"/>
+      <w:color w:val="60A0B0"/>
+      <w:sz w:val="22"/>
     </w:rPr>
   </w:style>
   <w:style w:type="character" w:customStyle="1" w:styleId="DocumentationTok">
     <w:name w:val="DocumentationTok"/>
     <w:basedOn w:val="VerbatimChar"/>
     <w:rPr>
+      <w:rFonts w:ascii="Consolas" w:hAnsi="Consolas"/>
       <w:i/>
-      <w:color w:val="ba2121"/>
+      <w:color w:val="BA2121"/>
+      <w:sz w:val="22"/>
     </w:rPr>
   </w:style>
   <w:style w:type="character" w:customStyle="1" w:styleId="AnnotationTok">
     <w:name w:val="AnnotationTok"/>
     <w:basedOn w:val="VerbatimChar"/>
     <w:rPr>
+      <w:rFonts w:ascii="Consolas" w:hAnsi="Consolas"/>
       <w:b/>
       <w:i/>
-      <w:color w:val="60a0b0"/>
+      <w:color w:val="60A0B0"/>
+      <w:sz w:val="22"/>
     </w:rPr>
   </w:style>
   <w:style w:type="character" w:customStyle="1" w:styleId="CommentVarTok">
     <w:name w:val="CommentVarTok"/>
     <w:basedOn w:val="VerbatimChar"/>
     <w:rPr>
+      <w:rFonts w:ascii="Consolas" w:hAnsi="Consolas"/>
       <w:b/>
       <w:i/>
-      <w:color w:val="60a0b0"/>
+      <w:color w:val="60A0B0"/>
+      <w:sz w:val="22"/>
     </w:rPr>
   </w:style>
   <w:style w:type="character" w:customStyle="1" w:styleId="OtherTok">
     <w:name w:val="OtherTok"/>
     <w:basedOn w:val="VerbatimChar"/>
     <w:rPr>
+      <w:rFonts w:ascii="Consolas" w:hAnsi="Consolas"/>
       <w:color w:val="007020"/>
+      <w:sz w:val="22"/>
     </w:rPr>
   </w:style>
   <w:style w:type="character" w:customStyle="1" w:styleId="FunctionTok">
     <w:name w:val="FunctionTok"/>
     <w:basedOn w:val="VerbatimChar"/>
     <w:rPr>
-      <w:color w:val="06287e"/>
+      <w:rFonts w:ascii="Consolas" w:hAnsi="Consolas"/>
+      <w:color w:val="06287E"/>
+      <w:sz w:val="22"/>
     </w:rPr>
   </w:style>
   <w:style w:type="character" w:customStyle="1" w:styleId="VariableTok">
     <w:name w:val="VariableTok"/>
     <w:basedOn w:val="VerbatimChar"/>
     <w:rPr>
-      <w:color w:val="19177c"/>
+      <w:rFonts w:ascii="Consolas" w:hAnsi="Consolas"/>
+      <w:color w:val="19177C"/>
+      <w:sz w:val="22"/>
     </w:rPr>
   </w:style>
   <w:style w:type="character" w:customStyle="1" w:styleId="ControlFlowTok">
     <w:name w:val="ControlFlowTok"/>
     <w:basedOn w:val="VerbatimChar"/>
     <w:rPr>
+      <w:rFonts w:ascii="Consolas" w:hAnsi="Consolas"/>
       <w:b/>
       <w:color w:val="007020"/>
+      <w:sz w:val="22"/>
     </w:rPr>
   </w:style>
   <w:style w:type="character" w:customStyle="1" w:styleId="OperatorTok">
     <w:name w:val="OperatorTok"/>
     <w:basedOn w:val="VerbatimChar"/>
     <w:rPr>
+      <w:rFonts w:ascii="Consolas" w:hAnsi="Consolas"/>
       <w:color w:val="666666"/>
+      <w:sz w:val="22"/>
     </w:rPr>
   </w:style>
   <w:style w:type="character" w:customStyle="1" w:styleId="BuiltInTok">
     <w:name w:val="BuiltInTok"/>
     <w:basedOn w:val="VerbatimChar"/>
     <w:rPr>
+      <w:rFonts w:ascii="Consolas" w:hAnsi="Consolas"/>
       <w:color w:val="008000"/>
+      <w:sz w:val="22"/>
     </w:rPr>
   </w:style>
   <w:style w:type="character" w:customStyle="1" w:styleId="ExtensionTok">
     <w:name w:val="ExtensionTok"/>
     <w:basedOn w:val="VerbatimChar"/>
-    <w:rPr/>
+    <w:rPr>
+      <w:rFonts w:ascii="Consolas" w:hAnsi="Consolas"/>
+      <w:sz w:val="22"/>
+    </w:rPr>
   </w:style>
   <w:style w:type="character" w:customStyle="1" w:styleId="PreprocessorTok">
     <w:name w:val="PreprocessorTok"/>
     <w:basedOn w:val="VerbatimChar"/>
     <w:rPr>
-      <w:color w:val="bc7a00"/>
+      <w:rFonts w:ascii="Consolas" w:hAnsi="Consolas"/>
+      <w:color w:val="BC7A00"/>
+      <w:sz w:val="22"/>
     </w:rPr>
   </w:style>
   <w:style w:type="character" w:customStyle="1" w:styleId="AttributeTok">
     <w:name w:val="AttributeTok"/>
     <w:basedOn w:val="VerbatimChar"/>
     <w:rPr>
-      <w:color w:val="7d9029"/>
+      <w:rFonts w:ascii="Consolas" w:hAnsi="Consolas"/>
+      <w:color w:val="7D9029"/>
+      <w:sz w:val="22"/>
     </w:rPr>
   </w:style>
   <w:style w:type="character" w:customStyle="1" w:styleId="RegionMarkerTok">
     <w:name w:val="RegionMarkerTok"/>
     <w:basedOn w:val="VerbatimChar"/>
-    <w:rPr/>
+    <w:rPr>
+      <w:rFonts w:ascii="Consolas" w:hAnsi="Consolas"/>
+      <w:sz w:val="22"/>
+    </w:rPr>
   </w:style>
   <w:style w:type="character" w:customStyle="1" w:styleId="InformationTok">
     <w:name w:val="InformationTok"/>
     <w:basedOn w:val="VerbatimChar"/>
     <w:rPr>
+      <w:rFonts w:ascii="Consolas" w:hAnsi="Consolas"/>
       <w:b/>
       <w:i/>
-      <w:color w:val="60a0b0"/>
+      <w:color w:val="60A0B0"/>
+      <w:sz w:val="22"/>
     </w:rPr>
   </w:style>
   <w:style w:type="character" w:customStyle="1" w:styleId="WarningTok">
     <w:name w:val="WarningTok"/>
     <w:basedOn w:val="VerbatimChar"/>
     <w:rPr>
+      <w:rFonts w:ascii="Consolas" w:hAnsi="Consolas"/>
       <w:b/>
       <w:i/>
-      <w:color w:val="60a0b0"/>
+      <w:color w:val="60A0B0"/>
+      <w:sz w:val="22"/>
     </w:rPr>
   </w:style>
   <w:style w:type="character" w:customStyle="1" w:styleId="AlertTok">
     <w:name w:val="AlertTok"/>
     <w:basedOn w:val="VerbatimChar"/>
     <w:rPr>
+      <w:rFonts w:ascii="Consolas" w:hAnsi="Consolas"/>
       <w:b/>
-      <w:color w:val="ff0000"/>
+      <w:color w:val="FF0000"/>
+      <w:sz w:val="22"/>
     </w:rPr>
   </w:style>
   <w:style w:type="character" w:customStyle="1" w:styleId="ErrorTok">
     <w:name w:val="ErrorTok"/>
     <w:basedOn w:val="VerbatimChar"/>
     <w:rPr>
+      <w:rFonts w:ascii="Consolas" w:hAnsi="Consolas"/>
       <w:b/>
-      <w:color w:val="ff0000"/>
+      <w:color w:val="FF0000"/>
+      <w:sz w:val="22"/>
     </w:rPr>
   </w:style>
   <w:style w:type="character" w:customStyle="1" w:styleId="NormalTok">
     <w:name w:val="NormalTok"/>
     <w:basedOn w:val="VerbatimChar"/>
-    <w:rPr/>
+    <w:rPr>
+      <w:rFonts w:ascii="Consolas" w:hAnsi="Consolas"/>
+      <w:sz w:val="22"/>
+    </w:rPr>
   </w:style>
 </w:styles>
 </file>

</xml_diff>